<commit_message>
docs: adapta el proyecto a trabajo individual y agrega la revisión con IA y las evidencias
- Constitución 1.1.0: con un solo integrante, la aprobación se sustituye
  por una revisión escrita en el PR, asistida por IA.
- Flujo de trabajo: sección "Revisión en un equipo de una persona" y
  protección de ramas con 0 aprobaciones y checks obligatorios.
- Verificación: CE-004 cumple desde el 2026-10-10 (ramas protegidas).
- Informe: autoría individual, revisión de código con Claude Code y
  GitHub Copilot Chat (2 observaciones válidas y 3 falsos positivos),
  cifras actualizadas (415 pruebas) y anexo con 8 figuras de evidencia;
  Word regenerado.
- Guion y LEEME para un solo expositor.

Refs #34, #35, #36

Co-Authored-By: Claude Opus 5.5 <noreply@anthropic.com>
</commit_message>
<xml_diff>
--- a/docs/informe/informe-apa7.docx
+++ b/docs/informe/informe-apa7.docx
@@ -57,27 +57,7 @@
           <w:highlight w:val="yellow"/>
           <w:highlightCs w:val="yellow"/>
         </w:rPr>
-        <w:t xml:space="preserve">[Nombre y apellido del integrante 1]</w:t>
-      </w:r>
-      <w:r>
-        <w:rPr>
-          <w:rFonts w:ascii="Times New Roman" w:cs="Times New Roman" w:eastAsia="Times New Roman" w:hAnsi="Times New Roman"/>
-          <w:sz w:val="24"/>
-          <w:szCs w:val="24"/>
-        </w:rPr>
-        <w:t xml:space="preserve"> y </w:t>
-      </w:r>
-      <w:r>
-        <w:rPr>
-          <w:rFonts w:ascii="Times New Roman" w:cs="Times New Roman" w:eastAsia="Times New Roman" w:hAnsi="Times New Roman"/>
-          <w:b/>
-          <w:bCs/>
-          <w:sz w:val="24"/>
-          <w:szCs w:val="24"/>
-          <w:highlight w:val="yellow"/>
-          <w:highlightCs w:val="yellow"/>
-        </w:rPr>
-        <w:t xml:space="preserve">[Nombre y apellido del integrante 2]</w:t>
+        <w:t xml:space="preserve">[Nombre y apellido]</w:t>
       </w:r>
     </w:p>
     <w:p>
@@ -199,9 +179,10 @@
 real: TaskFlow, un gestor de tareas con Angular, una API REST en Node.js y una base de datos SQLite, construido en
 tres versiones con GitHub Spec Kit, Pull Requests y un pipeline de GitHub Actions. El análisis crítico muestra que la
 combinación de especificaciones, pruebas automatizadas e integración continua permitió entregar 19 historias de
-usuario con 405 pruebas automáticas y ninguna ejecución fallida del pipeline, pero también que las prácticas
-humanas —la revisión de código y la protección de ramas— no se cumplieron, y que la IA generó la mayor parte del
-código. Con esas lecciones se propone un modelo de adopción en cuatro fases, con políticas, roles y métricas, para
+usuario con 415 pruebas automáticas y ninguna ejecución fallida del pipeline, pero también que las prácticas
+humanas —la revisión de código y la protección de ramas— no se cumplieron durante la mayor parte del proyecto, y que
+la IA generó la mayor parte del código. El proyecto se realizó de forma individual, y la revisión se resolvió con
+IA: dos revisiones (Claude Code y GitHub Copilot) encontraron ocho errores reales y tres falsos positivos. Con esas lecciones se propone un modelo de adopción en cuatro fases, con políticas, roles y métricas, para
 una empresa real como la Universidad Técnica de Machala (UTMACH) o una startup.</w:t>
       </w:r>
     </w:p>
@@ -338,6 +319,21 @@
         </w:rPr>
         <w:t xml:space="preserve">; después se
 analiza con honestidad qué funcionó y qué no; y por último se propone un plan de adopción para la empresa.</w:t>
+      </w:r>
+    </w:p>
+    <w:p>
+      <w:pPr>
+        <w:spacing w:line="480" w:before="0" w:after="0"/>
+        <w:ind w:firstLine="720"/>
+      </w:pPr>
+      <w:r>
+        <w:rPr>
+          <w:rFonts w:ascii="Times New Roman" w:cs="Times New Roman" w:eastAsia="Times New Roman" w:hAnsi="Times New Roman"/>
+          <w:sz w:val="24"/>
+          <w:szCs w:val="24"/>
+        </w:rPr>
+        <w:t xml:space="preserve">El enunciado plantea el proyecto para dos estudiantes; este trabajo se realizó de forma individual. Esa condición
+afecta sobre todo a la revisión de código, y el informe explica cómo se resolvió y qué haría distinto una empresa.</w:t>
       </w:r>
     </w:p>
     <w:p>
@@ -1817,7 +1813,7 @@
           <w:sz w:val="24"/>
           <w:szCs w:val="24"/>
         </w:rPr>
-        <w:t xml:space="preserve">El repositorio tiene 81 commits en </w:t>
+        <w:t xml:space="preserve">Hasta la v2 (PR #20), el repositorio tenía 81 commits en </w:t>
       </w:r>
       <w:r>
         <w:rPr>
@@ -2120,8 +2116,8 @@
           <w:szCs w:val="24"/>
         </w:rPr>
         <w:t xml:space="preserve">, el conocimiento compartido del
-código y la mejora de su legibilidad. En un equipo de dos personas esto es crítico: si solo una entiende el código,
-la empresa vuelve a depender de una persona. Una buena revisión comprueba que el cambio cumple la especificación,
+código y la mejora de su legibilidad. En un equipo pequeño esto es crítico: si solo una persona entiende el código,
+la empresa depende de ella. Una buena revisión comprueba que el cambio cumple la especificación,
 que tiene pruebas, que es legible y que no expone secretos; TaskFlow formaliza esa lista en
 </w:t>
       </w:r>
@@ -2171,28 +2167,66 @@
           <w:sz w:val="24"/>
           <w:szCs w:val="24"/>
         </w:rPr>
-        <w:t xml:space="preserve">Se fusionaron 20 PR y hay dos más abiertos (#39 y #40), todos con el pipeline en verde. Sin embargo, </w:t>
-      </w:r>
-      <w:r>
-        <w:rPr>
-          <w:rFonts w:ascii="Times New Roman" w:cs="Times New Roman" w:eastAsia="Times New Roman" w:hAnsi="Times New Roman"/>
-          <w:b/>
-          <w:bCs/>
-          <w:sz w:val="24"/>
-          <w:szCs w:val="24"/>
-        </w:rPr>
-        <w:t xml:space="preserve">ninguno de los
-20 PR fusionados tuvo una revisión aprobada</w:t>
-      </w:r>
-      <w:r>
-        <w:rPr>
-          <w:rFonts w:ascii="Times New Roman" w:cs="Times New Roman" w:eastAsia="Times New Roman" w:hAnsi="Times New Roman"/>
-          <w:sz w:val="24"/>
-          <w:szCs w:val="24"/>
-        </w:rPr>
-        <w:t xml:space="preserve"> y 13 no tenían descripción. Este es el principal hallazgo del análisis
-crítico. Los PR abiertos ya siguen la plantilla (issue enlazada, cómo probar, uso de IA y lista de revisión) y quedan
-a la espera de la revisión del compañero.</w:t>
+        <w:t xml:space="preserve">Los PR #1 a #20 se fusionaron con el pipeline en verde, pero </w:t>
+      </w:r>
+      <w:r>
+        <w:rPr>
+          <w:rFonts w:ascii="Times New Roman" w:cs="Times New Roman" w:eastAsia="Times New Roman" w:hAnsi="Times New Roman"/>
+          <w:b/>
+          <w:bCs/>
+          <w:sz w:val="24"/>
+          <w:szCs w:val="24"/>
+        </w:rPr>
+        <w:t xml:space="preserve">ninguno tuvo revisión</w:t>
+      </w:r>
+      <w:r>
+        <w:rPr>
+          <w:rFonts w:ascii="Times New Roman" w:cs="Times New Roman" w:eastAsia="Times New Roman" w:hAnsi="Times New Roman"/>
+          <w:sz w:val="24"/>
+          <w:szCs w:val="24"/>
+        </w:rPr>
+        <w:t xml:space="preserve"> y 13 no tenían descripción:
+es el principal hallazgo del análisis crítico. Desde el PR #39 cada PR sigue la plantilla (issue enlazada, cómo
+probar, uso de IA y lista de revisión) y lleva una revisión escrita.</w:t>
+      </w:r>
+    </w:p>
+    <w:p>
+      <w:pPr>
+        <w:pStyle w:val="Heading3"/>
+        <w:spacing w:line="480" w:before="0" w:after="0"/>
+      </w:pPr>
+      <w:r>
+        <w:rPr>
+          <w:rFonts w:ascii="Times New Roman" w:cs="Times New Roman" w:eastAsia="Times New Roman" w:hAnsi="Times New Roman"/>
+          <w:b/>
+          <w:bCs/>
+          <w:i/>
+          <w:iCs/>
+          <w:sz w:val="24"/>
+          <w:szCs w:val="24"/>
+        </w:rPr>
+        <w:t xml:space="preserve">Revisión de código en un equipo de una persona</w:t>
+      </w:r>
+    </w:p>
+    <w:p>
+      <w:pPr>
+        <w:spacing w:line="480" w:before="0" w:after="0"/>
+        <w:ind w:firstLine="720"/>
+      </w:pPr>
+      <w:r>
+        <w:rPr>
+          <w:rFonts w:ascii="Times New Roman" w:cs="Times New Roman" w:eastAsia="Times New Roman" w:hAnsi="Times New Roman"/>
+          <w:sz w:val="24"/>
+          <w:szCs w:val="24"/>
+        </w:rPr>
+        <w:t xml:space="preserve">GitHub no permite aprobar un PR propio, así que un desarrollador solo no puede cumplir la regla clásica de "una
+aprobación". La constitución se enmendó (versión 1.1.0) para sustituirla por una revisión documentada: el autor
+recorre la lista de revisión sobre el diff, pide una revisión a una IA, evalúa cada observación y corrige las
+válidas con una prueba primero. En el PR #39 (respaldos y validaciones) esta revisión encontró seis errores reales;
+el más grave era que un intervalo de respaldo de más de 596 horas desbordaba el temporizador de Node.js y la API
+respaldaba cada milisegundo. Todos se corrigieron con pruebas antes de fusionar. La revisión con IA no reemplaza la
+transferencia de conocimiento entre personas que describen Bacchelli y Bird (2013), pero sí su función de detectar
+defectos.</w:t>
       </w:r>
     </w:p>
     <w:p>
@@ -4423,7 +4457,7 @@
           <w:szCs w:val="24"/>
         </w:rPr>
         <w:t xml:space="preserve">, un agente de programación,
-a partir de las especificaciones: 60 de los 81 commits de </w:t>
+a partir de las especificaciones: hasta la v2, 60 de los 81 commits de </w:t>
       </w:r>
       <w:r>
         <w:rPr>
@@ -4439,30 +4473,294 @@
           <w:sz w:val="24"/>
           <w:szCs w:val="24"/>
         </w:rPr>
-        <w:t xml:space="preserve"> tienen a Claude como autor y los demás son, sobre
-todo, fusiones de PR. El equipo redactó y aprobó las especificaciones, eligió el alcance de cada versión, ejecutó y
-revisó las pruebas y probó la aplicación. </w:t>
-      </w:r>
-      <w:r>
-        <w:rPr>
-          <w:rFonts w:ascii="Times New Roman" w:cs="Times New Roman" w:eastAsia="Times New Roman" w:hAnsi="Times New Roman"/>
-          <w:sz w:val="24"/>
-          <w:szCs w:val="24"/>
-          <w:highlight w:val="yellow"/>
-          <w:highlightCs w:val="yellow"/>
-        </w:rPr>
-        <w:t xml:space="preserve">[Completar: uso de GitHub Copilot —revisión de Copilot en un PR, capturas
-de Copilot Chat en VS Code— y qué partes revisó cada integrante.]</w:t>
-      </w:r>
-      <w:r>
-        <w:rPr>
-          <w:rFonts w:ascii="Times New Roman" w:cs="Times New Roman" w:eastAsia="Times New Roman" w:hAnsi="Times New Roman"/>
-          <w:sz w:val="24"/>
-          <w:szCs w:val="24"/>
-        </w:rPr>
-        <w:t xml:space="preserve"> Esta concentración de autoría es un riesgo que se
-discute en el análisis crítico.</w:t>
-      </w:r>
+        <w:t xml:space="preserve"> tenían a Claude como autor y los demás
+eran, sobre todo, fusiones de PR. El autor definió el alcance de cada versión, aprobó las especificaciones, ejecutó
+las pruebas y probó la aplicación. Esta concentración de autoría es un riesgo que se discute en el análisis crítico.</w:t>
+      </w:r>
+    </w:p>
+    <w:p>
+      <w:pPr>
+        <w:spacing w:line="480" w:before="0" w:after="0"/>
+        <w:ind w:firstLine="720"/>
+      </w:pPr>
+      <w:r>
+        <w:rPr>
+          <w:rFonts w:ascii="Times New Roman" w:cs="Times New Roman" w:eastAsia="Times New Roman" w:hAnsi="Times New Roman"/>
+          <w:b/>
+          <w:bCs/>
+          <w:sz w:val="24"/>
+          <w:szCs w:val="24"/>
+        </w:rPr>
+        <w:t xml:space="preserve">GitHub Copilot.</w:t>
+      </w:r>
+      <w:r>
+        <w:rPr>
+          <w:rFonts w:ascii="Times New Roman" w:cs="Times New Roman" w:eastAsia="Times New Roman" w:hAnsi="Times New Roman"/>
+          <w:sz w:val="24"/>
+          <w:szCs w:val="24"/>
+        </w:rPr>
+        <w:t xml:space="preserve"> La cuenta tiene el plan gratuito (Copilot Free), que incluye Copilot Chat en GitHub.com pero no
+la revisión automática de PR, reservada a los planes de pago. Se usó Copilot Chat como segundo revisor de
+</w:t>
+      </w:r>
+      <w:r>
+        <w:rPr>
+          <w:rFonts w:ascii="Courier New" w:cs="Courier New" w:eastAsia="Courier New" w:hAnsi="Courier New"/>
+          <w:sz w:val="22"/>
+          <w:szCs w:val="22"/>
+        </w:rPr>
+        <w:t xml:space="preserve">backend/src/backup.js</w:t>
+      </w:r>
+      <w:r>
+        <w:rPr>
+          <w:rFonts w:ascii="Times New Roman" w:cs="Times New Roman" w:eastAsia="Times New Roman" w:hAnsi="Times New Roman"/>
+          <w:sz w:val="24"/>
+          <w:szCs w:val="24"/>
+        </w:rPr>
+        <w:t xml:space="preserve"> con un prompt construido según los patrones anteriores: rol ("actúa como revisor de código
+senior"), contexto (Express, better-sqlite3, respaldos y restauración), tarea acotada (errores de correctitud en
+casos borde, archivos auxiliares de SQLite, Windows y temporizadores) y formato de salida (lista de cinco puntos con
+problema, función y corrección). El primer intento falló porque la URL llegó con errores de tipeo: Copilot lo
+detectó y pidió la ruta correcta, una muestra de que el contexto exacto importa tanto como la instrucción.</w:t>
+      </w:r>
+    </w:p>
+    <w:p>
+      <w:pPr>
+        <w:spacing w:line="480" w:before="0" w:after="0"/>
+        <w:ind w:firstLine="720"/>
+      </w:pPr>
+      <w:r>
+        <w:rPr>
+          <w:rFonts w:ascii="Times New Roman" w:cs="Times New Roman" w:eastAsia="Times New Roman" w:hAnsi="Times New Roman"/>
+          <w:sz w:val="24"/>
+          <w:szCs w:val="24"/>
+        </w:rPr>
+        <w:t xml:space="preserve">De sus cinco observaciones, </w:t>
+      </w:r>
+      <w:r>
+        <w:rPr>
+          <w:rFonts w:ascii="Times New Roman" w:cs="Times New Roman" w:eastAsia="Times New Roman" w:hAnsi="Times New Roman"/>
+          <w:b/>
+          <w:bCs/>
+          <w:sz w:val="24"/>
+          <w:szCs w:val="24"/>
+        </w:rPr>
+        <w:t xml:space="preserve">dos eran válidas</w:t>
+      </w:r>
+      <w:r>
+        <w:rPr>
+          <w:rFonts w:ascii="Times New Roman" w:cs="Times New Roman" w:eastAsia="Times New Roman" w:hAnsi="Times New Roman"/>
+          <w:sz w:val="24"/>
+          <w:szCs w:val="24"/>
+        </w:rPr>
+        <w:t xml:space="preserve"> y se corrigieron con pruebas: restaurar la base con la API en
+marcha (ahora la API deja un archivo con su número de proceso y la restauración se niega mientras siga viva) y un
+intervalo diminuto que también respaldaría casi cada milisegundo. </w:t>
+      </w:r>
+      <w:r>
+        <w:rPr>
+          <w:rFonts w:ascii="Times New Roman" w:cs="Times New Roman" w:eastAsia="Times New Roman" w:hAnsi="Times New Roman"/>
+          <w:b/>
+          <w:bCs/>
+          <w:sz w:val="24"/>
+          <w:szCs w:val="24"/>
+        </w:rPr>
+        <w:t xml:space="preserve">Tres eran falsos positivos</w:t>
+      </w:r>
+      <w:r>
+        <w:rPr>
+          <w:rFonts w:ascii="Times New Roman" w:cs="Times New Roman" w:eastAsia="Times New Roman" w:hAnsi="Times New Roman"/>
+          <w:sz w:val="24"/>
+          <w:szCs w:val="24"/>
+        </w:rPr>
+        <w:t xml:space="preserve">: señaló promesas sin
+manejo de errores que sí lo tenían, propuso copiar el archivo </w:t>
+      </w:r>
+      <w:r>
+        <w:rPr>
+          <w:rFonts w:ascii="Courier New" w:cs="Courier New" w:eastAsia="Courier New" w:hAnsi="Courier New"/>
+          <w:sz w:val="22"/>
+          <w:szCs w:val="22"/>
+        </w:rPr>
+        <w:t xml:space="preserve">-wal</w:t>
+      </w:r>
+      <w:r>
+        <w:rPr>
+          <w:rFonts w:ascii="Times New Roman" w:cs="Times New Roman" w:eastAsia="Times New Roman" w:hAnsi="Times New Roman"/>
+          <w:sz w:val="24"/>
+          <w:szCs w:val="24"/>
+        </w:rPr>
+        <w:t xml:space="preserve"> junto al respaldo —lo que lo dañaría, porque la
+API de respaldo en línea de SQLite ya produce una copia consistente— y advirtió un cierre de conexión que no puede
+fallar. Este resultado ilustra el Principio VI de la constitución: la IA asiste, pero cada sugerencia se verifica
+antes de aplicarla (Figuras 1 y 2).</w:t>
+      </w:r>
+    </w:p>
+    <w:p>
+      <w:pPr>
+        <w:keepNext/>
+        <w:spacing w:line="480" w:before="0" w:after="0"/>
+      </w:pPr>
+      <w:r>
+        <w:rPr>
+          <w:rFonts w:ascii="Times New Roman" w:cs="Times New Roman" w:eastAsia="Times New Roman" w:hAnsi="Times New Roman"/>
+          <w:b/>
+          <w:bCs/>
+          <w:sz w:val="24"/>
+          <w:szCs w:val="24"/>
+        </w:rPr>
+        <w:t xml:space="preserve">Figura 1</w:t>
+      </w:r>
+    </w:p>
+    <w:p>
+      <w:pPr>
+        <w:keepNext/>
+        <w:spacing w:line="480" w:before="0" w:after="0"/>
+      </w:pPr>
+      <w:r>
+        <w:rPr>
+          <w:rFonts w:ascii="Times New Roman" w:cs="Times New Roman" w:eastAsia="Times New Roman" w:hAnsi="Times New Roman"/>
+          <w:i/>
+          <w:iCs/>
+          <w:sz w:val="24"/>
+          <w:szCs w:val="24"/>
+        </w:rPr>
+        <w:t xml:space="preserve">Prompt de revisión enviado a GitHub Copilot Chat y comienzo de su respuesta sobre backup.js</w:t>
+      </w:r>
+    </w:p>
+    <w:p>
+      <w:pPr>
+        <w:keepNext w:val="false"/>
+        <w:spacing w:line="240" w:before="0" w:after="0"/>
+      </w:pPr>
+      <w:r>
+        <w:drawing>
+          <wp:inline distT="0" distB="0" distL="0" distR="0">
+            <wp:extent cx="5715000" cy="2809875"/>
+            <wp:effectExtent t="0" r="0" b="0" l="0"/>
+            <wp:docPr id="1" name="Prompt de revisión enviado a GitHub Copilot Chat y comienzo de su respuesta sobre backup.js" descr="Prompt de revisión enviado a GitHub Copilot Chat y comienzo de su respuesta sobre backup.js" title="Prompt de revisión enviado a GitHub Copilot Chat y comienzo de su respuesta sobre backup.js"/>
+            <wp:cNvGraphicFramePr>
+              <a:graphicFrameLocks xmlns:a="http://schemas.openxmlformats.org/drawingml/2006/main" noChangeAspect="1"/>
+            </wp:cNvGraphicFramePr>
+            <a:graphic xmlns:a="http://schemas.openxmlformats.org/drawingml/2006/main">
+              <a:graphicData uri="http://schemas.openxmlformats.org/drawingml/2006/picture">
+                <pic:pic xmlns:pic="http://schemas.openxmlformats.org/drawingml/2006/picture">
+                  <pic:nvPicPr>
+                    <pic:cNvPr id="0" name="" descr=""/>
+                    <pic:cNvPicPr>
+                      <a:picLocks noChangeAspect="1" noChangeArrowheads="1"/>
+                    </pic:cNvPicPr>
+                  </pic:nvPicPr>
+                  <pic:blipFill>
+                    <a:blip r:embed="rId8" cstate="none"/>
+                    <a:srcRect/>
+                    <a:stretch>
+                      <a:fillRect/>
+                    </a:stretch>
+                  </pic:blipFill>
+                  <pic:spPr bwMode="auto">
+                    <a:xfrm>
+                      <a:off x="0" y="0"/>
+                      <a:ext cx="5715000" cy="2809875"/>
+                    </a:xfrm>
+                    <a:prstGeom prst="rect">
+                      <a:avLst/>
+                    </a:prstGeom>
+                  </pic:spPr>
+                </pic:pic>
+              </a:graphicData>
+            </a:graphic>
+          </wp:inline>
+        </w:drawing>
+      </w:r>
+    </w:p>
+    <w:p>
+      <w:pPr>
+        <w:spacing w:line="480" w:before="0" w:after="0"/>
+      </w:pPr>
+    </w:p>
+    <w:p>
+      <w:pPr>
+        <w:keepNext/>
+        <w:spacing w:line="480" w:before="0" w:after="0"/>
+      </w:pPr>
+      <w:r>
+        <w:rPr>
+          <w:rFonts w:ascii="Times New Roman" w:cs="Times New Roman" w:eastAsia="Times New Roman" w:hAnsi="Times New Roman"/>
+          <w:b/>
+          <w:bCs/>
+          <w:sz w:val="24"/>
+          <w:szCs w:val="24"/>
+        </w:rPr>
+        <w:t xml:space="preserve">Figura 2</w:t>
+      </w:r>
+    </w:p>
+    <w:p>
+      <w:pPr>
+        <w:keepNext/>
+        <w:spacing w:line="480" w:before="0" w:after="0"/>
+      </w:pPr>
+      <w:r>
+        <w:rPr>
+          <w:rFonts w:ascii="Times New Roman" w:cs="Times New Roman" w:eastAsia="Times New Roman" w:hAnsi="Times New Roman"/>
+          <w:i/>
+          <w:iCs/>
+          <w:sz w:val="24"/>
+          <w:szCs w:val="24"/>
+        </w:rPr>
+        <w:t xml:space="preserve">Observaciones 3 y 4 de Copilot sobre la restauración con la API en marcha (válida) y el cierre de la conexión (falso positivo)</w:t>
+      </w:r>
+    </w:p>
+    <w:p>
+      <w:pPr>
+        <w:keepNext w:val="false"/>
+        <w:spacing w:line="240" w:before="0" w:after="0"/>
+      </w:pPr>
+      <w:r>
+        <w:drawing>
+          <wp:inline distT="0" distB="0" distL="0" distR="0">
+            <wp:extent cx="5715000" cy="2809875"/>
+            <wp:effectExtent t="0" r="0" b="0" l="0"/>
+            <wp:docPr id="1" name="Observaciones 3 y 4 de Copilot sobre la restauración con la API en marcha (válida) y el cierre de la conexión (falso positivo)" descr="Observaciones 3 y 4 de Copilot sobre la restauración con la API en marcha (válida) y el cierre de la conexión (falso positivo)" title="Observaciones 3 y 4 de Copilot sobre la restauración con la API en marcha (válida) y el cierre de la conexión (falso positivo)"/>
+            <wp:cNvGraphicFramePr>
+              <a:graphicFrameLocks xmlns:a="http://schemas.openxmlformats.org/drawingml/2006/main" noChangeAspect="1"/>
+            </wp:cNvGraphicFramePr>
+            <a:graphic xmlns:a="http://schemas.openxmlformats.org/drawingml/2006/main">
+              <a:graphicData uri="http://schemas.openxmlformats.org/drawingml/2006/picture">
+                <pic:pic xmlns:pic="http://schemas.openxmlformats.org/drawingml/2006/picture">
+                  <pic:nvPicPr>
+                    <pic:cNvPr id="0" name="" descr=""/>
+                    <pic:cNvPicPr>
+                      <a:picLocks noChangeAspect="1" noChangeArrowheads="1"/>
+                    </pic:cNvPicPr>
+                  </pic:nvPicPr>
+                  <pic:blipFill>
+                    <a:blip r:embed="rId9" cstate="none"/>
+                    <a:srcRect/>
+                    <a:stretch>
+                      <a:fillRect/>
+                    </a:stretch>
+                  </pic:blipFill>
+                  <pic:spPr bwMode="auto">
+                    <a:xfrm>
+                      <a:off x="0" y="0"/>
+                      <a:ext cx="5715000" cy="2809875"/>
+                    </a:xfrm>
+                    <a:prstGeom prst="rect">
+                      <a:avLst/>
+                    </a:prstGeom>
+                  </pic:spPr>
+                </pic:pic>
+              </a:graphicData>
+            </a:graphic>
+          </wp:inline>
+        </w:drawing>
+      </w:r>
+    </w:p>
+    <w:p>
+      <w:pPr>
+        <w:spacing w:line="480" w:before="0" w:after="0"/>
+      </w:pPr>
     </w:p>
     <w:p>
       <w:pPr>
@@ -4875,7 +5173,7 @@
                 <w:sz w:val="24"/>
                 <w:szCs w:val="24"/>
               </w:rPr>
-              <w:t xml:space="preserve">234</w:t>
+              <w:t xml:space="preserve">242</w:t>
             </w:r>
           </w:p>
         </w:tc>
@@ -5001,7 +5299,7 @@
                 <w:sz w:val="24"/>
                 <w:szCs w:val="24"/>
               </w:rPr>
-              <w:t xml:space="preserve">171</w:t>
+              <w:t xml:space="preserve">173</w:t>
             </w:r>
           </w:p>
         </w:tc>
@@ -5555,7 +5853,8 @@
         </w:rPr>
         <w:t xml:space="preserve">, y 18 issues: una por cada fase y el mantenimiento (#21 a #31),
 la v3 (#32), las plantillas (#33), el informe (#34), la presentación (#35), la protección de ramas (#36), la
-incorporación del compañero (#37) y la medición del criterio CE-001 (#38). </w:t>
+incorporación de un segundo integrante (#37, cerrada como no aplicable) y la medición del criterio CE-001 (#38).
+</w:t>
       </w:r>
       <w:r>
         <w:rPr>
@@ -5565,8 +5864,8 @@
           <w:highlight w:val="yellow"/>
           <w:highlightCs w:val="yellow"/>
         </w:rPr>
-        <w:t xml:space="preserve">[Completar: enlace y captura del tablero
-de GitHub Projects con las columnas Por hacer, En progreso, En revisión y Hecho.]</w:t>
+        <w:t xml:space="preserve">[Completar: enlace y captura del tablero de GitHub Projects con las columnas Por hacer, En progreso, En revisión y
+Hecho.]</w:t>
       </w:r>
       <w:r>
         <w:rPr>
@@ -5686,7 +5985,7 @@
           <w:sz w:val="24"/>
           <w:szCs w:val="24"/>
         </w:rPr>
-        <w:t xml:space="preserve"> Las 48 ejecuciones exitosas no significan que nunca hubo
+        <w:t xml:space="preserve"> Más de 50 ejecuciones exitosas no significan que nunca hubo
 errores, sino que se corrigieron en las ramas antes de fusionar.</w:t>
       </w:r>
     </w:p>
@@ -5707,32 +6006,16 @@
           <w:sz w:val="24"/>
           <w:szCs w:val="24"/>
         </w:rPr>
-        <w:t xml:space="preserve">La documentación se mantuvo viva.</w:t>
-      </w:r>
-      <w:r>
-        <w:rPr>
-          <w:rFonts w:ascii="Times New Roman" w:cs="Times New Roman" w:eastAsia="Times New Roman" w:hAnsi="Times New Roman"/>
-          <w:sz w:val="24"/>
-          <w:szCs w:val="24"/>
-        </w:rPr>
-        <w:t xml:space="preserve"> README, especificaciones y </w:t>
-      </w:r>
-      <w:r>
-        <w:rPr>
-          <w:rFonts w:ascii="Courier New" w:cs="Courier New" w:eastAsia="Courier New" w:hAnsi="Courier New"/>
-          <w:sz w:val="22"/>
-          <w:szCs w:val="22"/>
-        </w:rPr>
-        <w:t xml:space="preserve">docs/verificacion.md</w:t>
-      </w:r>
-      <w:r>
-        <w:rPr>
-          <w:rFonts w:ascii="Times New Roman" w:cs="Times New Roman" w:eastAsia="Times New Roman" w:hAnsi="Times New Roman"/>
-          <w:sz w:val="24"/>
-          <w:szCs w:val="24"/>
-        </w:rPr>
-        <w:t xml:space="preserve"> se actualizaron en el mismo
-PR que el código, y la verificación registra también lo que no se cumple.</w:t>
+        <w:t xml:space="preserve">La revisión con IA encontró errores que las pruebas no cubrían.</w:t>
+      </w:r>
+      <w:r>
+        <w:rPr>
+          <w:rFonts w:ascii="Times New Roman" w:cs="Times New Roman" w:eastAsia="Times New Roman" w:hAnsi="Times New Roman"/>
+          <w:sz w:val="24"/>
+          <w:szCs w:val="24"/>
+        </w:rPr>
+        <w:t xml:space="preserve"> En el PR #39, seis hallazgos de Claude Code y
+dos de Copilot, todos con una prueba que los reproduce antes de corregirlos.</w:t>
       </w:r>
     </w:p>
     <w:p>
@@ -5752,6 +6035,51 @@
           <w:sz w:val="24"/>
           <w:szCs w:val="24"/>
         </w:rPr>
+        <w:t xml:space="preserve">La documentación se mantuvo viva.</w:t>
+      </w:r>
+      <w:r>
+        <w:rPr>
+          <w:rFonts w:ascii="Times New Roman" w:cs="Times New Roman" w:eastAsia="Times New Roman" w:hAnsi="Times New Roman"/>
+          <w:sz w:val="24"/>
+          <w:szCs w:val="24"/>
+        </w:rPr>
+        <w:t xml:space="preserve"> README, especificaciones y </w:t>
+      </w:r>
+      <w:r>
+        <w:rPr>
+          <w:rFonts w:ascii="Courier New" w:cs="Courier New" w:eastAsia="Courier New" w:hAnsi="Courier New"/>
+          <w:sz w:val="22"/>
+          <w:szCs w:val="22"/>
+        </w:rPr>
+        <w:t xml:space="preserve">docs/verificacion.md</w:t>
+      </w:r>
+      <w:r>
+        <w:rPr>
+          <w:rFonts w:ascii="Times New Roman" w:cs="Times New Roman" w:eastAsia="Times New Roman" w:hAnsi="Times New Roman"/>
+          <w:sz w:val="24"/>
+          <w:szCs w:val="24"/>
+        </w:rPr>
+        <w:t xml:space="preserve"> se actualizaron en el mismo
+PR que el código, y la verificación registra también lo que no se cumple.</w:t>
+      </w:r>
+    </w:p>
+    <w:p>
+      <w:pPr>
+        <w:pStyle w:val="ListParagraph"/>
+        <w:numPr>
+          <w:ilvl w:val="0"/>
+          <w:numId w:val="3"/>
+        </w:numPr>
+        <w:spacing w:line="480" w:before="0" w:after="0"/>
+      </w:pPr>
+      <w:r>
+        <w:rPr>
+          <w:rFonts w:ascii="Times New Roman" w:cs="Times New Roman" w:eastAsia="Times New Roman" w:hAnsi="Times New Roman"/>
+          <w:b/>
+          <w:bCs/>
+          <w:sz w:val="24"/>
+          <w:szCs w:val="24"/>
+        </w:rPr>
         <w:t xml:space="preserve">Simplicidad deliberada.</w:t>
       </w:r>
       <w:r>
@@ -5796,16 +6124,16 @@
           <w:sz w:val="24"/>
           <w:szCs w:val="24"/>
         </w:rPr>
-        <w:t xml:space="preserve">No hubo revisión de código.</w:t>
-      </w:r>
-      <w:r>
-        <w:rPr>
-          <w:rFonts w:ascii="Times New Roman" w:cs="Times New Roman" w:eastAsia="Times New Roman" w:hAnsi="Times New Roman"/>
-          <w:sz w:val="24"/>
-          <w:szCs w:val="24"/>
-        </w:rPr>
-        <w:t xml:space="preserve"> Ningún PR fusionado tuvo aprobación y el compañero no aparece como autor ni como
-revisor. El Principio III de la constitución y el criterio CE-004 ("nada llega a </w:t>
+        <w:t xml:space="preserve">Durante 20 PR no hubo revisión de código.</w:t>
+      </w:r>
+      <w:r>
+        <w:rPr>
+          <w:rFonts w:ascii="Times New Roman" w:cs="Times New Roman" w:eastAsia="Times New Roman" w:hAnsi="Times New Roman"/>
+          <w:sz w:val="24"/>
+          <w:szCs w:val="24"/>
+        </w:rPr>
+        <w:t xml:space="preserve"> Los PR #1 a #20 se fusionaron sin revisión y el criterio CE-004
+("nada llega a </w:t>
       </w:r>
       <w:r>
         <w:rPr>
@@ -5821,26 +6149,7 @@
           <w:sz w:val="24"/>
           <w:szCs w:val="24"/>
         </w:rPr>
-        <w:t xml:space="preserve"> sin PR aprobado y pipeline
-en verde") </w:t>
-      </w:r>
-      <w:r>
-        <w:rPr>
-          <w:rFonts w:ascii="Times New Roman" w:cs="Times New Roman" w:eastAsia="Times New Roman" w:hAnsi="Times New Roman"/>
-          <w:b/>
-          <w:bCs/>
-          <w:sz w:val="24"/>
-          <w:szCs w:val="24"/>
-        </w:rPr>
-        <w:t xml:space="preserve">no se cumplen</w:t>
-      </w:r>
-      <w:r>
-        <w:rPr>
-          <w:rFonts w:ascii="Times New Roman" w:cs="Times New Roman" w:eastAsia="Times New Roman" w:hAnsi="Times New Roman"/>
-          <w:sz w:val="24"/>
-          <w:szCs w:val="24"/>
-        </w:rPr>
-        <w:t xml:space="preserve">. Además, </w:t>
+        <w:t xml:space="preserve"> sin PR aprobado y pipeline en verde") no se cumplía. Además, </w:t>
       </w:r>
       <w:r>
         <w:rPr>
@@ -5874,7 +6183,8 @@
           <w:sz w:val="24"/>
           <w:szCs w:val="24"/>
         </w:rPr>
-        <w:t xml:space="preserve"> directos (</w:t>
+        <w:t xml:space="preserve">
+directos (</w:t>
       </w:r>
       <w:r>
         <w:rPr>
@@ -5906,8 +6216,7 @@
           <w:sz w:val="24"/>
           <w:szCs w:val="24"/>
         </w:rPr>
-        <w:t xml:space="preserve">) y varios PR
-apuntaron a </w:t>
+        <w:t xml:space="preserve">) y varios PR apuntaron a </w:t>
       </w:r>
       <w:r>
         <w:rPr>
@@ -5959,19 +6268,19 @@
           <w:sz w:val="24"/>
           <w:szCs w:val="24"/>
         </w:rPr>
-        <w:t xml:space="preserve">Las ramas no están protegidas.</w:t>
-      </w:r>
-      <w:r>
-        <w:rPr>
-          <w:rFonts w:ascii="Times New Roman" w:cs="Times New Roman" w:eastAsia="Times New Roman" w:hAnsi="Times New Roman"/>
-          <w:sz w:val="24"/>
-          <w:szCs w:val="24"/>
-        </w:rPr>
-        <w:t xml:space="preserve"> La causa es organizativa más que técnica: con un solo integrante con permisos
-en el repositorio, exigir una aprobación habría bloqueado todas las fusiones, y el equipo priorizó avanzar. En una
-empresa esa decisión sería inaceptable: la protección de ramas es justamente lo que impide que la urgencia salte
-los controles. La propuesta la configura desde el primer día y agrega al compañero como colaborador antes (issues
-#36 y #37).</w:t>
+        <w:t xml:space="preserve">Las ramas se protegieron tarde.</w:t>
+      </w:r>
+      <w:r>
+        <w:rPr>
+          <w:rFonts w:ascii="Times New Roman" w:cs="Times New Roman" w:eastAsia="Times New Roman" w:hAnsi="Times New Roman"/>
+          <w:sz w:val="24"/>
+          <w:szCs w:val="24"/>
+        </w:rPr>
+        <w:t xml:space="preserve"> Con una sola persona, GitHub no permite aprobar el propio PR, y exigir una
+aprobación habría bloqueado todas las fusiones; se priorizó avanzar. La protección (PR y checks obligatorios, sin
+excepciones para administradores) se configuró recién al final, junto con la revisión escrita asistida por IA. En
+una empresa esa decisión sería inaceptable: la protección de ramas es justamente lo que impide que la urgencia
+salte los controles, y debe configurarse el primer día.</w:t>
       </w:r>
     </w:p>
     <w:p>
@@ -5999,7 +6308,7 @@
           <w:sz w:val="24"/>
           <w:szCs w:val="24"/>
         </w:rPr>
-        <w:t xml:space="preserve"> Esto aceleró el proyecto, pero concentra el riesgo: si el equipo no
+        <w:t xml:space="preserve"> Esto aceleró el proyecto, pero concentra el riesgo: si el desarrollador no
 entiende el código, no puede mantenerlo, que es exactamente el problema de dependencia que la empresa quiere
 evitar. Lo mitigan las especificaciones, las pruebas y la verificación manual, pero no sustituyen a la revisión
 humana, y DORA (2024) muestra que la IA sin controles empeora la estabilidad.</w:t>
@@ -6051,16 +6360,17 @@
           <w:sz w:val="24"/>
           <w:szCs w:val="24"/>
         </w:rPr>
-        <w:t xml:space="preserve">Copilot apenas se usó.</w:t>
-      </w:r>
-      <w:r>
-        <w:rPr>
-          <w:rFonts w:ascii="Times New Roman" w:cs="Times New Roman" w:eastAsia="Times New Roman" w:hAnsi="Times New Roman"/>
-          <w:sz w:val="24"/>
-          <w:szCs w:val="24"/>
-        </w:rPr>
-        <w:t xml:space="preserve"> El bloque 5 pedía GitHub Copilot y el equipo usó otro agente. Las prácticas son
-transferibles, pero la evidencia del uso de Copilot queda pendiente.</w:t>
+        <w:t xml:space="preserve">Copilot se usó poco.</w:t>
+      </w:r>
+      <w:r>
+        <w:rPr>
+          <w:rFonts w:ascii="Times New Roman" w:cs="Times New Roman" w:eastAsia="Times New Roman" w:hAnsi="Times New Roman"/>
+          <w:sz w:val="24"/>
+          <w:szCs w:val="24"/>
+        </w:rPr>
+        <w:t xml:space="preserve"> El plan gratuito no incluye la revisión automática de PR ni el agente en la nube; se usó
+Copilot Chat como segundo revisor y el desarrollo principal se hizo con otro agente. Las prácticas (especificar,
+acotar el prompt, verificar) son las mismas.</w:t>
       </w:r>
     </w:p>
     <w:p>
@@ -6158,7 +6468,8 @@
         </w:rPr>
         <w:t xml:space="preserve">. El pipeline, las pruebas
 y las especificaciones se cumplieron porque la máquina los ejecuta; la revisión de código y la protección de ramas
-fallaron porque dependían de la disciplina del equipo. Un modelo para la empresa debe convertir esas prácticas
+fallaron mientras dependieron solo de la disciplina. Cuando se convirtieron en reglas (protección de ramas) y en un
+paso del flujo (revisión escrita con IA), se cumplieron. Un modelo para la empresa debe convertir esas prácticas
 humanas en reglas que el sistema haga cumplir.</w:t>
       </w:r>
     </w:p>
@@ -6222,7 +6533,7 @@
           <w:sz w:val="24"/>
           <w:szCs w:val="24"/>
         </w:rPr>
-        <w:t xml:space="preserve">Figura 1</w:t>
+        <w:t xml:space="preserve">Figura 3</w:t>
       </w:r>
     </w:p>
     <w:p>
@@ -6243,6 +6554,7 @@
     </w:p>
     <w:p>
       <w:pPr>
+        <w:keepNext w:val="false"/>
         <w:spacing w:line="240" w:before="0" w:after="0"/>
       </w:pPr>
       <w:r>
@@ -6264,7 +6576,7 @@
                     </pic:cNvPicPr>
                   </pic:nvPicPr>
                   <pic:blipFill>
-                    <a:blip r:embed="rId8" cstate="none"/>
+                    <a:blip r:embed="rId10" cstate="none"/>
                     <a:srcRect/>
                     <a:stretch>
                       <a:fillRect/>
@@ -9140,9 +9452,9 @@
           <w:sz w:val="24"/>
           <w:szCs w:val="24"/>
         </w:rPr>
-        <w:t xml:space="preserve">TaskFlow demuestra que el modelo funciona en la práctica: tres versiones con 19 historias de usuario, 405 pruebas
-automatizadas, cobertura del 99 % en la API, 48 ejecuciones del pipeline sin fallos y documentación actualizada en
-cada cambio.</w:t>
+        <w:t xml:space="preserve">TaskFlow demuestra que el modelo funciona en la práctica: tres versiones con 19 historias de usuario, 415 pruebas
+automatizadas, cobertura del 99 % en la API, más de 50 ejecuciones del pipeline sin fallos y documentación
+actualizada en cada cambio.</w:t>
       </w:r>
     </w:p>
     <w:p>
@@ -9180,7 +9492,9 @@
           <w:szCs w:val="24"/>
         </w:rPr>
         <w:t xml:space="preserve">Las prácticas que dependen solo de la disciplina —revisión de código, protección de ramas, gestión al día— fueron
-las que fallaron. En una empresa deben configurarse como reglas que el sistema obligue a cumplir.</w:t>
+las que fallaron. En una empresa deben configurarse como reglas que el sistema obligue a cumplir. Para quien
+trabaja solo, la revisión asistida por IA es un sustituto útil, siempre que cada observación se verifique: de
+las cinco de Copilot, tres eran falsas.</w:t>
       </w:r>
     </w:p>
     <w:p>
@@ -9299,7 +9613,7 @@
         <w:t xml:space="preserve">Porque el software ya no se entrega una vez al año: se actualiza continuamente, y cada entrega manual es una
 oportunidad de error. DevOps automatiza lo repetitivo —compilar, probar, desplegar— para que los errores aparezcan en
 minutos y no en producción, y mide el proceso para mejorarlo (Forsgren et al., 2018). En el proyecto, el pipeline
-ejecutó cientos de pruebas en cada PR sin que nadie tuviera que recordarlo. También aprendimos que DevOps es sobre
+ejecutó cientos de pruebas en cada PR sin que nadie tuviera que recordarlo. También aprendí que DevOps es sobre
 todo cultura: la automatización se cumplió y la revisión entre personas, no.</w:t>
       </w:r>
     </w:p>
@@ -9385,7 +9699,7 @@
           <w:highlight w:val="yellow"/>
           <w:highlightCs w:val="yellow"/>
         </w:rPr>
-        <w:t xml:space="preserve">[Respuesta del equipo. Sugerencia para discutir: </w:t>
+        <w:t xml:space="preserve">[Respuesta del autor. Sugerencia: </w:t>
       </w:r>
       <w:r>
         <w:rPr>
@@ -10510,8 +10824,8 @@
         <w:tblLayout w:type="fixed"/>
       </w:tblPr>
       <w:tblGrid>
-        <w:gridCol w:w="3687"/>
-        <w:gridCol w:w="5339"/>
+        <w:gridCol w:w="3657"/>
+        <w:gridCol w:w="5369"/>
       </w:tblGrid>
       <w:tr>
         <w:trPr>
@@ -10519,7 +10833,7 @@
         </w:trPr>
         <w:tc>
           <w:tcPr>
-            <w:tcW w:type="dxa" w:w="3687"/>
+            <w:tcW w:type="dxa" w:w="3657"/>
             <w:tcBorders>
               <w:top w:val="single" w:color="000000" w:sz="6"/>
               <w:left w:val="none" w:color="FFFFFF" w:sz="0"/>
@@ -10552,7 +10866,7 @@
         </w:tc>
         <w:tc>
           <w:tcPr>
-            <w:tcW w:type="dxa" w:w="5339"/>
+            <w:tcW w:type="dxa" w:w="5369"/>
             <w:tcBorders>
               <w:top w:val="single" w:color="000000" w:sz="6"/>
               <w:left w:val="none" w:color="FFFFFF" w:sz="0"/>
@@ -10587,7 +10901,7 @@
       <w:tr>
         <w:tc>
           <w:tcPr>
-            <w:tcW w:type="dxa" w:w="3687"/>
+            <w:tcW w:type="dxa" w:w="3657"/>
             <w:tcBorders>
               <w:top w:val="none" w:color="FFFFFF" w:sz="0"/>
               <w:left w:val="none" w:color="FFFFFF" w:sz="0"/>
@@ -10618,7 +10932,7 @@
         </w:tc>
         <w:tc>
           <w:tcPr>
-            <w:tcW w:type="dxa" w:w="5339"/>
+            <w:tcW w:type="dxa" w:w="5369"/>
             <w:tcBorders>
               <w:top w:val="none" w:color="FFFFFF" w:sz="0"/>
               <w:left w:val="none" w:color="FFFFFF" w:sz="0"/>
@@ -10651,7 +10965,7 @@
       <w:tr>
         <w:tc>
           <w:tcPr>
-            <w:tcW w:type="dxa" w:w="3687"/>
+            <w:tcW w:type="dxa" w:w="3657"/>
             <w:tcBorders>
               <w:top w:val="none" w:color="FFFFFF" w:sz="0"/>
               <w:left w:val="none" w:color="FFFFFF" w:sz="0"/>
@@ -10682,7 +10996,7 @@
         </w:tc>
         <w:tc>
           <w:tcPr>
-            <w:tcW w:type="dxa" w:w="5339"/>
+            <w:tcW w:type="dxa" w:w="5369"/>
             <w:tcBorders>
               <w:top w:val="none" w:color="FFFFFF" w:sz="0"/>
               <w:left w:val="none" w:color="FFFFFF" w:sz="0"/>
@@ -10747,7 +11061,7 @@
       <w:tr>
         <w:tc>
           <w:tcPr>
-            <w:tcW w:type="dxa" w:w="3687"/>
+            <w:tcW w:type="dxa" w:w="3657"/>
             <w:tcBorders>
               <w:top w:val="none" w:color="FFFFFF" w:sz="0"/>
               <w:left w:val="none" w:color="FFFFFF" w:sz="0"/>
@@ -10778,7 +11092,7 @@
         </w:tc>
         <w:tc>
           <w:tcPr>
-            <w:tcW w:type="dxa" w:w="5339"/>
+            <w:tcW w:type="dxa" w:w="5369"/>
             <w:tcBorders>
               <w:top w:val="none" w:color="FFFFFF" w:sz="0"/>
               <w:left w:val="none" w:color="FFFFFF" w:sz="0"/>
@@ -10811,7 +11125,7 @@
       <w:tr>
         <w:tc>
           <w:tcPr>
-            <w:tcW w:type="dxa" w:w="3687"/>
+            <w:tcW w:type="dxa" w:w="3657"/>
             <w:tcBorders>
               <w:top w:val="none" w:color="FFFFFF" w:sz="0"/>
               <w:left w:val="none" w:color="FFFFFF" w:sz="0"/>
@@ -10842,7 +11156,7 @@
         </w:tc>
         <w:tc>
           <w:tcPr>
-            <w:tcW w:type="dxa" w:w="5339"/>
+            <w:tcW w:type="dxa" w:w="5369"/>
             <w:tcBorders>
               <w:top w:val="none" w:color="FFFFFF" w:sz="0"/>
               <w:left w:val="none" w:color="FFFFFF" w:sz="0"/>
@@ -10875,7 +11189,7 @@
       <w:tr>
         <w:tc>
           <w:tcPr>
-            <w:tcW w:type="dxa" w:w="3687"/>
+            <w:tcW w:type="dxa" w:w="3657"/>
             <w:tcBorders>
               <w:top w:val="none" w:color="FFFFFF" w:sz="0"/>
               <w:left w:val="none" w:color="FFFFFF" w:sz="0"/>
@@ -10906,7 +11220,7 @@
         </w:tc>
         <w:tc>
           <w:tcPr>
-            <w:tcW w:type="dxa" w:w="5339"/>
+            <w:tcW w:type="dxa" w:w="5369"/>
             <w:tcBorders>
               <w:top w:val="none" w:color="FFFFFF" w:sz="0"/>
               <w:left w:val="none" w:color="FFFFFF" w:sz="0"/>
@@ -10957,7 +11271,7 @@
       <w:tr>
         <w:tc>
           <w:tcPr>
-            <w:tcW w:type="dxa" w:w="3687"/>
+            <w:tcW w:type="dxa" w:w="3657"/>
             <w:tcBorders>
               <w:top w:val="none" w:color="FFFFFF" w:sz="0"/>
               <w:left w:val="none" w:color="FFFFFF" w:sz="0"/>
@@ -10988,7 +11302,7 @@
         </w:tc>
         <w:tc>
           <w:tcPr>
-            <w:tcW w:type="dxa" w:w="5339"/>
+            <w:tcW w:type="dxa" w:w="5369"/>
             <w:tcBorders>
               <w:top w:val="none" w:color="FFFFFF" w:sz="0"/>
               <w:left w:val="none" w:color="FFFFFF" w:sz="0"/>
@@ -11031,7 +11345,7 @@
                 <w:sz w:val="24"/>
                 <w:szCs w:val="24"/>
               </w:rPr>
-              <w:t xml:space="preserve"> (#1 a #20 fusionados; #39 y #40 abiertos)</w:t>
+              <w:t xml:space="preserve"> (#1 a #20 sin revisión; #39 a #41 con revisión escrita)</w:t>
             </w:r>
           </w:p>
         </w:tc>
@@ -11039,7 +11353,7 @@
       <w:tr>
         <w:tc>
           <w:tcPr>
-            <w:tcW w:type="dxa" w:w="3687"/>
+            <w:tcW w:type="dxa" w:w="3657"/>
             <w:tcBorders>
               <w:top w:val="none" w:color="FFFFFF" w:sz="0"/>
               <w:left w:val="none" w:color="FFFFFF" w:sz="0"/>
@@ -11064,13 +11378,13 @@
                 <w:sz w:val="24"/>
                 <w:szCs w:val="24"/>
               </w:rPr>
-              <w:t xml:space="preserve">Issues y milestones</w:t>
-            </w:r>
-          </w:p>
-        </w:tc>
-        <w:tc>
-          <w:tcPr>
-            <w:tcW w:type="dxa" w:w="5339"/>
+              <w:t xml:space="preserve">Revisión con IA</w:t>
+            </w:r>
+          </w:p>
+        </w:tc>
+        <w:tc>
+          <w:tcPr>
+            <w:tcW w:type="dxa" w:w="5369"/>
             <w:tcBorders>
               <w:top w:val="none" w:color="FFFFFF" w:sz="0"/>
               <w:left w:val="none" w:color="FFFFFF" w:sz="0"/>
@@ -11095,35 +11409,7 @@
                 <w:sz w:val="24"/>
                 <w:szCs w:val="24"/>
               </w:rPr>
-              <w:t xml:space="preserve">Pestañas </w:t>
-            </w:r>
-            <w:r>
-              <w:rPr>
-                <w:rFonts w:ascii="Times New Roman" w:cs="Times New Roman" w:eastAsia="Times New Roman" w:hAnsi="Times New Roman"/>
-                <w:b/>
-                <w:bCs/>
-                <w:sz w:val="24"/>
-                <w:szCs w:val="24"/>
-              </w:rPr>
-              <w:t xml:space="preserve">Issues</w:t>
-            </w:r>
-            <w:r>
-              <w:rPr>
-                <w:rFonts w:ascii="Times New Roman" w:cs="Times New Roman" w:eastAsia="Times New Roman" w:hAnsi="Times New Roman"/>
-                <w:sz w:val="24"/>
-                <w:szCs w:val="24"/>
-              </w:rPr>
-              <w:t xml:space="preserve"> y </w:t>
-            </w:r>
-            <w:r>
-              <w:rPr>
-                <w:rFonts w:ascii="Times New Roman" w:cs="Times New Roman" w:eastAsia="Times New Roman" w:hAnsi="Times New Roman"/>
-                <w:b/>
-                <w:bCs/>
-                <w:sz w:val="24"/>
-                <w:szCs w:val="24"/>
-              </w:rPr>
-              <w:t xml:space="preserve">Milestones</w:t>
+              <w:t xml:space="preserve">Comentarios de revisión en los PR #39 y #40 (Claude Code y GitHub Copilot Chat)</w:t>
             </w:r>
           </w:p>
         </w:tc>
@@ -11131,64 +11417,56 @@
       <w:tr>
         <w:tc>
           <w:tcPr>
-            <w:tcW w:type="dxa" w:w="3687"/>
+            <w:tcW w:type="dxa" w:w="3657"/>
             <w:tcBorders>
               <w:top w:val="none" w:color="FFFFFF" w:sz="0"/>
               <w:left w:val="none" w:color="FFFFFF" w:sz="0"/>
-              <w:bottom w:val="single" w:color="000000" w:sz="6"/>
-              <w:right w:val="none" w:color="FFFFFF" w:sz="0"/>
-            </w:tcBorders>
-            <w:shd w:fill="FFFFFF" w:val="clear"/>
-            <w:tcMar>
-              <w:top w:type="dxa" w:w="60"/>
-              <w:left w:type="dxa" w:w="90"/>
-              <w:bottom w:type="dxa" w:w="60"/>
-              <w:right w:type="dxa" w:w="90"/>
-            </w:tcMar>
-          </w:tcPr>
-          <w:p>
-            <w:pPr>
-              <w:spacing w:line="240" w:before="0" w:after="0"/>
-            </w:pPr>
-            <w:r>
-              <w:rPr>
-                <w:rFonts w:ascii="Times New Roman" w:cs="Times New Roman" w:eastAsia="Times New Roman" w:hAnsi="Times New Roman"/>
-                <w:sz w:val="24"/>
-                <w:szCs w:val="24"/>
-              </w:rPr>
-              <w:t xml:space="preserve">Artefacto del deploy</w:t>
-            </w:r>
-          </w:p>
-        </w:tc>
-        <w:tc>
-          <w:tcPr>
-            <w:tcW w:type="dxa" w:w="5339"/>
+              <w:bottom w:val="none" w:color="FFFFFF" w:sz="0"/>
+              <w:right w:val="none" w:color="FFFFFF" w:sz="0"/>
+            </w:tcBorders>
+            <w:shd w:fill="FFFFFF" w:val="clear"/>
+            <w:tcMar>
+              <w:top w:type="dxa" w:w="60"/>
+              <w:left w:type="dxa" w:w="90"/>
+              <w:bottom w:type="dxa" w:w="60"/>
+              <w:right w:type="dxa" w:w="90"/>
+            </w:tcMar>
+          </w:tcPr>
+          <w:p>
+            <w:pPr>
+              <w:spacing w:line="240" w:before="0" w:after="0"/>
+            </w:pPr>
+            <w:r>
+              <w:rPr>
+                <w:rFonts w:ascii="Times New Roman" w:cs="Times New Roman" w:eastAsia="Times New Roman" w:hAnsi="Times New Roman"/>
+                <w:sz w:val="24"/>
+                <w:szCs w:val="24"/>
+              </w:rPr>
+              <w:t xml:space="preserve">Protección de ramas</w:t>
+            </w:r>
+          </w:p>
+        </w:tc>
+        <w:tc>
+          <w:tcPr>
+            <w:tcW w:type="dxa" w:w="5369"/>
             <w:tcBorders>
               <w:top w:val="none" w:color="FFFFFF" w:sz="0"/>
               <w:left w:val="none" w:color="FFFFFF" w:sz="0"/>
-              <w:bottom w:val="single" w:color="000000" w:sz="6"/>
-              <w:right w:val="none" w:color="FFFFFF" w:sz="0"/>
-            </w:tcBorders>
-            <w:shd w:fill="FFFFFF" w:val="clear"/>
-            <w:tcMar>
-              <w:top w:type="dxa" w:w="60"/>
-              <w:left w:type="dxa" w:w="90"/>
-              <w:bottom w:type="dxa" w:w="60"/>
-              <w:right w:type="dxa" w:w="90"/>
-            </w:tcMar>
-          </w:tcPr>
-          <w:p>
-            <w:pPr>
-              <w:spacing w:line="240" w:before="0" w:after="0"/>
-            </w:pPr>
-            <w:r>
-              <w:rPr>
-                <w:rFonts w:ascii="Times New Roman" w:cs="Times New Roman" w:eastAsia="Times New Roman" w:hAnsi="Times New Roman"/>
-                <w:sz w:val="24"/>
-                <w:szCs w:val="24"/>
-              </w:rPr>
-              <w:t xml:space="preserve">Actions → ejecución en </w:t>
-            </w:r>
+              <w:bottom w:val="none" w:color="FFFFFF" w:sz="0"/>
+              <w:right w:val="none" w:color="FFFFFF" w:sz="0"/>
+            </w:tcBorders>
+            <w:shd w:fill="FFFFFF" w:val="clear"/>
+            <w:tcMar>
+              <w:top w:type="dxa" w:w="60"/>
+              <w:left w:type="dxa" w:w="90"/>
+              <w:bottom w:type="dxa" w:w="60"/>
+              <w:right w:type="dxa" w:w="90"/>
+            </w:tcMar>
+          </w:tcPr>
+          <w:p>
+            <w:pPr>
+              <w:spacing w:line="240" w:before="0" w:after="0"/>
+            </w:pPr>
             <w:r>
               <w:rPr>
                 <w:rFonts w:ascii="Courier New" w:cs="Courier New" w:eastAsia="Courier New" w:hAnsi="Courier New"/>
@@ -11203,7 +11481,7 @@
                 <w:sz w:val="24"/>
                 <w:szCs w:val="24"/>
               </w:rPr>
-              <w:t xml:space="preserve"> → Artifacts → </w:t>
+              <w:t xml:space="preserve"> y </w:t>
             </w:r>
             <w:r>
               <w:rPr>
@@ -11211,6 +11489,226 @@
                 <w:sz w:val="22"/>
                 <w:szCs w:val="22"/>
               </w:rPr>
+              <w:t xml:space="preserve">develop</w:t>
+            </w:r>
+            <w:r>
+              <w:rPr>
+                <w:rFonts w:ascii="Times New Roman" w:cs="Times New Roman" w:eastAsia="Times New Roman" w:hAnsi="Times New Roman"/>
+                <w:sz w:val="24"/>
+                <w:szCs w:val="24"/>
+              </w:rPr>
+              <w:t xml:space="preserve">: PR y checks </w:t>
+            </w:r>
+            <w:r>
+              <w:rPr>
+                <w:rFonts w:ascii="Courier New" w:cs="Courier New" w:eastAsia="Courier New" w:hAnsi="Courier New"/>
+                <w:sz w:val="22"/>
+                <w:szCs w:val="22"/>
+              </w:rPr>
+              <w:t xml:space="preserve">backend</w:t>
+            </w:r>
+            <w:r>
+              <w:rPr>
+                <w:rFonts w:ascii="Times New Roman" w:cs="Times New Roman" w:eastAsia="Times New Roman" w:hAnsi="Times New Roman"/>
+                <w:sz w:val="24"/>
+                <w:szCs w:val="24"/>
+              </w:rPr>
+              <w:t xml:space="preserve"> y </w:t>
+            </w:r>
+            <w:r>
+              <w:rPr>
+                <w:rFonts w:ascii="Courier New" w:cs="Courier New" w:eastAsia="Courier New" w:hAnsi="Courier New"/>
+                <w:sz w:val="22"/>
+                <w:szCs w:val="22"/>
+              </w:rPr>
+              <w:t xml:space="preserve">frontend</w:t>
+            </w:r>
+            <w:r>
+              <w:rPr>
+                <w:rFonts w:ascii="Times New Roman" w:cs="Times New Roman" w:eastAsia="Times New Roman" w:hAnsi="Times New Roman"/>
+                <w:sz w:val="24"/>
+                <w:szCs w:val="24"/>
+              </w:rPr>
+              <w:t xml:space="preserve"> obligatorios (issue #36)</w:t>
+            </w:r>
+          </w:p>
+        </w:tc>
+      </w:tr>
+      <w:tr>
+        <w:tc>
+          <w:tcPr>
+            <w:tcW w:type="dxa" w:w="3657"/>
+            <w:tcBorders>
+              <w:top w:val="none" w:color="FFFFFF" w:sz="0"/>
+              <w:left w:val="none" w:color="FFFFFF" w:sz="0"/>
+              <w:bottom w:val="none" w:color="FFFFFF" w:sz="0"/>
+              <w:right w:val="none" w:color="FFFFFF" w:sz="0"/>
+            </w:tcBorders>
+            <w:shd w:fill="FFFFFF" w:val="clear"/>
+            <w:tcMar>
+              <w:top w:type="dxa" w:w="60"/>
+              <w:left w:type="dxa" w:w="90"/>
+              <w:bottom w:type="dxa" w:w="60"/>
+              <w:right w:type="dxa" w:w="90"/>
+            </w:tcMar>
+          </w:tcPr>
+          <w:p>
+            <w:pPr>
+              <w:spacing w:line="240" w:before="0" w:after="0"/>
+            </w:pPr>
+            <w:r>
+              <w:rPr>
+                <w:rFonts w:ascii="Times New Roman" w:cs="Times New Roman" w:eastAsia="Times New Roman" w:hAnsi="Times New Roman"/>
+                <w:sz w:val="24"/>
+                <w:szCs w:val="24"/>
+              </w:rPr>
+              <w:t xml:space="preserve">Issues y milestones</w:t>
+            </w:r>
+          </w:p>
+        </w:tc>
+        <w:tc>
+          <w:tcPr>
+            <w:tcW w:type="dxa" w:w="5369"/>
+            <w:tcBorders>
+              <w:top w:val="none" w:color="FFFFFF" w:sz="0"/>
+              <w:left w:val="none" w:color="FFFFFF" w:sz="0"/>
+              <w:bottom w:val="none" w:color="FFFFFF" w:sz="0"/>
+              <w:right w:val="none" w:color="FFFFFF" w:sz="0"/>
+            </w:tcBorders>
+            <w:shd w:fill="FFFFFF" w:val="clear"/>
+            <w:tcMar>
+              <w:top w:type="dxa" w:w="60"/>
+              <w:left w:type="dxa" w:w="90"/>
+              <w:bottom w:type="dxa" w:w="60"/>
+              <w:right w:type="dxa" w:w="90"/>
+            </w:tcMar>
+          </w:tcPr>
+          <w:p>
+            <w:pPr>
+              <w:spacing w:line="240" w:before="0" w:after="0"/>
+            </w:pPr>
+            <w:r>
+              <w:rPr>
+                <w:rFonts w:ascii="Times New Roman" w:cs="Times New Roman" w:eastAsia="Times New Roman" w:hAnsi="Times New Roman"/>
+                <w:sz w:val="24"/>
+                <w:szCs w:val="24"/>
+              </w:rPr>
+              <w:t xml:space="preserve">Pestañas </w:t>
+            </w:r>
+            <w:r>
+              <w:rPr>
+                <w:rFonts w:ascii="Times New Roman" w:cs="Times New Roman" w:eastAsia="Times New Roman" w:hAnsi="Times New Roman"/>
+                <w:b/>
+                <w:bCs/>
+                <w:sz w:val="24"/>
+                <w:szCs w:val="24"/>
+              </w:rPr>
+              <w:t xml:space="preserve">Issues</w:t>
+            </w:r>
+            <w:r>
+              <w:rPr>
+                <w:rFonts w:ascii="Times New Roman" w:cs="Times New Roman" w:eastAsia="Times New Roman" w:hAnsi="Times New Roman"/>
+                <w:sz w:val="24"/>
+                <w:szCs w:val="24"/>
+              </w:rPr>
+              <w:t xml:space="preserve"> y </w:t>
+            </w:r>
+            <w:r>
+              <w:rPr>
+                <w:rFonts w:ascii="Times New Roman" w:cs="Times New Roman" w:eastAsia="Times New Roman" w:hAnsi="Times New Roman"/>
+                <w:b/>
+                <w:bCs/>
+                <w:sz w:val="24"/>
+                <w:szCs w:val="24"/>
+              </w:rPr>
+              <w:t xml:space="preserve">Milestones</w:t>
+            </w:r>
+          </w:p>
+        </w:tc>
+      </w:tr>
+      <w:tr>
+        <w:tc>
+          <w:tcPr>
+            <w:tcW w:type="dxa" w:w="3657"/>
+            <w:tcBorders>
+              <w:top w:val="none" w:color="FFFFFF" w:sz="0"/>
+              <w:left w:val="none" w:color="FFFFFF" w:sz="0"/>
+              <w:bottom w:val="single" w:color="000000" w:sz="6"/>
+              <w:right w:val="none" w:color="FFFFFF" w:sz="0"/>
+            </w:tcBorders>
+            <w:shd w:fill="FFFFFF" w:val="clear"/>
+            <w:tcMar>
+              <w:top w:type="dxa" w:w="60"/>
+              <w:left w:type="dxa" w:w="90"/>
+              <w:bottom w:type="dxa" w:w="60"/>
+              <w:right w:type="dxa" w:w="90"/>
+            </w:tcMar>
+          </w:tcPr>
+          <w:p>
+            <w:pPr>
+              <w:spacing w:line="240" w:before="0" w:after="0"/>
+            </w:pPr>
+            <w:r>
+              <w:rPr>
+                <w:rFonts w:ascii="Times New Roman" w:cs="Times New Roman" w:eastAsia="Times New Roman" w:hAnsi="Times New Roman"/>
+                <w:sz w:val="24"/>
+                <w:szCs w:val="24"/>
+              </w:rPr>
+              <w:t xml:space="preserve">Artefacto del deploy</w:t>
+            </w:r>
+          </w:p>
+        </w:tc>
+        <w:tc>
+          <w:tcPr>
+            <w:tcW w:type="dxa" w:w="5369"/>
+            <w:tcBorders>
+              <w:top w:val="none" w:color="FFFFFF" w:sz="0"/>
+              <w:left w:val="none" w:color="FFFFFF" w:sz="0"/>
+              <w:bottom w:val="single" w:color="000000" w:sz="6"/>
+              <w:right w:val="none" w:color="FFFFFF" w:sz="0"/>
+            </w:tcBorders>
+            <w:shd w:fill="FFFFFF" w:val="clear"/>
+            <w:tcMar>
+              <w:top w:type="dxa" w:w="60"/>
+              <w:left w:type="dxa" w:w="90"/>
+              <w:bottom w:type="dxa" w:w="60"/>
+              <w:right w:type="dxa" w:w="90"/>
+            </w:tcMar>
+          </w:tcPr>
+          <w:p>
+            <w:pPr>
+              <w:spacing w:line="240" w:before="0" w:after="0"/>
+            </w:pPr>
+            <w:r>
+              <w:rPr>
+                <w:rFonts w:ascii="Times New Roman" w:cs="Times New Roman" w:eastAsia="Times New Roman" w:hAnsi="Times New Roman"/>
+                <w:sz w:val="24"/>
+                <w:szCs w:val="24"/>
+              </w:rPr>
+              <w:t xml:space="preserve">Actions → ejecución en </w:t>
+            </w:r>
+            <w:r>
+              <w:rPr>
+                <w:rFonts w:ascii="Courier New" w:cs="Courier New" w:eastAsia="Courier New" w:hAnsi="Courier New"/>
+                <w:sz w:val="22"/>
+                <w:szCs w:val="22"/>
+              </w:rPr>
+              <w:t xml:space="preserve">main</w:t>
+            </w:r>
+            <w:r>
+              <w:rPr>
+                <w:rFonts w:ascii="Times New Roman" w:cs="Times New Roman" w:eastAsia="Times New Roman" w:hAnsi="Times New Roman"/>
+                <w:sz w:val="24"/>
+                <w:szCs w:val="24"/>
+              </w:rPr>
+              <w:t xml:space="preserve"> → Artifacts → </w:t>
+            </w:r>
+            <w:r>
+              <w:rPr>
+                <w:rFonts w:ascii="Courier New" w:cs="Courier New" w:eastAsia="Courier New" w:hAnsi="Courier New"/>
+                <w:sz w:val="22"/>
+                <w:szCs w:val="22"/>
+              </w:rPr>
               <w:t xml:space="preserve">taskflow-frontend</w:t>
             </w:r>
           </w:p>
@@ -11250,8 +11748,26 @@
           <w:sz w:val="24"/>
           <w:szCs w:val="24"/>
         </w:rPr>
-        <w:t xml:space="preserve">En este proyecto se usó Claude Code (Anthropic) para generar código, pruebas, documentación y el primer borrador de
-este informe, a partir de especificaciones escritas y aprobadas por el equipo. </w:t>
+        <w:t xml:space="preserve">En este proyecto se usó Claude Code (Anthropic) para generar código, pruebas, documentación, la revisión de código
+de los PR #39 y #40 y el primer borrador de este informe, a partir de especificaciones aprobadas por el autor. Se usó
+GitHub Copilot Chat (plan Free) como segundo revisor de </w:t>
+      </w:r>
+      <w:r>
+        <w:rPr>
+          <w:rFonts w:ascii="Courier New" w:cs="Courier New" w:eastAsia="Courier New" w:hAnsi="Courier New"/>
+          <w:sz w:val="22"/>
+          <w:szCs w:val="22"/>
+        </w:rPr>
+        <w:t xml:space="preserve">backend/src/backup.js</w:t>
+      </w:r>
+      <w:r>
+        <w:rPr>
+          <w:rFonts w:ascii="Times New Roman" w:cs="Times New Roman" w:eastAsia="Times New Roman" w:hAnsi="Times New Roman"/>
+          <w:sz w:val="24"/>
+          <w:szCs w:val="24"/>
+        </w:rPr>
+        <w:t xml:space="preserve">; sus observaciones se evaluaron una a
+una (Figuras 1 y 2). El autor ejecutó las pruebas, probó la aplicación y revisó </w:t>
       </w:r>
       <w:r>
         <w:rPr>
@@ -11261,36 +11777,449 @@
           <w:highlight w:val="yellow"/>
           <w:highlightCs w:val="yellow"/>
         </w:rPr>
-        <w:t xml:space="preserve">[Completar: uso de GitHub Copilot.]</w:t>
-      </w:r>
-      <w:r>
-        <w:rPr>
-          <w:rFonts w:ascii="Times New Roman" w:cs="Times New Roman" w:eastAsia="Times New Roman" w:hAnsi="Times New Roman"/>
-          <w:sz w:val="24"/>
-          <w:szCs w:val="24"/>
-        </w:rPr>
-        <w:t xml:space="preserve">
-Los integrantes revisaron </w:t>
-      </w:r>
-      <w:r>
-        <w:rPr>
-          <w:rFonts w:ascii="Times New Roman" w:cs="Times New Roman" w:eastAsia="Times New Roman" w:hAnsi="Times New Roman"/>
-          <w:sz w:val="24"/>
-          <w:szCs w:val="24"/>
-          <w:highlight w:val="yellow"/>
-          <w:highlightCs w:val="yellow"/>
-        </w:rPr>
-        <w:t xml:space="preserve">[completar: qué revisó cada uno]</w:t>
-      </w:r>
-      <w:r>
-        <w:rPr>
-          <w:rFonts w:ascii="Times New Roman" w:cs="Times New Roman" w:eastAsia="Times New Roman" w:hAnsi="Times New Roman"/>
-          <w:sz w:val="24"/>
-          <w:szCs w:val="24"/>
-        </w:rPr>
-        <w:t xml:space="preserve">, ejecutaron las pruebas y probaron la aplicación. La
-responsabilidad por el contenido entregado es de los integrantes del equipo.</w:t>
-      </w:r>
+        <w:t xml:space="preserve">[completar: qué partes revisó
+personalmente]</w:t>
+      </w:r>
+      <w:r>
+        <w:rPr>
+          <w:rFonts w:ascii="Times New Roman" w:cs="Times New Roman" w:eastAsia="Times New Roman" w:hAnsi="Times New Roman"/>
+          <w:sz w:val="24"/>
+          <w:szCs w:val="24"/>
+        </w:rPr>
+        <w:t xml:space="preserve">. La responsabilidad por el contenido entregado es del autor.</w:t>
+      </w:r>
+    </w:p>
+    <w:p>
+      <w:pPr>
+        <w:pStyle w:val="Heading1"/>
+        <w:spacing w:line="480" w:before="0" w:after="0"/>
+        <w:jc w:val="center"/>
+      </w:pPr>
+      <w:r>
+        <w:rPr>
+          <w:rFonts w:ascii="Times New Roman" w:cs="Times New Roman" w:eastAsia="Times New Roman" w:hAnsi="Times New Roman"/>
+          <w:b/>
+          <w:bCs/>
+          <w:sz w:val="24"/>
+          <w:szCs w:val="24"/>
+        </w:rPr>
+        <w:t xml:space="preserve">Anexo C: Capturas de evidencia</w:t>
+      </w:r>
+    </w:p>
+    <w:p>
+      <w:pPr>
+        <w:keepNext/>
+        <w:spacing w:line="480" w:before="0" w:after="0"/>
+      </w:pPr>
+      <w:r>
+        <w:rPr>
+          <w:rFonts w:ascii="Times New Roman" w:cs="Times New Roman" w:eastAsia="Times New Roman" w:hAnsi="Times New Roman"/>
+          <w:b/>
+          <w:bCs/>
+          <w:sz w:val="24"/>
+          <w:szCs w:val="24"/>
+        </w:rPr>
+        <w:t xml:space="preserve">Figura 4</w:t>
+      </w:r>
+    </w:p>
+    <w:p>
+      <w:pPr>
+        <w:keepNext/>
+        <w:spacing w:line="480" w:before="0" w:after="0"/>
+      </w:pPr>
+      <w:r>
+        <w:rPr>
+          <w:rFonts w:ascii="Times New Roman" w:cs="Times New Roman" w:eastAsia="Times New Roman" w:hAnsi="Times New Roman"/>
+          <w:i/>
+          <w:iCs/>
+          <w:sz w:val="24"/>
+          <w:szCs w:val="24"/>
+        </w:rPr>
+        <w:t xml:space="preserve">Pull Request #39 con la issue enlazada, el milestone y la descripción según la plantilla</w:t>
+      </w:r>
+    </w:p>
+    <w:p>
+      <w:pPr>
+        <w:keepNext w:val="false"/>
+        <w:spacing w:line="240" w:before="0" w:after="0"/>
+      </w:pPr>
+      <w:r>
+        <w:drawing>
+          <wp:inline distT="0" distB="0" distL="0" distR="0">
+            <wp:extent cx="5715000" cy="6696075"/>
+            <wp:effectExtent t="0" r="0" b="0" l="0"/>
+            <wp:docPr id="1" name="Pull Request #39 con la issue enlazada, el milestone y la descripción según la plantilla" descr="Pull Request #39 con la issue enlazada, el milestone y la descripción según la plantilla" title="Pull Request #39 con la issue enlazada, el milestone y la descripción según la plantilla"/>
+            <wp:cNvGraphicFramePr>
+              <a:graphicFrameLocks xmlns:a="http://schemas.openxmlformats.org/drawingml/2006/main" noChangeAspect="1"/>
+            </wp:cNvGraphicFramePr>
+            <a:graphic xmlns:a="http://schemas.openxmlformats.org/drawingml/2006/main">
+              <a:graphicData uri="http://schemas.openxmlformats.org/drawingml/2006/picture">
+                <pic:pic xmlns:pic="http://schemas.openxmlformats.org/drawingml/2006/picture">
+                  <pic:nvPicPr>
+                    <pic:cNvPr id="0" name="" descr=""/>
+                    <pic:cNvPicPr>
+                      <a:picLocks noChangeAspect="1" noChangeArrowheads="1"/>
+                    </pic:cNvPicPr>
+                  </pic:nvPicPr>
+                  <pic:blipFill>
+                    <a:blip r:embed="rId11" cstate="none"/>
+                    <a:srcRect/>
+                    <a:stretch>
+                      <a:fillRect/>
+                    </a:stretch>
+                  </pic:blipFill>
+                  <pic:spPr bwMode="auto">
+                    <a:xfrm>
+                      <a:off x="0" y="0"/>
+                      <a:ext cx="5715000" cy="6696075"/>
+                    </a:xfrm>
+                    <a:prstGeom prst="rect">
+                      <a:avLst/>
+                    </a:prstGeom>
+                  </pic:spPr>
+                </pic:pic>
+              </a:graphicData>
+            </a:graphic>
+          </wp:inline>
+        </w:drawing>
+      </w:r>
+    </w:p>
+    <w:p>
+      <w:pPr>
+        <w:spacing w:line="480" w:before="0" w:after="0"/>
+      </w:pPr>
+    </w:p>
+    <w:p>
+      <w:pPr>
+        <w:keepNext/>
+        <w:spacing w:line="480" w:before="0" w:after="0"/>
+      </w:pPr>
+      <w:r>
+        <w:rPr>
+          <w:rFonts w:ascii="Times New Roman" w:cs="Times New Roman" w:eastAsia="Times New Roman" w:hAnsi="Times New Roman"/>
+          <w:b/>
+          <w:bCs/>
+          <w:sz w:val="24"/>
+          <w:szCs w:val="24"/>
+        </w:rPr>
+        <w:t xml:space="preserve">Figura 5</w:t>
+      </w:r>
+    </w:p>
+    <w:p>
+      <w:pPr>
+        <w:keepNext/>
+        <w:spacing w:line="480" w:before="0" w:after="0"/>
+      </w:pPr>
+      <w:r>
+        <w:rPr>
+          <w:rFonts w:ascii="Times New Roman" w:cs="Times New Roman" w:eastAsia="Times New Roman" w:hAnsi="Times New Roman"/>
+          <w:i/>
+          <w:iCs/>
+          <w:sz w:val="24"/>
+          <w:szCs w:val="24"/>
+        </w:rPr>
+        <w:t xml:space="preserve">Ejecuciones de GitHub Actions</w:t>
+      </w:r>
+    </w:p>
+    <w:p>
+      <w:pPr>
+        <w:keepNext w:val="false"/>
+        <w:spacing w:line="240" w:before="0" w:after="0"/>
+      </w:pPr>
+      <w:r>
+        <w:drawing>
+          <wp:inline distT="0" distB="0" distL="0" distR="0">
+            <wp:extent cx="5715000" cy="4914900"/>
+            <wp:effectExtent t="0" r="0" b="0" l="0"/>
+            <wp:docPr id="1" name="Ejecuciones de GitHub Actions" descr="Ejecuciones de GitHub Actions: todas en verde" title="Ejecuciones de GitHub Actions"/>
+            <wp:cNvGraphicFramePr>
+              <a:graphicFrameLocks xmlns:a="http://schemas.openxmlformats.org/drawingml/2006/main" noChangeAspect="1"/>
+            </wp:cNvGraphicFramePr>
+            <a:graphic xmlns:a="http://schemas.openxmlformats.org/drawingml/2006/main">
+              <a:graphicData uri="http://schemas.openxmlformats.org/drawingml/2006/picture">
+                <pic:pic xmlns:pic="http://schemas.openxmlformats.org/drawingml/2006/picture">
+                  <pic:nvPicPr>
+                    <pic:cNvPr id="0" name="" descr=""/>
+                    <pic:cNvPicPr>
+                      <a:picLocks noChangeAspect="1" noChangeArrowheads="1"/>
+                    </pic:cNvPicPr>
+                  </pic:nvPicPr>
+                  <pic:blipFill>
+                    <a:blip r:embed="rId12" cstate="none"/>
+                    <a:srcRect/>
+                    <a:stretch>
+                      <a:fillRect/>
+                    </a:stretch>
+                  </pic:blipFill>
+                  <pic:spPr bwMode="auto">
+                    <a:xfrm>
+                      <a:off x="0" y="0"/>
+                      <a:ext cx="5715000" cy="4914900"/>
+                    </a:xfrm>
+                    <a:prstGeom prst="rect">
+                      <a:avLst/>
+                    </a:prstGeom>
+                  </pic:spPr>
+                </pic:pic>
+              </a:graphicData>
+            </a:graphic>
+          </wp:inline>
+        </w:drawing>
+      </w:r>
+    </w:p>
+    <w:p>
+      <w:pPr>
+        <w:spacing w:line="480" w:before="0" w:after="0"/>
+      </w:pPr>
+    </w:p>
+    <w:p>
+      <w:pPr>
+        <w:keepNext/>
+        <w:spacing w:line="480" w:before="0" w:after="0"/>
+      </w:pPr>
+      <w:r>
+        <w:rPr>
+          <w:rFonts w:ascii="Times New Roman" w:cs="Times New Roman" w:eastAsia="Times New Roman" w:hAnsi="Times New Roman"/>
+          <w:b/>
+          <w:bCs/>
+          <w:sz w:val="24"/>
+          <w:szCs w:val="24"/>
+        </w:rPr>
+        <w:t xml:space="preserve">Figura 6</w:t>
+      </w:r>
+    </w:p>
+    <w:p>
+      <w:pPr>
+        <w:keepNext/>
+        <w:spacing w:line="480" w:before="0" w:after="0"/>
+      </w:pPr>
+      <w:r>
+        <w:rPr>
+          <w:rFonts w:ascii="Times New Roman" w:cs="Times New Roman" w:eastAsia="Times New Roman" w:hAnsi="Times New Roman"/>
+          <w:i/>
+          <w:iCs/>
+          <w:sz w:val="24"/>
+          <w:szCs w:val="24"/>
+        </w:rPr>
+        <w:t xml:space="preserve">Issues del proyecto, una por fase, con etiquetas y milestone</w:t>
+      </w:r>
+    </w:p>
+    <w:p>
+      <w:pPr>
+        <w:keepNext w:val="false"/>
+        <w:spacing w:line="240" w:before="0" w:after="0"/>
+      </w:pPr>
+      <w:r>
+        <w:drawing>
+          <wp:inline distT="0" distB="0" distL="0" distR="0">
+            <wp:extent cx="5715000" cy="5800725"/>
+            <wp:effectExtent t="0" r="0" b="0" l="0"/>
+            <wp:docPr id="1" name="Issues del proyecto, una por fase, con etiquetas y milestone" descr="Issues del proyecto, una por fase, con etiquetas y milestone" title="Issues del proyecto, una por fase, con etiquetas y milestone"/>
+            <wp:cNvGraphicFramePr>
+              <a:graphicFrameLocks xmlns:a="http://schemas.openxmlformats.org/drawingml/2006/main" noChangeAspect="1"/>
+            </wp:cNvGraphicFramePr>
+            <a:graphic xmlns:a="http://schemas.openxmlformats.org/drawingml/2006/main">
+              <a:graphicData uri="http://schemas.openxmlformats.org/drawingml/2006/picture">
+                <pic:pic xmlns:pic="http://schemas.openxmlformats.org/drawingml/2006/picture">
+                  <pic:nvPicPr>
+                    <pic:cNvPr id="0" name="" descr=""/>
+                    <pic:cNvPicPr>
+                      <a:picLocks noChangeAspect="1" noChangeArrowheads="1"/>
+                    </pic:cNvPicPr>
+                  </pic:nvPicPr>
+                  <pic:blipFill>
+                    <a:blip r:embed="rId13" cstate="none"/>
+                    <a:srcRect/>
+                    <a:stretch>
+                      <a:fillRect/>
+                    </a:stretch>
+                  </pic:blipFill>
+                  <pic:spPr bwMode="auto">
+                    <a:xfrm>
+                      <a:off x="0" y="0"/>
+                      <a:ext cx="5715000" cy="5800725"/>
+                    </a:xfrm>
+                    <a:prstGeom prst="rect">
+                      <a:avLst/>
+                    </a:prstGeom>
+                  </pic:spPr>
+                </pic:pic>
+              </a:graphicData>
+            </a:graphic>
+          </wp:inline>
+        </w:drawing>
+      </w:r>
+    </w:p>
+    <w:p>
+      <w:pPr>
+        <w:spacing w:line="480" w:before="0" w:after="0"/>
+      </w:pPr>
+    </w:p>
+    <w:p>
+      <w:pPr>
+        <w:keepNext/>
+        <w:spacing w:line="480" w:before="0" w:after="0"/>
+      </w:pPr>
+      <w:r>
+        <w:rPr>
+          <w:rFonts w:ascii="Times New Roman" w:cs="Times New Roman" w:eastAsia="Times New Roman" w:hAnsi="Times New Roman"/>
+          <w:b/>
+          <w:bCs/>
+          <w:sz w:val="24"/>
+          <w:szCs w:val="24"/>
+        </w:rPr>
+        <w:t xml:space="preserve">Figura 7</w:t>
+      </w:r>
+    </w:p>
+    <w:p>
+      <w:pPr>
+        <w:keepNext/>
+        <w:spacing w:line="480" w:before="0" w:after="0"/>
+      </w:pPr>
+      <w:r>
+        <w:rPr>
+          <w:rFonts w:ascii="Times New Roman" w:cs="Times New Roman" w:eastAsia="Times New Roman" w:hAnsi="Times New Roman"/>
+          <w:i/>
+          <w:iCs/>
+          <w:sz w:val="24"/>
+          <w:szCs w:val="24"/>
+        </w:rPr>
+        <w:t xml:space="preserve">Milestone v1.0 – Entrega final con su avance</w:t>
+      </w:r>
+    </w:p>
+    <w:p>
+      <w:pPr>
+        <w:keepNext w:val="false"/>
+        <w:spacing w:line="240" w:before="0" w:after="0"/>
+      </w:pPr>
+      <w:r>
+        <w:drawing>
+          <wp:inline distT="0" distB="0" distL="0" distR="0">
+            <wp:extent cx="5715000" cy="4019550"/>
+            <wp:effectExtent t="0" r="0" b="0" l="0"/>
+            <wp:docPr id="1" name="Milestone v1.0 – Entrega final con su avance" descr="Milestone v1.0 – Entrega final con su avance" title="Milestone v1.0 – Entrega final con su avance"/>
+            <wp:cNvGraphicFramePr>
+              <a:graphicFrameLocks xmlns:a="http://schemas.openxmlformats.org/drawingml/2006/main" noChangeAspect="1"/>
+            </wp:cNvGraphicFramePr>
+            <a:graphic xmlns:a="http://schemas.openxmlformats.org/drawingml/2006/main">
+              <a:graphicData uri="http://schemas.openxmlformats.org/drawingml/2006/picture">
+                <pic:pic xmlns:pic="http://schemas.openxmlformats.org/drawingml/2006/picture">
+                  <pic:nvPicPr>
+                    <pic:cNvPr id="0" name="" descr=""/>
+                    <pic:cNvPicPr>
+                      <a:picLocks noChangeAspect="1" noChangeArrowheads="1"/>
+                    </pic:cNvPicPr>
+                  </pic:nvPicPr>
+                  <pic:blipFill>
+                    <a:blip r:embed="rId14" cstate="none"/>
+                    <a:srcRect/>
+                    <a:stretch>
+                      <a:fillRect/>
+                    </a:stretch>
+                  </pic:blipFill>
+                  <pic:spPr bwMode="auto">
+                    <a:xfrm>
+                      <a:off x="0" y="0"/>
+                      <a:ext cx="5715000" cy="4019550"/>
+                    </a:xfrm>
+                    <a:prstGeom prst="rect">
+                      <a:avLst/>
+                    </a:prstGeom>
+                  </pic:spPr>
+                </pic:pic>
+              </a:graphicData>
+            </a:graphic>
+          </wp:inline>
+        </w:drawing>
+      </w:r>
+    </w:p>
+    <w:p>
+      <w:pPr>
+        <w:spacing w:line="480" w:before="0" w:after="0"/>
+      </w:pPr>
+    </w:p>
+    <w:p>
+      <w:pPr>
+        <w:keepNext/>
+        <w:spacing w:line="480" w:before="0" w:after="0"/>
+      </w:pPr>
+      <w:r>
+        <w:rPr>
+          <w:rFonts w:ascii="Times New Roman" w:cs="Times New Roman" w:eastAsia="Times New Roman" w:hAnsi="Times New Roman"/>
+          <w:b/>
+          <w:bCs/>
+          <w:sz w:val="24"/>
+          <w:szCs w:val="24"/>
+        </w:rPr>
+        <w:t xml:space="preserve">Figura 8</w:t>
+      </w:r>
+    </w:p>
+    <w:p>
+      <w:pPr>
+        <w:keepNext/>
+        <w:spacing w:line="480" w:before="0" w:after="0"/>
+      </w:pPr>
+      <w:r>
+        <w:rPr>
+          <w:rFonts w:ascii="Times New Roman" w:cs="Times New Roman" w:eastAsia="Times New Roman" w:hAnsi="Times New Roman"/>
+          <w:i/>
+          <w:iCs/>
+          <w:sz w:val="24"/>
+          <w:szCs w:val="24"/>
+        </w:rPr>
+        <w:t xml:space="preserve">Historial de la rama de la v3</w:t>
+      </w:r>
+    </w:p>
+    <w:p>
+      <w:pPr>
+        <w:keepNext w:val="false"/>
+        <w:spacing w:line="240" w:before="0" w:after="0"/>
+      </w:pPr>
+      <w:r>
+        <w:drawing>
+          <wp:inline distT="0" distB="0" distL="0" distR="0">
+            <wp:extent cx="5715000" cy="6696075"/>
+            <wp:effectExtent t="0" r="0" b="0" l="0"/>
+            <wp:docPr id="1" name="Historial de la rama de la v3" descr="Historial de la rama de la v3: cada commit test precede a su commit feat o fix" title="Historial de la rama de la v3"/>
+            <wp:cNvGraphicFramePr>
+              <a:graphicFrameLocks xmlns:a="http://schemas.openxmlformats.org/drawingml/2006/main" noChangeAspect="1"/>
+            </wp:cNvGraphicFramePr>
+            <a:graphic xmlns:a="http://schemas.openxmlformats.org/drawingml/2006/main">
+              <a:graphicData uri="http://schemas.openxmlformats.org/drawingml/2006/picture">
+                <pic:pic xmlns:pic="http://schemas.openxmlformats.org/drawingml/2006/picture">
+                  <pic:nvPicPr>
+                    <pic:cNvPr id="0" name="" descr=""/>
+                    <pic:cNvPicPr>
+                      <a:picLocks noChangeAspect="1" noChangeArrowheads="1"/>
+                    </pic:cNvPicPr>
+                  </pic:nvPicPr>
+                  <pic:blipFill>
+                    <a:blip r:embed="rId15" cstate="none"/>
+                    <a:srcRect/>
+                    <a:stretch>
+                      <a:fillRect/>
+                    </a:stretch>
+                  </pic:blipFill>
+                  <pic:spPr bwMode="auto">
+                    <a:xfrm>
+                      <a:off x="0" y="0"/>
+                      <a:ext cx="5715000" cy="6696075"/>
+                    </a:xfrm>
+                    <a:prstGeom prst="rect">
+                      <a:avLst/>
+                    </a:prstGeom>
+                  </pic:spPr>
+                </pic:pic>
+              </a:graphicData>
+            </a:graphic>
+          </wp:inline>
+        </w:drawing>
+      </w:r>
+    </w:p>
+    <w:p>
+      <w:pPr>
+        <w:spacing w:line="480" w:before="0" w:after="0"/>
+      </w:pPr>
     </w:p>
     <w:sectPr>
       <w:headerReference w:type="default" r:id="rId6"/>

</xml_diff>

<commit_message>
docs: agrega la guía para el docente, la hoja de ruta y la v4 en el informe
- docs/guia-docente.md: cada punto del enunciado (actividad práctica,
  herramientas, producto final, rúbrica y resultados de aprendizaje) con
  su evidencia, un recorrido de 10 minutos y las limitaciones declaradas.
- docs/hoja-de-ruta.md: pasos pendientes para la entrega, el ciclo SDD
  paso a paso para agregar una funcionalidad, próximas versiones (PWA y
  Capacitor para móvil, despliegue en la nube, roles, tiempo real),
  deuda técnica y métricas DORA.
- Informe: Docker, pruebas de punta a punta, CodeQL, advisories nuevas y
  cifras de la v4 (431 pruebas, 24 historias, 64 tareas); figura del
  pipeline de la v4.
- docs/informe/herramientas: el generador del Word ahora vive en el
  repositorio (npm run generar).
- README: enlaces a la guía y a la hoja de ruta.

Refs #34, #35

Co-Authored-By: Claude Opus 5.5 <noreply@anthropic.com>
</commit_message>
<xml_diff>
--- a/docs/informe/informe-apa7.docx
+++ b/docs/informe/informe-apa7.docx
@@ -177,9 +177,10 @@
 —control de versiones, trabajo colaborativo, desarrollo guiado por especificaciones (SDD), DevOps, inteligencia
 artificial (IA) aplicada a la programación, calidad de software y gestión de proyectos— y las aplica en un sistema
 real: TaskFlow, un gestor de tareas con Angular, una API REST en Node.js y una base de datos SQLite, construido en
-tres versiones con GitHub Spec Kit, Pull Requests y un pipeline de GitHub Actions. El análisis crítico muestra que la
-combinación de especificaciones, pruebas automatizadas e integración continua permitió entregar 19 historias de
-usuario con 415 pruebas automáticas y ninguna ejecución fallida del pipeline, pero también que las prácticas
+cuatro versiones con GitHub Spec Kit, Pull Requests y un pipeline de GitHub Actions. El análisis crítico muestra que la
+combinación de especificaciones, pruebas automatizadas e integración continua permitió entregar 24 historias de
+usuario con 431 pruebas automáticas —incluidas pruebas de punta a punta en un navegador real— y una aplicación que
+se ejecuta con un solo comando en contenedores, pero también que las prácticas
 humanas —la revisión de código y la protección de ramas— no se cumplieron durante la mayor parte del proyecto, y que
 la IA generó la mayor parte del código. El proyecto se realizó de forma individual, y la revisión se resolvió con
 IA: dos revisiones (Claude Code y GitHub Copilot) encontraron ocho errores reales y tres falsos positivos. Con esas lecciones se propone un modelo de adopción en cuatro fases, con políticas, roles y métricas, para
@@ -379,6 +380,8 @@
           <w:rFonts w:ascii="Times New Roman" w:cs="Times New Roman" w:eastAsia="Times New Roman" w:hAnsi="Times New Roman"/>
           <w:b/>
           <w:bCs/>
+          <w:i w:val="false"/>
+          <w:iCs w:val="false"/>
           <w:sz w:val="24"/>
           <w:szCs w:val="24"/>
         </w:rPr>
@@ -1988,6 +1991,8 @@
           <w:rFonts w:ascii="Times New Roman" w:cs="Times New Roman" w:eastAsia="Times New Roman" w:hAnsi="Times New Roman"/>
           <w:b/>
           <w:bCs/>
+          <w:i w:val="false"/>
+          <w:iCs w:val="false"/>
           <w:sz w:val="24"/>
           <w:szCs w:val="24"/>
         </w:rPr>
@@ -2239,6 +2244,8 @@
           <w:rFonts w:ascii="Times New Roman" w:cs="Times New Roman" w:eastAsia="Times New Roman" w:hAnsi="Times New Roman"/>
           <w:b/>
           <w:bCs/>
+          <w:i w:val="false"/>
+          <w:iCs w:val="false"/>
           <w:sz w:val="24"/>
           <w:szCs w:val="24"/>
         </w:rPr>
@@ -2633,9 +2640,9 @@
         <w:tblLayout w:type="fixed"/>
       </w:tblPr>
       <w:tblGrid>
-        <w:gridCol w:w="1833"/>
-        <w:gridCol w:w="3399"/>
-        <w:gridCol w:w="3794"/>
+        <w:gridCol w:w="1824"/>
+        <w:gridCol w:w="3439"/>
+        <w:gridCol w:w="3763"/>
       </w:tblGrid>
       <w:tr>
         <w:trPr>
@@ -2643,7 +2650,7 @@
         </w:trPr>
         <w:tc>
           <w:tcPr>
-            <w:tcW w:type="dxa" w:w="1833"/>
+            <w:tcW w:type="dxa" w:w="1824"/>
             <w:tcBorders>
               <w:top w:val="single" w:color="000000" w:sz="6"/>
               <w:left w:val="none" w:color="FFFFFF" w:sz="0"/>
@@ -2676,7 +2683,7 @@
         </w:tc>
         <w:tc>
           <w:tcPr>
-            <w:tcW w:type="dxa" w:w="3399"/>
+            <w:tcW w:type="dxa" w:w="3439"/>
             <w:tcBorders>
               <w:top w:val="single" w:color="000000" w:sz="6"/>
               <w:left w:val="none" w:color="FFFFFF" w:sz="0"/>
@@ -2709,7 +2716,7 @@
         </w:tc>
         <w:tc>
           <w:tcPr>
-            <w:tcW w:type="dxa" w:w="3794"/>
+            <w:tcW w:type="dxa" w:w="3763"/>
             <w:tcBorders>
               <w:top w:val="single" w:color="000000" w:sz="6"/>
               <w:left w:val="none" w:color="FFFFFF" w:sz="0"/>
@@ -2744,7 +2751,7 @@
       <w:tr>
         <w:tc>
           <w:tcPr>
-            <w:tcW w:type="dxa" w:w="1833"/>
+            <w:tcW w:type="dxa" w:w="1824"/>
             <w:tcBorders>
               <w:top w:val="none" w:color="FFFFFF" w:sz="0"/>
               <w:left w:val="none" w:color="FFFFFF" w:sz="0"/>
@@ -2775,7 +2782,7 @@
         </w:tc>
         <w:tc>
           <w:tcPr>
-            <w:tcW w:type="dxa" w:w="3399"/>
+            <w:tcW w:type="dxa" w:w="3439"/>
             <w:tcBorders>
               <w:top w:val="none" w:color="FFFFFF" w:sz="0"/>
               <w:left w:val="none" w:color="FFFFFF" w:sz="0"/>
@@ -2806,7 +2813,7 @@
         </w:tc>
         <w:tc>
           <w:tcPr>
-            <w:tcW w:type="dxa" w:w="3794"/>
+            <w:tcW w:type="dxa" w:w="3763"/>
             <w:tcBorders>
               <w:top w:val="none" w:color="FFFFFF" w:sz="0"/>
               <w:left w:val="none" w:color="FFFFFF" w:sz="0"/>
@@ -2839,7 +2846,7 @@
       <w:tr>
         <w:tc>
           <w:tcPr>
-            <w:tcW w:type="dxa" w:w="1833"/>
+            <w:tcW w:type="dxa" w:w="1824"/>
             <w:tcBorders>
               <w:top w:val="none" w:color="FFFFFF" w:sz="0"/>
               <w:left w:val="none" w:color="FFFFFF" w:sz="0"/>
@@ -2870,7 +2877,7 @@
         </w:tc>
         <w:tc>
           <w:tcPr>
-            <w:tcW w:type="dxa" w:w="3399"/>
+            <w:tcW w:type="dxa" w:w="3439"/>
             <w:tcBorders>
               <w:top w:val="none" w:color="FFFFFF" w:sz="0"/>
               <w:left w:val="none" w:color="FFFFFF" w:sz="0"/>
@@ -2901,7 +2908,7 @@
         </w:tc>
         <w:tc>
           <w:tcPr>
-            <w:tcW w:type="dxa" w:w="3794"/>
+            <w:tcW w:type="dxa" w:w="3763"/>
             <w:tcBorders>
               <w:top w:val="none" w:color="FFFFFF" w:sz="0"/>
               <w:left w:val="none" w:color="FFFFFF" w:sz="0"/>
@@ -2934,7 +2941,7 @@
       <w:tr>
         <w:tc>
           <w:tcPr>
-            <w:tcW w:type="dxa" w:w="1833"/>
+            <w:tcW w:type="dxa" w:w="1824"/>
             <w:tcBorders>
               <w:top w:val="none" w:color="FFFFFF" w:sz="0"/>
               <w:left w:val="none" w:color="FFFFFF" w:sz="0"/>
@@ -2965,7 +2972,7 @@
         </w:tc>
         <w:tc>
           <w:tcPr>
-            <w:tcW w:type="dxa" w:w="3399"/>
+            <w:tcW w:type="dxa" w:w="3439"/>
             <w:tcBorders>
               <w:top w:val="none" w:color="FFFFFF" w:sz="0"/>
               <w:left w:val="none" w:color="FFFFFF" w:sz="0"/>
@@ -2996,7 +3003,7 @@
         </w:tc>
         <w:tc>
           <w:tcPr>
-            <w:tcW w:type="dxa" w:w="3794"/>
+            <w:tcW w:type="dxa" w:w="3763"/>
             <w:tcBorders>
               <w:top w:val="none" w:color="FFFFFF" w:sz="0"/>
               <w:left w:val="none" w:color="FFFFFF" w:sz="0"/>
@@ -3029,7 +3036,7 @@
       <w:tr>
         <w:tc>
           <w:tcPr>
-            <w:tcW w:type="dxa" w:w="1833"/>
+            <w:tcW w:type="dxa" w:w="1824"/>
             <w:tcBorders>
               <w:top w:val="none" w:color="FFFFFF" w:sz="0"/>
               <w:left w:val="none" w:color="FFFFFF" w:sz="0"/>
@@ -3060,7 +3067,7 @@
         </w:tc>
         <w:tc>
           <w:tcPr>
-            <w:tcW w:type="dxa" w:w="3399"/>
+            <w:tcW w:type="dxa" w:w="3439"/>
             <w:tcBorders>
               <w:top w:val="none" w:color="FFFFFF" w:sz="0"/>
               <w:left w:val="none" w:color="FFFFFF" w:sz="0"/>
@@ -3091,7 +3098,7 @@
         </w:tc>
         <w:tc>
           <w:tcPr>
-            <w:tcW w:type="dxa" w:w="3794"/>
+            <w:tcW w:type="dxa" w:w="3763"/>
             <w:tcBorders>
               <w:top w:val="none" w:color="FFFFFF" w:sz="0"/>
               <w:left w:val="none" w:color="FFFFFF" w:sz="0"/>
@@ -3124,42 +3131,42 @@
       <w:tr>
         <w:tc>
           <w:tcPr>
-            <w:tcW w:type="dxa" w:w="1833"/>
-            <w:tcBorders>
-              <w:top w:val="none" w:color="FFFFFF" w:sz="0"/>
-              <w:left w:val="none" w:color="FFFFFF" w:sz="0"/>
-              <w:bottom w:val="single" w:color="000000" w:sz="6"/>
-              <w:right w:val="none" w:color="FFFFFF" w:sz="0"/>
-            </w:tcBorders>
-            <w:shd w:fill="FFFFFF" w:val="clear"/>
-            <w:tcMar>
-              <w:top w:type="dxa" w:w="60"/>
-              <w:left w:type="dxa" w:w="90"/>
-              <w:bottom w:type="dxa" w:w="60"/>
-              <w:right w:type="dxa" w:w="90"/>
-            </w:tcMar>
-          </w:tcPr>
-          <w:p>
-            <w:pPr>
-              <w:spacing w:line="240" w:before="0" w:after="0"/>
-            </w:pPr>
-            <w:r>
-              <w:rPr>
-                <w:rFonts w:ascii="Times New Roman" w:cs="Times New Roman" w:eastAsia="Times New Roman" w:hAnsi="Times New Roman"/>
-                <w:sz w:val="24"/>
-                <w:szCs w:val="24"/>
-              </w:rPr>
-              <w:t xml:space="preserve">Planes y tareas</w:t>
-            </w:r>
-          </w:p>
-        </w:tc>
-        <w:tc>
-          <w:tcPr>
-            <w:tcW w:type="dxa" w:w="3399"/>
-            <w:tcBorders>
-              <w:top w:val="none" w:color="FFFFFF" w:sz="0"/>
-              <w:left w:val="none" w:color="FFFFFF" w:sz="0"/>
-              <w:bottom w:val="single" w:color="000000" w:sz="6"/>
+            <w:tcW w:type="dxa" w:w="1824"/>
+            <w:tcBorders>
+              <w:top w:val="none" w:color="FFFFFF" w:sz="0"/>
+              <w:left w:val="none" w:color="FFFFFF" w:sz="0"/>
+              <w:bottom w:val="none" w:color="FFFFFF" w:sz="0"/>
+              <w:right w:val="none" w:color="FFFFFF" w:sz="0"/>
+            </w:tcBorders>
+            <w:shd w:fill="FFFFFF" w:val="clear"/>
+            <w:tcMar>
+              <w:top w:type="dxa" w:w="60"/>
+              <w:left w:type="dxa" w:w="90"/>
+              <w:bottom w:type="dxa" w:w="60"/>
+              <w:right w:type="dxa" w:w="90"/>
+            </w:tcMar>
+          </w:tcPr>
+          <w:p>
+            <w:pPr>
+              <w:spacing w:line="240" w:before="0" w:after="0"/>
+            </w:pPr>
+            <w:r>
+              <w:rPr>
+                <w:rFonts w:ascii="Times New Roman" w:cs="Times New Roman" w:eastAsia="Times New Roman" w:hAnsi="Times New Roman"/>
+                <w:sz w:val="24"/>
+                <w:szCs w:val="24"/>
+              </w:rPr>
+              <w:t xml:space="preserve">Especificación v4</w:t>
+            </w:r>
+          </w:p>
+        </w:tc>
+        <w:tc>
+          <w:tcPr>
+            <w:tcW w:type="dxa" w:w="3439"/>
+            <w:tcBorders>
+              <w:top w:val="none" w:color="FFFFFF" w:sz="0"/>
+              <w:left w:val="none" w:color="FFFFFF" w:sz="0"/>
+              <w:bottom w:val="none" w:color="FFFFFF" w:sz="0"/>
               <w:right w:val="none" w:color="FFFFFF" w:sz="0"/>
             </w:tcBorders>
             <w:shd w:fill="FFFFFF" w:val="clear"/>
@@ -3180,22 +3187,117 @@
                 <w:sz w:val="22"/>
                 <w:szCs w:val="22"/>
               </w:rPr>
-              <w:t xml:space="preserve">plan.md</w:t>
-            </w:r>
-            <w:r>
-              <w:rPr>
-                <w:rFonts w:ascii="Times New Roman" w:cs="Times New Roman" w:eastAsia="Times New Roman" w:hAnsi="Times New Roman"/>
-                <w:sz w:val="24"/>
-                <w:szCs w:val="24"/>
-              </w:rPr>
-              <w:t xml:space="preserve"> y </w:t>
-            </w:r>
+              <w:t xml:space="preserve">specs/004-calidad-despliegue/spec.md</w:t>
+            </w:r>
+          </w:p>
+        </w:tc>
+        <w:tc>
+          <w:tcPr>
+            <w:tcW w:type="dxa" w:w="3763"/>
+            <w:tcBorders>
+              <w:top w:val="none" w:color="FFFFFF" w:sz="0"/>
+              <w:left w:val="none" w:color="FFFFFF" w:sz="0"/>
+              <w:bottom w:val="none" w:color="FFFFFF" w:sz="0"/>
+              <w:right w:val="none" w:color="FFFFFF" w:sz="0"/>
+            </w:tcBorders>
+            <w:shd w:fill="FFFFFF" w:val="clear"/>
+            <w:tcMar>
+              <w:top w:type="dxa" w:w="60"/>
+              <w:left w:type="dxa" w:w="90"/>
+              <w:bottom w:type="dxa" w:w="60"/>
+              <w:right w:type="dxa" w:w="90"/>
+            </w:tcMar>
+          </w:tcPr>
+          <w:p>
+            <w:pPr>
+              <w:spacing w:line="240" w:before="0" w:after="0"/>
+            </w:pPr>
+            <w:r>
+              <w:rPr>
+                <w:rFonts w:ascii="Times New Roman" w:cs="Times New Roman" w:eastAsia="Times New Roman" w:hAnsi="Times New Roman"/>
+                <w:sz w:val="24"/>
+                <w:szCs w:val="24"/>
+              </w:rPr>
+              <w:t xml:space="preserve">5 historias (Docker, pruebas de punta a punta, puertas de calidad, versiones automáticas, configuración por entorno), RF-025 a RF-032</w:t>
+            </w:r>
+          </w:p>
+        </w:tc>
+      </w:tr>
+      <w:tr>
+        <w:tc>
+          <w:tcPr>
+            <w:tcW w:type="dxa" w:w="1824"/>
+            <w:tcBorders>
+              <w:top w:val="none" w:color="FFFFFF" w:sz="0"/>
+              <w:left w:val="none" w:color="FFFFFF" w:sz="0"/>
+              <w:bottom w:val="single" w:color="000000" w:sz="6"/>
+              <w:right w:val="none" w:color="FFFFFF" w:sz="0"/>
+            </w:tcBorders>
+            <w:shd w:fill="FFFFFF" w:val="clear"/>
+            <w:tcMar>
+              <w:top w:type="dxa" w:w="60"/>
+              <w:left w:type="dxa" w:w="90"/>
+              <w:bottom w:type="dxa" w:w="60"/>
+              <w:right w:type="dxa" w:w="90"/>
+            </w:tcMar>
+          </w:tcPr>
+          <w:p>
+            <w:pPr>
+              <w:spacing w:line="240" w:before="0" w:after="0"/>
+            </w:pPr>
+            <w:r>
+              <w:rPr>
+                <w:rFonts w:ascii="Times New Roman" w:cs="Times New Roman" w:eastAsia="Times New Roman" w:hAnsi="Times New Roman"/>
+                <w:sz w:val="24"/>
+                <w:szCs w:val="24"/>
+              </w:rPr>
+              <w:t xml:space="preserve">Planes y tareas</w:t>
+            </w:r>
+          </w:p>
+        </w:tc>
+        <w:tc>
+          <w:tcPr>
+            <w:tcW w:type="dxa" w:w="3439"/>
+            <w:tcBorders>
+              <w:top w:val="none" w:color="FFFFFF" w:sz="0"/>
+              <w:left w:val="none" w:color="FFFFFF" w:sz="0"/>
+              <w:bottom w:val="single" w:color="000000" w:sz="6"/>
+              <w:right w:val="none" w:color="FFFFFF" w:sz="0"/>
+            </w:tcBorders>
+            <w:shd w:fill="FFFFFF" w:val="clear"/>
+            <w:tcMar>
+              <w:top w:type="dxa" w:w="60"/>
+              <w:left w:type="dxa" w:w="90"/>
+              <w:bottom w:type="dxa" w:w="60"/>
+              <w:right w:type="dxa" w:w="90"/>
+            </w:tcMar>
+          </w:tcPr>
+          <w:p>
+            <w:pPr>
+              <w:spacing w:line="240" w:before="0" w:after="0"/>
+            </w:pPr>
             <w:r>
               <w:rPr>
                 <w:rFonts w:ascii="Courier New" w:cs="Courier New" w:eastAsia="Courier New" w:hAnsi="Courier New"/>
                 <w:sz w:val="22"/>
                 <w:szCs w:val="22"/>
               </w:rPr>
+              <w:t xml:space="preserve">plan.md</w:t>
+            </w:r>
+            <w:r>
+              <w:rPr>
+                <w:rFonts w:ascii="Times New Roman" w:cs="Times New Roman" w:eastAsia="Times New Roman" w:hAnsi="Times New Roman"/>
+                <w:sz w:val="24"/>
+                <w:szCs w:val="24"/>
+              </w:rPr>
+              <w:t xml:space="preserve"> y </w:t>
+            </w:r>
+            <w:r>
+              <w:rPr>
+                <w:rFonts w:ascii="Courier New" w:cs="Courier New" w:eastAsia="Courier New" w:hAnsi="Courier New"/>
+                <w:sz w:val="22"/>
+                <w:szCs w:val="22"/>
+              </w:rPr>
               <w:t xml:space="preserve">tasks.md</w:t>
             </w:r>
             <w:r>
@@ -3210,7 +3312,7 @@
         </w:tc>
         <w:tc>
           <w:tcPr>
-            <w:tcW w:type="dxa" w:w="3794"/>
+            <w:tcW w:type="dxa" w:w="3763"/>
             <w:tcBorders>
               <w:top w:val="none" w:color="FFFFFF" w:sz="0"/>
               <w:left w:val="none" w:color="FFFFFF" w:sz="0"/>
@@ -3235,7 +3337,7 @@
                 <w:sz w:val="24"/>
                 <w:szCs w:val="24"/>
               </w:rPr>
-              <w:t xml:space="preserve">52 tareas (T001 a T052), cada fase en su rama y su PR</w:t>
+              <w:t xml:space="preserve">64 tareas (T001 a T064), cada fase en su rama y su PR</w:t>
             </w:r>
           </w:p>
         </w:tc>
@@ -3288,6 +3390,8 @@
           <w:rFonts w:ascii="Times New Roman" w:cs="Times New Roman" w:eastAsia="Times New Roman" w:hAnsi="Times New Roman"/>
           <w:b/>
           <w:bCs/>
+          <w:i w:val="false"/>
+          <w:iCs w:val="false"/>
           <w:sz w:val="24"/>
           <w:szCs w:val="24"/>
         </w:rPr>
@@ -3465,7 +3569,7 @@
           <w:sz w:val="24"/>
           <w:szCs w:val="24"/>
         </w:rPr>
-        <w:t xml:space="preserve">El archivo </w:t>
+        <w:t xml:space="preserve">El pipeline creció con cada versión. En la v4, </w:t>
       </w:r>
       <w:r>
         <w:rPr>
@@ -3481,7 +3585,26 @@
           <w:sz w:val="24"/>
           <w:szCs w:val="24"/>
         </w:rPr>
-        <w:t xml:space="preserve"> define tres trabajos:</w:t>
+        <w:t xml:space="preserve"> define cinco trabajos y otros dos
+</w:t>
+      </w:r>
+      <w:r>
+        <w:rPr>
+          <w:rFonts w:ascii="Times New Roman" w:cs="Times New Roman" w:eastAsia="Times New Roman" w:hAnsi="Times New Roman"/>
+          <w:i/>
+          <w:iCs/>
+          <w:sz w:val="24"/>
+          <w:szCs w:val="24"/>
+        </w:rPr>
+        <w:t xml:space="preserve">workflows</w:t>
+      </w:r>
+      <w:r>
+        <w:rPr>
+          <w:rFonts w:ascii="Times New Roman" w:cs="Times New Roman" w:eastAsia="Times New Roman" w:hAnsi="Times New Roman"/>
+          <w:sz w:val="24"/>
+          <w:szCs w:val="24"/>
+        </w:rPr>
+        <w:t xml:space="preserve"> completan el ciclo:</w:t>
       </w:r>
     </w:p>
     <w:p>
@@ -3530,9 +3653,9 @@
         <w:tblLayout w:type="fixed"/>
       </w:tblPr>
       <w:tblGrid>
-        <w:gridCol w:w="787"/>
-        <w:gridCol w:w="4426"/>
-        <w:gridCol w:w="3813"/>
+        <w:gridCol w:w="1287"/>
+        <w:gridCol w:w="4983"/>
+        <w:gridCol w:w="2756"/>
       </w:tblGrid>
       <w:tr>
         <w:trPr>
@@ -3540,7 +3663,7 @@
         </w:trPr>
         <w:tc>
           <w:tcPr>
-            <w:tcW w:type="dxa" w:w="787"/>
+            <w:tcW w:type="dxa" w:w="1287"/>
             <w:tcBorders>
               <w:top w:val="single" w:color="000000" w:sz="6"/>
               <w:left w:val="none" w:color="FFFFFF" w:sz="0"/>
@@ -3567,13 +3690,13 @@
                 <w:sz w:val="24"/>
                 <w:szCs w:val="24"/>
               </w:rPr>
-              <w:t xml:space="preserve">Job</w:t>
-            </w:r>
-          </w:p>
-        </w:tc>
-        <w:tc>
-          <w:tcPr>
-            <w:tcW w:type="dxa" w:w="4426"/>
+              <w:t xml:space="preserve">Job o workflow</w:t>
+            </w:r>
+          </w:p>
+        </w:tc>
+        <w:tc>
+          <w:tcPr>
+            <w:tcW w:type="dxa" w:w="4983"/>
             <w:tcBorders>
               <w:top w:val="single" w:color="000000" w:sz="6"/>
               <w:left w:val="none" w:color="FFFFFF" w:sz="0"/>
@@ -3606,7 +3729,7 @@
         </w:tc>
         <w:tc>
           <w:tcPr>
-            <w:tcW w:type="dxa" w:w="3813"/>
+            <w:tcW w:type="dxa" w:w="2756"/>
             <w:tcBorders>
               <w:top w:val="single" w:color="000000" w:sz="6"/>
               <w:left w:val="none" w:color="FFFFFF" w:sz="0"/>
@@ -3641,7 +3764,7 @@
       <w:tr>
         <w:tc>
           <w:tcPr>
-            <w:tcW w:type="dxa" w:w="787"/>
+            <w:tcW w:type="dxa" w:w="1287"/>
             <w:tcBorders>
               <w:top w:val="none" w:color="FFFFFF" w:sz="0"/>
               <w:left w:val="none" w:color="FFFFFF" w:sz="0"/>
@@ -3672,7 +3795,7 @@
         </w:tc>
         <w:tc>
           <w:tcPr>
-            <w:tcW w:type="dxa" w:w="4426"/>
+            <w:tcW w:type="dxa" w:w="4983"/>
             <w:tcBorders>
               <w:top w:val="none" w:color="FFFFFF" w:sz="0"/>
               <w:left w:val="none" w:color="FFFFFF" w:sz="0"/>
@@ -3705,7 +3828,38 @@
                 <w:sz w:val="24"/>
                 <w:szCs w:val="24"/>
               </w:rPr>
-              <w:t xml:space="preserve"> → </w:t>
+              <w:t xml:space="preserve"> → pruebas con Jest y Supertest, con cobertura mínima del 95 % de las líneas</w:t>
+            </w:r>
+          </w:p>
+        </w:tc>
+        <w:tc>
+          <w:tcPr>
+            <w:tcW w:type="dxa" w:w="2756"/>
+            <w:tcBorders>
+              <w:top w:val="none" w:color="FFFFFF" w:sz="0"/>
+              <w:left w:val="none" w:color="FFFFFF" w:sz="0"/>
+              <w:bottom w:val="none" w:color="FFFFFF" w:sz="0"/>
+              <w:right w:val="none" w:color="FFFFFF" w:sz="0"/>
+            </w:tcBorders>
+            <w:shd w:fill="FFFFFF" w:val="clear"/>
+            <w:tcMar>
+              <w:top w:type="dxa" w:w="60"/>
+              <w:left w:type="dxa" w:w="90"/>
+              <w:bottom w:type="dxa" w:w="60"/>
+              <w:right w:type="dxa" w:w="90"/>
+            </w:tcMar>
+          </w:tcPr>
+          <w:p>
+            <w:pPr>
+              <w:spacing w:line="240" w:before="0" w:after="0"/>
+            </w:pPr>
+            <w:r>
+              <w:rPr>
+                <w:rFonts w:ascii="Times New Roman" w:cs="Times New Roman" w:eastAsia="Times New Roman" w:hAnsi="Times New Roman"/>
+                <w:sz w:val="24"/>
+                <w:szCs w:val="24"/>
+              </w:rPr>
+              <w:t xml:space="preserve">En cada </w:t>
             </w:r>
             <w:r>
               <w:rPr>
@@ -3713,46 +3867,15 @@
                 <w:sz w:val="22"/>
                 <w:szCs w:val="22"/>
               </w:rPr>
-              <w:t xml:space="preserve">npm test</w:t>
-            </w:r>
-            <w:r>
-              <w:rPr>
-                <w:rFonts w:ascii="Times New Roman" w:cs="Times New Roman" w:eastAsia="Times New Roman" w:hAnsi="Times New Roman"/>
-                <w:sz w:val="24"/>
-                <w:szCs w:val="24"/>
-              </w:rPr>
-              <w:t xml:space="preserve"> (Jest + Supertest)</w:t>
-            </w:r>
-          </w:p>
-        </w:tc>
-        <w:tc>
-          <w:tcPr>
-            <w:tcW w:type="dxa" w:w="3813"/>
-            <w:tcBorders>
-              <w:top w:val="none" w:color="FFFFFF" w:sz="0"/>
-              <w:left w:val="none" w:color="FFFFFF" w:sz="0"/>
-              <w:bottom w:val="none" w:color="FFFFFF" w:sz="0"/>
-              <w:right w:val="none" w:color="FFFFFF" w:sz="0"/>
-            </w:tcBorders>
-            <w:shd w:fill="FFFFFF" w:val="clear"/>
-            <w:tcMar>
-              <w:top w:type="dxa" w:w="60"/>
-              <w:left w:type="dxa" w:w="90"/>
-              <w:bottom w:type="dxa" w:w="60"/>
-              <w:right w:type="dxa" w:w="90"/>
-            </w:tcMar>
-          </w:tcPr>
-          <w:p>
-            <w:pPr>
-              <w:spacing w:line="240" w:before="0" w:after="0"/>
-            </w:pPr>
-            <w:r>
-              <w:rPr>
-                <w:rFonts w:ascii="Times New Roman" w:cs="Times New Roman" w:eastAsia="Times New Roman" w:hAnsi="Times New Roman"/>
-                <w:sz w:val="24"/>
-                <w:szCs w:val="24"/>
-              </w:rPr>
-              <w:t xml:space="preserve">En cada </w:t>
+              <w:t xml:space="preserve">push</w:t>
+            </w:r>
+            <w:r>
+              <w:rPr>
+                <w:rFonts w:ascii="Times New Roman" w:cs="Times New Roman" w:eastAsia="Times New Roman" w:hAnsi="Times New Roman"/>
+                <w:sz w:val="24"/>
+                <w:szCs w:val="24"/>
+              </w:rPr>
+              <w:t xml:space="preserve"> y PR hacia </w:t>
             </w:r>
             <w:r>
               <w:rPr>
@@ -3760,15 +3883,15 @@
                 <w:sz w:val="22"/>
                 <w:szCs w:val="22"/>
               </w:rPr>
-              <w:t xml:space="preserve">push</w:t>
-            </w:r>
-            <w:r>
-              <w:rPr>
-                <w:rFonts w:ascii="Times New Roman" w:cs="Times New Roman" w:eastAsia="Times New Roman" w:hAnsi="Times New Roman"/>
-                <w:sz w:val="24"/>
-                <w:szCs w:val="24"/>
-              </w:rPr>
-              <w:t xml:space="preserve"> y PR hacia </w:t>
+              <w:t xml:space="preserve">main</w:t>
+            </w:r>
+            <w:r>
+              <w:rPr>
+                <w:rFonts w:ascii="Times New Roman" w:cs="Times New Roman" w:eastAsia="Times New Roman" w:hAnsi="Times New Roman"/>
+                <w:sz w:val="24"/>
+                <w:szCs w:val="24"/>
+              </w:rPr>
+              <w:t xml:space="preserve"> o </w:t>
             </w:r>
             <w:r>
               <w:rPr>
@@ -3776,31 +3899,46 @@
                 <w:sz w:val="22"/>
                 <w:szCs w:val="22"/>
               </w:rPr>
-              <w:t xml:space="preserve">main</w:t>
-            </w:r>
-            <w:r>
-              <w:rPr>
-                <w:rFonts w:ascii="Times New Roman" w:cs="Times New Roman" w:eastAsia="Times New Roman" w:hAnsi="Times New Roman"/>
-                <w:sz w:val="24"/>
-                <w:szCs w:val="24"/>
-              </w:rPr>
-              <w:t xml:space="preserve"> o </w:t>
-            </w:r>
+              <w:t xml:space="preserve">develop</w:t>
+            </w:r>
+          </w:p>
+        </w:tc>
+      </w:tr>
+      <w:tr>
+        <w:tc>
+          <w:tcPr>
+            <w:tcW w:type="dxa" w:w="1287"/>
+            <w:tcBorders>
+              <w:top w:val="none" w:color="FFFFFF" w:sz="0"/>
+              <w:left w:val="none" w:color="FFFFFF" w:sz="0"/>
+              <w:bottom w:val="none" w:color="FFFFFF" w:sz="0"/>
+              <w:right w:val="none" w:color="FFFFFF" w:sz="0"/>
+            </w:tcBorders>
+            <w:shd w:fill="FFFFFF" w:val="clear"/>
+            <w:tcMar>
+              <w:top w:type="dxa" w:w="60"/>
+              <w:left w:type="dxa" w:w="90"/>
+              <w:bottom w:type="dxa" w:w="60"/>
+              <w:right w:type="dxa" w:w="90"/>
+            </w:tcMar>
+          </w:tcPr>
+          <w:p>
+            <w:pPr>
+              <w:spacing w:line="240" w:before="0" w:after="0"/>
+            </w:pPr>
             <w:r>
               <w:rPr>
                 <w:rFonts w:ascii="Courier New" w:cs="Courier New" w:eastAsia="Courier New" w:hAnsi="Courier New"/>
                 <w:sz w:val="22"/>
                 <w:szCs w:val="22"/>
               </w:rPr>
-              <w:t xml:space="preserve">develop</w:t>
-            </w:r>
-          </w:p>
-        </w:tc>
-      </w:tr>
-      <w:tr>
-        <w:tc>
-          <w:tcPr>
-            <w:tcW w:type="dxa" w:w="787"/>
+              <w:t xml:space="preserve">frontend</w:t>
+            </w:r>
+          </w:p>
+        </w:tc>
+        <w:tc>
+          <w:tcPr>
+            <w:tcW w:type="dxa" w:w="4983"/>
             <w:tcBorders>
               <w:top w:val="none" w:color="FFFFFF" w:sz="0"/>
               <w:left w:val="none" w:color="FFFFFF" w:sz="0"/>
@@ -3825,38 +3963,23 @@
                 <w:sz w:val="22"/>
                 <w:szCs w:val="22"/>
               </w:rPr>
-              <w:t xml:space="preserve">frontend</w:t>
-            </w:r>
-          </w:p>
-        </w:tc>
-        <w:tc>
-          <w:tcPr>
-            <w:tcW w:type="dxa" w:w="4426"/>
-            <w:tcBorders>
-              <w:top w:val="none" w:color="FFFFFF" w:sz="0"/>
-              <w:left w:val="none" w:color="FFFFFF" w:sz="0"/>
-              <w:bottom w:val="none" w:color="FFFFFF" w:sz="0"/>
-              <w:right w:val="none" w:color="FFFFFF" w:sz="0"/>
-            </w:tcBorders>
-            <w:shd w:fill="FFFFFF" w:val="clear"/>
-            <w:tcMar>
-              <w:top w:type="dxa" w:w="60"/>
-              <w:left w:type="dxa" w:w="90"/>
-              <w:bottom w:type="dxa" w:w="60"/>
-              <w:right w:type="dxa" w:w="90"/>
-            </w:tcMar>
-          </w:tcPr>
-          <w:p>
-            <w:pPr>
-              <w:spacing w:line="240" w:before="0" w:after="0"/>
-            </w:pPr>
+              <w:t xml:space="preserve">npm ci</w:t>
+            </w:r>
+            <w:r>
+              <w:rPr>
+                <w:rFonts w:ascii="Times New Roman" w:cs="Times New Roman" w:eastAsia="Times New Roman" w:hAnsi="Times New Roman"/>
+                <w:sz w:val="24"/>
+                <w:szCs w:val="24"/>
+              </w:rPr>
+              <w:t xml:space="preserve"> → </w:t>
+            </w:r>
             <w:r>
               <w:rPr>
                 <w:rFonts w:ascii="Courier New" w:cs="Courier New" w:eastAsia="Courier New" w:hAnsi="Courier New"/>
                 <w:sz w:val="22"/>
                 <w:szCs w:val="22"/>
               </w:rPr>
-              <w:t xml:space="preserve">npm ci</w:t>
+              <w:t xml:space="preserve">ng build</w:t>
             </w:r>
             <w:r>
               <w:rPr>
@@ -3872,37 +3995,116 @@
                 <w:sz w:val="22"/>
                 <w:szCs w:val="22"/>
               </w:rPr>
-              <w:t xml:space="preserve">ng build</w:t>
-            </w:r>
-            <w:r>
-              <w:rPr>
-                <w:rFonts w:ascii="Times New Roman" w:cs="Times New Roman" w:eastAsia="Times New Roman" w:hAnsi="Times New Roman"/>
-                <w:sz w:val="24"/>
-                <w:szCs w:val="24"/>
-              </w:rPr>
-              <w:t xml:space="preserve"> → </w:t>
-            </w:r>
+              <w:t xml:space="preserve">ng test</w:t>
+            </w:r>
+            <w:r>
+              <w:rPr>
+                <w:rFonts w:ascii="Times New Roman" w:cs="Times New Roman" w:eastAsia="Times New Roman" w:hAnsi="Times New Roman"/>
+                <w:sz w:val="24"/>
+                <w:szCs w:val="24"/>
+              </w:rPr>
+              <w:t xml:space="preserve"> (Vitest)</w:t>
+            </w:r>
+          </w:p>
+        </w:tc>
+        <w:tc>
+          <w:tcPr>
+            <w:tcW w:type="dxa" w:w="2756"/>
+            <w:tcBorders>
+              <w:top w:val="none" w:color="FFFFFF" w:sz="0"/>
+              <w:left w:val="none" w:color="FFFFFF" w:sz="0"/>
+              <w:bottom w:val="none" w:color="FFFFFF" w:sz="0"/>
+              <w:right w:val="none" w:color="FFFFFF" w:sz="0"/>
+            </w:tcBorders>
+            <w:shd w:fill="FFFFFF" w:val="clear"/>
+            <w:tcMar>
+              <w:top w:type="dxa" w:w="60"/>
+              <w:left w:type="dxa" w:w="90"/>
+              <w:bottom w:type="dxa" w:w="60"/>
+              <w:right w:type="dxa" w:w="90"/>
+            </w:tcMar>
+          </w:tcPr>
+          <w:p>
+            <w:pPr>
+              <w:spacing w:line="240" w:before="0" w:after="0"/>
+            </w:pPr>
+            <w:r>
+              <w:rPr>
+                <w:rFonts w:ascii="Times New Roman" w:cs="Times New Roman" w:eastAsia="Times New Roman" w:hAnsi="Times New Roman"/>
+                <w:sz w:val="24"/>
+                <w:szCs w:val="24"/>
+              </w:rPr>
+              <w:t xml:space="preserve">Igual</w:t>
+            </w:r>
+          </w:p>
+        </w:tc>
+      </w:tr>
+      <w:tr>
+        <w:tc>
+          <w:tcPr>
+            <w:tcW w:type="dxa" w:w="1287"/>
+            <w:tcBorders>
+              <w:top w:val="none" w:color="FFFFFF" w:sz="0"/>
+              <w:left w:val="none" w:color="FFFFFF" w:sz="0"/>
+              <w:bottom w:val="none" w:color="FFFFFF" w:sz="0"/>
+              <w:right w:val="none" w:color="FFFFFF" w:sz="0"/>
+            </w:tcBorders>
+            <w:shd w:fill="FFFFFF" w:val="clear"/>
+            <w:tcMar>
+              <w:top w:type="dxa" w:w="60"/>
+              <w:left w:type="dxa" w:w="90"/>
+              <w:bottom w:type="dxa" w:w="60"/>
+              <w:right w:type="dxa" w:w="90"/>
+            </w:tcMar>
+          </w:tcPr>
+          <w:p>
+            <w:pPr>
+              <w:spacing w:line="240" w:before="0" w:after="0"/>
+            </w:pPr>
             <w:r>
               <w:rPr>
                 <w:rFonts w:ascii="Courier New" w:cs="Courier New" w:eastAsia="Courier New" w:hAnsi="Courier New"/>
                 <w:sz w:val="22"/>
                 <w:szCs w:val="22"/>
               </w:rPr>
-              <w:t xml:space="preserve">ng test</w:t>
-            </w:r>
-            <w:r>
-              <w:rPr>
-                <w:rFonts w:ascii="Times New Roman" w:cs="Times New Roman" w:eastAsia="Times New Roman" w:hAnsi="Times New Roman"/>
-                <w:sz w:val="24"/>
-                <w:szCs w:val="24"/>
-              </w:rPr>
-              <w:t xml:space="preserve"> (Vitest)</w:t>
-            </w:r>
-          </w:p>
-        </w:tc>
-        <w:tc>
-          <w:tcPr>
-            <w:tcW w:type="dxa" w:w="3813"/>
+              <w:t xml:space="preserve">e2e</w:t>
+            </w:r>
+          </w:p>
+        </w:tc>
+        <w:tc>
+          <w:tcPr>
+            <w:tcW w:type="dxa" w:w="4983"/>
+            <w:tcBorders>
+              <w:top w:val="none" w:color="FFFFFF" w:sz="0"/>
+              <w:left w:val="none" w:color="FFFFFF" w:sz="0"/>
+              <w:bottom w:val="none" w:color="FFFFFF" w:sz="0"/>
+              <w:right w:val="none" w:color="FFFFFF" w:sz="0"/>
+            </w:tcBorders>
+            <w:shd w:fill="FFFFFF" w:val="clear"/>
+            <w:tcMar>
+              <w:top w:type="dxa" w:w="60"/>
+              <w:left w:type="dxa" w:w="90"/>
+              <w:bottom w:type="dxa" w:w="60"/>
+              <w:right w:type="dxa" w:w="90"/>
+            </w:tcMar>
+          </w:tcPr>
+          <w:p>
+            <w:pPr>
+              <w:spacing w:line="240" w:before="0" w:after="0"/>
+            </w:pPr>
+            <w:r>
+              <w:rPr>
+                <w:rFonts w:ascii="Times New Roman" w:cs="Times New Roman" w:eastAsia="Times New Roman" w:hAnsi="Times New Roman"/>
+                <w:sz w:val="24"/>
+                <w:szCs w:val="24"/>
+              </w:rPr>
+              <w:t xml:space="preserve">Levanta la API y el frontend y un navegador Chromium recorre la aplicación (Playwright)</w:t>
+            </w:r>
+          </w:p>
+        </w:tc>
+        <w:tc>
+          <w:tcPr>
+            <w:tcW w:type="dxa" w:w="2756"/>
             <w:tcBorders>
               <w:top w:val="none" w:color="FFFFFF" w:sz="0"/>
               <w:left w:val="none" w:color="FFFFFF" w:sz="0"/>
@@ -3935,11 +4137,11 @@
       <w:tr>
         <w:tc>
           <w:tcPr>
-            <w:tcW w:type="dxa" w:w="787"/>
-            <w:tcBorders>
-              <w:top w:val="none" w:color="FFFFFF" w:sz="0"/>
-              <w:left w:val="none" w:color="FFFFFF" w:sz="0"/>
-              <w:bottom w:val="single" w:color="000000" w:sz="6"/>
+            <w:tcW w:type="dxa" w:w="1287"/>
+            <w:tcBorders>
+              <w:top w:val="none" w:color="FFFFFF" w:sz="0"/>
+              <w:left w:val="none" w:color="FFFFFF" w:sz="0"/>
+              <w:bottom w:val="none" w:color="FFFFFF" w:sz="0"/>
               <w:right w:val="none" w:color="FFFFFF" w:sz="0"/>
             </w:tcBorders>
             <w:shd w:fill="FFFFFF" w:val="clear"/>
@@ -3960,56 +4162,143 @@
                 <w:sz w:val="22"/>
                 <w:szCs w:val="22"/>
               </w:rPr>
-              <w:t xml:space="preserve">deploy</w:t>
-            </w:r>
-          </w:p>
-        </w:tc>
-        <w:tc>
-          <w:tcPr>
-            <w:tcW w:type="dxa" w:w="4426"/>
-            <w:tcBorders>
-              <w:top w:val="none" w:color="FFFFFF" w:sz="0"/>
-              <w:left w:val="none" w:color="FFFFFF" w:sz="0"/>
-              <w:bottom w:val="single" w:color="000000" w:sz="6"/>
-              <w:right w:val="none" w:color="FFFFFF" w:sz="0"/>
-            </w:tcBorders>
-            <w:shd w:fill="FFFFFF" w:val="clear"/>
-            <w:tcMar>
-              <w:top w:type="dxa" w:w="60"/>
-              <w:left w:type="dxa" w:w="90"/>
-              <w:bottom w:type="dxa" w:w="60"/>
-              <w:right w:type="dxa" w:w="90"/>
-            </w:tcMar>
-          </w:tcPr>
-          <w:p>
-            <w:pPr>
-              <w:spacing w:line="240" w:before="0" w:after="0"/>
-            </w:pPr>
-            <w:r>
-              <w:rPr>
-                <w:rFonts w:ascii="Times New Roman" w:cs="Times New Roman" w:eastAsia="Times New Roman" w:hAnsi="Times New Roman"/>
-                <w:sz w:val="24"/>
-                <w:szCs w:val="24"/>
-              </w:rPr>
-              <w:t xml:space="preserve">Compila el frontend y lo publica como artefacto descargable </w:t>
-            </w:r>
+              <w:t xml:space="preserve">docker</w:t>
+            </w:r>
+          </w:p>
+        </w:tc>
+        <w:tc>
+          <w:tcPr>
+            <w:tcW w:type="dxa" w:w="4983"/>
+            <w:tcBorders>
+              <w:top w:val="none" w:color="FFFFFF" w:sz="0"/>
+              <w:left w:val="none" w:color="FFFFFF" w:sz="0"/>
+              <w:bottom w:val="none" w:color="FFFFFF" w:sz="0"/>
+              <w:right w:val="none" w:color="FFFFFF" w:sz="0"/>
+            </w:tcBorders>
+            <w:shd w:fill="FFFFFF" w:val="clear"/>
+            <w:tcMar>
+              <w:top w:type="dxa" w:w="60"/>
+              <w:left w:type="dxa" w:w="90"/>
+              <w:bottom w:type="dxa" w:w="60"/>
+              <w:right w:type="dxa" w:w="90"/>
+            </w:tcMar>
+          </w:tcPr>
+          <w:p>
+            <w:pPr>
+              <w:spacing w:line="240" w:before="0" w:after="0"/>
+            </w:pPr>
+            <w:r>
+              <w:rPr>
+                <w:rFonts w:ascii="Times New Roman" w:cs="Times New Roman" w:eastAsia="Times New Roman" w:hAnsi="Times New Roman"/>
+                <w:sz w:val="24"/>
+                <w:szCs w:val="24"/>
+              </w:rPr>
+              <w:t xml:space="preserve">Construye las imágenes, las levanta con Docker Compose y comprueba la API a través de nginx</w:t>
+            </w:r>
+          </w:p>
+        </w:tc>
+        <w:tc>
+          <w:tcPr>
+            <w:tcW w:type="dxa" w:w="2756"/>
+            <w:tcBorders>
+              <w:top w:val="none" w:color="FFFFFF" w:sz="0"/>
+              <w:left w:val="none" w:color="FFFFFF" w:sz="0"/>
+              <w:bottom w:val="none" w:color="FFFFFF" w:sz="0"/>
+              <w:right w:val="none" w:color="FFFFFF" w:sz="0"/>
+            </w:tcBorders>
+            <w:shd w:fill="FFFFFF" w:val="clear"/>
+            <w:tcMar>
+              <w:top w:type="dxa" w:w="60"/>
+              <w:left w:type="dxa" w:w="90"/>
+              <w:bottom w:type="dxa" w:w="60"/>
+              <w:right w:type="dxa" w:w="90"/>
+            </w:tcMar>
+          </w:tcPr>
+          <w:p>
+            <w:pPr>
+              <w:spacing w:line="240" w:before="0" w:after="0"/>
+            </w:pPr>
+            <w:r>
+              <w:rPr>
+                <w:rFonts w:ascii="Times New Roman" w:cs="Times New Roman" w:eastAsia="Times New Roman" w:hAnsi="Times New Roman"/>
+                <w:sz w:val="24"/>
+                <w:szCs w:val="24"/>
+              </w:rPr>
+              <w:t xml:space="preserve">Igual</w:t>
+            </w:r>
+          </w:p>
+        </w:tc>
+      </w:tr>
+      <w:tr>
+        <w:tc>
+          <w:tcPr>
+            <w:tcW w:type="dxa" w:w="1287"/>
+            <w:tcBorders>
+              <w:top w:val="none" w:color="FFFFFF" w:sz="0"/>
+              <w:left w:val="none" w:color="FFFFFF" w:sz="0"/>
+              <w:bottom w:val="none" w:color="FFFFFF" w:sz="0"/>
+              <w:right w:val="none" w:color="FFFFFF" w:sz="0"/>
+            </w:tcBorders>
+            <w:shd w:fill="FFFFFF" w:val="clear"/>
+            <w:tcMar>
+              <w:top w:type="dxa" w:w="60"/>
+              <w:left w:type="dxa" w:w="90"/>
+              <w:bottom w:type="dxa" w:w="60"/>
+              <w:right w:type="dxa" w:w="90"/>
+            </w:tcMar>
+          </w:tcPr>
+          <w:p>
+            <w:pPr>
+              <w:spacing w:line="240" w:before="0" w:after="0"/>
+            </w:pPr>
             <w:r>
               <w:rPr>
                 <w:rFonts w:ascii="Courier New" w:cs="Courier New" w:eastAsia="Courier New" w:hAnsi="Courier New"/>
                 <w:sz w:val="22"/>
                 <w:szCs w:val="22"/>
               </w:rPr>
-              <w:t xml:space="preserve">taskflow-frontend</w:t>
-            </w:r>
-          </w:p>
-        </w:tc>
-        <w:tc>
-          <w:tcPr>
-            <w:tcW w:type="dxa" w:w="3813"/>
-            <w:tcBorders>
-              <w:top w:val="none" w:color="FFFFFF" w:sz="0"/>
-              <w:left w:val="none" w:color="FFFFFF" w:sz="0"/>
-              <w:bottom w:val="single" w:color="000000" w:sz="6"/>
+              <w:t xml:space="preserve">deploy</w:t>
+            </w:r>
+          </w:p>
+        </w:tc>
+        <w:tc>
+          <w:tcPr>
+            <w:tcW w:type="dxa" w:w="4983"/>
+            <w:tcBorders>
+              <w:top w:val="none" w:color="FFFFFF" w:sz="0"/>
+              <w:left w:val="none" w:color="FFFFFF" w:sz="0"/>
+              <w:bottom w:val="none" w:color="FFFFFF" w:sz="0"/>
+              <w:right w:val="none" w:color="FFFFFF" w:sz="0"/>
+            </w:tcBorders>
+            <w:shd w:fill="FFFFFF" w:val="clear"/>
+            <w:tcMar>
+              <w:top w:type="dxa" w:w="60"/>
+              <w:left w:type="dxa" w:w="90"/>
+              <w:bottom w:type="dxa" w:w="60"/>
+              <w:right w:type="dxa" w:w="90"/>
+            </w:tcMar>
+          </w:tcPr>
+          <w:p>
+            <w:pPr>
+              <w:spacing w:line="240" w:before="0" w:after="0"/>
+            </w:pPr>
+            <w:r>
+              <w:rPr>
+                <w:rFonts w:ascii="Times New Roman" w:cs="Times New Roman" w:eastAsia="Times New Roman" w:hAnsi="Times New Roman"/>
+                <w:sz w:val="24"/>
+                <w:szCs w:val="24"/>
+              </w:rPr>
+              <w:t xml:space="preserve">Publica el build del frontend como artefacto descargable</w:t>
+            </w:r>
+          </w:p>
+        </w:tc>
+        <w:tc>
+          <w:tcPr>
+            <w:tcW w:type="dxa" w:w="2756"/>
+            <w:tcBorders>
+              <w:top w:val="none" w:color="FFFFFF" w:sz="0"/>
+              <w:left w:val="none" w:color="FFFFFF" w:sz="0"/>
+              <w:bottom w:val="none" w:color="FFFFFF" w:sz="0"/>
               <w:right w:val="none" w:color="FFFFFF" w:sz="0"/>
             </w:tcBorders>
             <w:shd w:fill="FFFFFF" w:val="clear"/>
@@ -4056,13 +4345,221 @@
               </w:rPr>
               <w:t xml:space="preserve">main</w:t>
             </w:r>
-            <w:r>
-              <w:rPr>
-                <w:rFonts w:ascii="Times New Roman" w:cs="Times New Roman" w:eastAsia="Times New Roman" w:hAnsi="Times New Roman"/>
-                <w:sz w:val="24"/>
-                <w:szCs w:val="24"/>
-              </w:rPr>
-              <w:t xml:space="preserve"> y con los dos anteriores en verde</w:t>
+          </w:p>
+        </w:tc>
+      </w:tr>
+      <w:tr>
+        <w:tc>
+          <w:tcPr>
+            <w:tcW w:type="dxa" w:w="1287"/>
+            <w:tcBorders>
+              <w:top w:val="none" w:color="FFFFFF" w:sz="0"/>
+              <w:left w:val="none" w:color="FFFFFF" w:sz="0"/>
+              <w:bottom w:val="none" w:color="FFFFFF" w:sz="0"/>
+              <w:right w:val="none" w:color="FFFFFF" w:sz="0"/>
+            </w:tcBorders>
+            <w:shd w:fill="FFFFFF" w:val="clear"/>
+            <w:tcMar>
+              <w:top w:type="dxa" w:w="60"/>
+              <w:left w:type="dxa" w:w="90"/>
+              <w:bottom w:type="dxa" w:w="60"/>
+              <w:right w:type="dxa" w:w="90"/>
+            </w:tcMar>
+          </w:tcPr>
+          <w:p>
+            <w:pPr>
+              <w:spacing w:line="240" w:before="0" w:after="0"/>
+            </w:pPr>
+            <w:r>
+              <w:rPr>
+                <w:rFonts w:ascii="Courier New" w:cs="Courier New" w:eastAsia="Courier New" w:hAnsi="Courier New"/>
+                <w:sz w:val="22"/>
+                <w:szCs w:val="22"/>
+              </w:rPr>
+              <w:t xml:space="preserve">codeql.yml</w:t>
+            </w:r>
+          </w:p>
+        </w:tc>
+        <w:tc>
+          <w:tcPr>
+            <w:tcW w:type="dxa" w:w="4983"/>
+            <w:tcBorders>
+              <w:top w:val="none" w:color="FFFFFF" w:sz="0"/>
+              <w:left w:val="none" w:color="FFFFFF" w:sz="0"/>
+              <w:bottom w:val="none" w:color="FFFFFF" w:sz="0"/>
+              <w:right w:val="none" w:color="FFFFFF" w:sz="0"/>
+            </w:tcBorders>
+            <w:shd w:fill="FFFFFF" w:val="clear"/>
+            <w:tcMar>
+              <w:top w:type="dxa" w:w="60"/>
+              <w:left w:type="dxa" w:w="90"/>
+              <w:bottom w:type="dxa" w:w="60"/>
+              <w:right w:type="dxa" w:w="90"/>
+            </w:tcMar>
+          </w:tcPr>
+          <w:p>
+            <w:pPr>
+              <w:spacing w:line="240" w:before="0" w:after="0"/>
+            </w:pPr>
+            <w:r>
+              <w:rPr>
+                <w:rFonts w:ascii="Times New Roman" w:cs="Times New Roman" w:eastAsia="Times New Roman" w:hAnsi="Times New Roman"/>
+                <w:sz w:val="24"/>
+                <w:szCs w:val="24"/>
+              </w:rPr>
+              <w:t xml:space="preserve">Análisis de seguridad del código</w:t>
+            </w:r>
+          </w:p>
+        </w:tc>
+        <w:tc>
+          <w:tcPr>
+            <w:tcW w:type="dxa" w:w="2756"/>
+            <w:tcBorders>
+              <w:top w:val="none" w:color="FFFFFF" w:sz="0"/>
+              <w:left w:val="none" w:color="FFFFFF" w:sz="0"/>
+              <w:bottom w:val="none" w:color="FFFFFF" w:sz="0"/>
+              <w:right w:val="none" w:color="FFFFFF" w:sz="0"/>
+            </w:tcBorders>
+            <w:shd w:fill="FFFFFF" w:val="clear"/>
+            <w:tcMar>
+              <w:top w:type="dxa" w:w="60"/>
+              <w:left w:type="dxa" w:w="90"/>
+              <w:bottom w:type="dxa" w:w="60"/>
+              <w:right w:type="dxa" w:w="90"/>
+            </w:tcMar>
+          </w:tcPr>
+          <w:p>
+            <w:pPr>
+              <w:spacing w:line="240" w:before="0" w:after="0"/>
+            </w:pPr>
+            <w:r>
+              <w:rPr>
+                <w:rFonts w:ascii="Times New Roman" w:cs="Times New Roman" w:eastAsia="Times New Roman" w:hAnsi="Times New Roman"/>
+                <w:sz w:val="24"/>
+                <w:szCs w:val="24"/>
+              </w:rPr>
+              <w:t xml:space="preserve">Push, PR y cada lunes</w:t>
+            </w:r>
+          </w:p>
+        </w:tc>
+      </w:tr>
+      <w:tr>
+        <w:tc>
+          <w:tcPr>
+            <w:tcW w:type="dxa" w:w="1287"/>
+            <w:tcBorders>
+              <w:top w:val="none" w:color="FFFFFF" w:sz="0"/>
+              <w:left w:val="none" w:color="FFFFFF" w:sz="0"/>
+              <w:bottom w:val="single" w:color="000000" w:sz="6"/>
+              <w:right w:val="none" w:color="FFFFFF" w:sz="0"/>
+            </w:tcBorders>
+            <w:shd w:fill="FFFFFF" w:val="clear"/>
+            <w:tcMar>
+              <w:top w:type="dxa" w:w="60"/>
+              <w:left w:type="dxa" w:w="90"/>
+              <w:bottom w:type="dxa" w:w="60"/>
+              <w:right w:type="dxa" w:w="90"/>
+            </w:tcMar>
+          </w:tcPr>
+          <w:p>
+            <w:pPr>
+              <w:spacing w:line="240" w:before="0" w:after="0"/>
+            </w:pPr>
+            <w:r>
+              <w:rPr>
+                <w:rFonts w:ascii="Courier New" w:cs="Courier New" w:eastAsia="Courier New" w:hAnsi="Courier New"/>
+                <w:sz w:val="22"/>
+                <w:szCs w:val="22"/>
+              </w:rPr>
+              <w:t xml:space="preserve">release.yml</w:t>
+            </w:r>
+          </w:p>
+        </w:tc>
+        <w:tc>
+          <w:tcPr>
+            <w:tcW w:type="dxa" w:w="4983"/>
+            <w:tcBorders>
+              <w:top w:val="none" w:color="FFFFFF" w:sz="0"/>
+              <w:left w:val="none" w:color="FFFFFF" w:sz="0"/>
+              <w:bottom w:val="single" w:color="000000" w:sz="6"/>
+              <w:right w:val="none" w:color="FFFFFF" w:sz="0"/>
+            </w:tcBorders>
+            <w:shd w:fill="FFFFFF" w:val="clear"/>
+            <w:tcMar>
+              <w:top w:type="dxa" w:w="60"/>
+              <w:left w:type="dxa" w:w="90"/>
+              <w:bottom w:type="dxa" w:w="60"/>
+              <w:right w:type="dxa" w:w="90"/>
+            </w:tcMar>
+          </w:tcPr>
+          <w:p>
+            <w:pPr>
+              <w:spacing w:line="240" w:before="0" w:after="0"/>
+            </w:pPr>
+            <w:r>
+              <w:rPr>
+                <w:rFonts w:ascii="Times New Roman" w:cs="Times New Roman" w:eastAsia="Times New Roman" w:hAnsi="Times New Roman"/>
+                <w:sz w:val="24"/>
+                <w:szCs w:val="24"/>
+              </w:rPr>
+              <w:t xml:space="preserve">Publica la versión en </w:t>
+            </w:r>
+            <w:r>
+              <w:rPr>
+                <w:rFonts w:ascii="Times New Roman" w:cs="Times New Roman" w:eastAsia="Times New Roman" w:hAnsi="Times New Roman"/>
+                <w:i/>
+                <w:iCs/>
+                <w:sz w:val="24"/>
+                <w:szCs w:val="24"/>
+              </w:rPr>
+              <w:t xml:space="preserve">Releases</w:t>
+            </w:r>
+            <w:r>
+              <w:rPr>
+                <w:rFonts w:ascii="Times New Roman" w:cs="Times New Roman" w:eastAsia="Times New Roman" w:hAnsi="Times New Roman"/>
+                <w:sz w:val="24"/>
+                <w:szCs w:val="24"/>
+              </w:rPr>
+              <w:t xml:space="preserve"> con el build</w:t>
+            </w:r>
+          </w:p>
+        </w:tc>
+        <w:tc>
+          <w:tcPr>
+            <w:tcW w:type="dxa" w:w="2756"/>
+            <w:tcBorders>
+              <w:top w:val="none" w:color="FFFFFF" w:sz="0"/>
+              <w:left w:val="none" w:color="FFFFFF" w:sz="0"/>
+              <w:bottom w:val="single" w:color="000000" w:sz="6"/>
+              <w:right w:val="none" w:color="FFFFFF" w:sz="0"/>
+            </w:tcBorders>
+            <w:shd w:fill="FFFFFF" w:val="clear"/>
+            <w:tcMar>
+              <w:top w:type="dxa" w:w="60"/>
+              <w:left w:type="dxa" w:w="90"/>
+              <w:bottom w:type="dxa" w:w="60"/>
+              <w:right w:type="dxa" w:w="90"/>
+            </w:tcMar>
+          </w:tcPr>
+          <w:p>
+            <w:pPr>
+              <w:spacing w:line="240" w:before="0" w:after="0"/>
+            </w:pPr>
+            <w:r>
+              <w:rPr>
+                <w:rFonts w:ascii="Times New Roman" w:cs="Times New Roman" w:eastAsia="Times New Roman" w:hAnsi="Times New Roman"/>
+                <w:sz w:val="24"/>
+                <w:szCs w:val="24"/>
+              </w:rPr>
+              <w:t xml:space="preserve">Al crear una etiqueta </w:t>
+            </w:r>
+            <w:r>
+              <w:rPr>
+                <w:rFonts w:ascii="Courier New" w:cs="Courier New" w:eastAsia="Courier New" w:hAnsi="Courier New"/>
+                <w:sz w:val="22"/>
+                <w:szCs w:val="22"/>
+              </w:rPr>
+              <w:t xml:space="preserve">v*</w:t>
             </w:r>
           </w:p>
         </w:tc>
@@ -4084,46 +4581,7 @@
           <w:sz w:val="24"/>
           <w:szCs w:val="24"/>
         </w:rPr>
-        <w:t xml:space="preserve">El historial de GitHub Actions registra 48 ejecuciones exitosas y ninguna fallida. El </w:t>
-      </w:r>
-      <w:r>
-        <w:rPr>
-          <w:rFonts w:ascii="Times New Roman" w:cs="Times New Roman" w:eastAsia="Times New Roman" w:hAnsi="Times New Roman"/>
-          <w:i/>
-          <w:iCs/>
-          <w:sz w:val="24"/>
-          <w:szCs w:val="24"/>
-        </w:rPr>
-        <w:t xml:space="preserve">deploy</w:t>
-      </w:r>
-      <w:r>
-        <w:rPr>
-          <w:rFonts w:ascii="Times New Roman" w:cs="Times New Roman" w:eastAsia="Times New Roman" w:hAnsi="Times New Roman"/>
-          <w:sz w:val="24"/>
-          <w:szCs w:val="24"/>
-        </w:rPr>
-        <w:t xml:space="preserve"> es simulado: publica el
-build como artefacto en lugar de subirlo a un servidor, porque el despliegue real quedó fuera del alcance del
-proyecto. Además, la v3 agrega </w:t>
-      </w:r>
-      <w:r>
-        <w:rPr>
-          <w:rFonts w:ascii="Times New Roman" w:cs="Times New Roman" w:eastAsia="Times New Roman" w:hAnsi="Times New Roman"/>
-          <w:b/>
-          <w:bCs/>
-          <w:sz w:val="24"/>
-          <w:szCs w:val="24"/>
-        </w:rPr>
-        <w:t xml:space="preserve">Dependabot</w:t>
-      </w:r>
-      <w:r>
-        <w:rPr>
-          <w:rFonts w:ascii="Times New Roman" w:cs="Times New Roman" w:eastAsia="Times New Roman" w:hAnsi="Times New Roman"/>
-          <w:sz w:val="24"/>
-          <w:szCs w:val="24"/>
-        </w:rPr>
-        <w:t xml:space="preserve">, que revisa cada semana las dependencias y abre PR con las
-actualizaciones, y en la reverificación del 10 de octubre </w:t>
+        <w:t xml:space="preserve">Ninguna ejecución del pipeline sobre </w:t>
       </w:r>
       <w:r>
         <w:rPr>
@@ -4131,27 +4589,153 @@
           <w:sz w:val="22"/>
           <w:szCs w:val="22"/>
         </w:rPr>
-        <w:t xml:space="preserve">npm audit</w:t>
-      </w:r>
-      <w:r>
-        <w:rPr>
-          <w:rFonts w:ascii="Times New Roman" w:cs="Times New Roman" w:eastAsia="Times New Roman" w:hAnsi="Times New Roman"/>
-          <w:sz w:val="24"/>
-          <w:szCs w:val="24"/>
-        </w:rPr>
-        <w:t xml:space="preserve"> reportó cero vulnerabilidades.</w:t>
-      </w:r>
-    </w:p>
-    <w:p>
-      <w:pPr>
-        <w:pStyle w:val="Heading2"/>
-        <w:spacing w:line="480" w:before="0" w:after="0"/>
-      </w:pPr>
+        <w:t xml:space="preserve">main</w:t>
+      </w:r>
+      <w:r>
+        <w:rPr>
+          <w:rFonts w:ascii="Times New Roman" w:cs="Times New Roman" w:eastAsia="Times New Roman" w:hAnsi="Times New Roman"/>
+          <w:sz w:val="24"/>
+          <w:szCs w:val="24"/>
+        </w:rPr>
+        <w:t xml:space="preserve"> falló. La aplicación queda empaquetada en contenedores (una imagen para la
+API y otra con nginx para el frontend) y se ejecuta con </w:t>
+      </w:r>
+      <w:r>
+        <w:rPr>
+          <w:rFonts w:ascii="Courier New" w:cs="Courier New" w:eastAsia="Courier New" w:hAnsi="Courier New"/>
+          <w:sz w:val="22"/>
+          <w:szCs w:val="22"/>
+        </w:rPr>
+        <w:t xml:space="preserve">docker compose up</w:t>
+      </w:r>
+      <w:r>
+        <w:rPr>
+          <w:rFonts w:ascii="Times New Roman" w:cs="Times New Roman" w:eastAsia="Times New Roman" w:hAnsi="Times New Roman"/>
+          <w:sz w:val="24"/>
+          <w:szCs w:val="24"/>
+        </w:rPr>
+        <w:t xml:space="preserve">; lo que no se hizo es publicarla en un
+servidor de la nube, porque exige crear una cuenta en un proveedor. Además, </w:t>
+      </w:r>
       <w:r>
         <w:rPr>
           <w:rFonts w:ascii="Times New Roman" w:cs="Times New Roman" w:eastAsia="Times New Roman" w:hAnsi="Times New Roman"/>
           <w:b/>
           <w:bCs/>
+          <w:sz w:val="24"/>
+          <w:szCs w:val="24"/>
+        </w:rPr>
+        <w:t xml:space="preserve">Dependabot</w:t>
+      </w:r>
+      <w:r>
+        <w:rPr>
+          <w:rFonts w:ascii="Times New Roman" w:cs="Times New Roman" w:eastAsia="Times New Roman" w:hAnsi="Times New Roman"/>
+          <w:sz w:val="24"/>
+          <w:szCs w:val="24"/>
+        </w:rPr>
+        <w:t xml:space="preserve"> revisa cada semana las
+dependencias, y </w:t>
+      </w:r>
+      <w:r>
+        <w:rPr>
+          <w:rFonts w:ascii="Times New Roman" w:cs="Times New Roman" w:eastAsia="Times New Roman" w:hAnsi="Times New Roman"/>
+          <w:b/>
+          <w:bCs/>
+          <w:sz w:val="24"/>
+          <w:szCs w:val="24"/>
+        </w:rPr>
+        <w:t xml:space="preserve">CodeQL</w:t>
+      </w:r>
+      <w:r>
+        <w:rPr>
+          <w:rFonts w:ascii="Times New Roman" w:cs="Times New Roman" w:eastAsia="Times New Roman" w:hAnsi="Times New Roman"/>
+          <w:sz w:val="24"/>
+          <w:szCs w:val="24"/>
+        </w:rPr>
+        <w:t xml:space="preserve"> encontró en su primera ejecución una alerta de severidad alta (la API no limitaba las
+peticiones por IP), que se corrigió con pruebas en el mismo PR. Entre el 10 y el 26 de octubre aparecieron
+</w:t>
+      </w:r>
+      <w:r>
+        <w:rPr>
+          <w:rFonts w:ascii="Times New Roman" w:cs="Times New Roman" w:eastAsia="Times New Roman" w:hAnsi="Times New Roman"/>
+          <w:i/>
+          <w:iCs/>
+          <w:sz w:val="24"/>
+          <w:szCs w:val="24"/>
+        </w:rPr>
+        <w:t xml:space="preserve">advisories</w:t>
+      </w:r>
+      <w:r>
+        <w:rPr>
+          <w:rFonts w:ascii="Times New Roman" w:cs="Times New Roman" w:eastAsia="Times New Roman" w:hAnsi="Times New Roman"/>
+          <w:sz w:val="24"/>
+          <w:szCs w:val="24"/>
+        </w:rPr>
+        <w:t xml:space="preserve"> nuevas en </w:t>
+      </w:r>
+      <w:r>
+        <w:rPr>
+          <w:rFonts w:ascii="Courier New" w:cs="Courier New" w:eastAsia="Courier New" w:hAnsi="Courier New"/>
+          <w:sz w:val="22"/>
+          <w:szCs w:val="22"/>
+        </w:rPr>
+        <w:t xml:space="preserve">body-parser</w:t>
+      </w:r>
+      <w:r>
+        <w:rPr>
+          <w:rFonts w:ascii="Times New Roman" w:cs="Times New Roman" w:eastAsia="Times New Roman" w:hAnsi="Times New Roman"/>
+          <w:sz w:val="24"/>
+          <w:szCs w:val="24"/>
+        </w:rPr>
+        <w:t xml:space="preserve"> y en </w:t>
+      </w:r>
+      <w:r>
+        <w:rPr>
+          <w:rFonts w:ascii="Courier New" w:cs="Courier New" w:eastAsia="Courier New" w:hAnsi="Courier New"/>
+          <w:sz w:val="22"/>
+          <w:szCs w:val="22"/>
+        </w:rPr>
+        <w:t xml:space="preserve">@angular/router</w:t>
+      </w:r>
+      <w:r>
+        <w:rPr>
+          <w:rFonts w:ascii="Times New Roman" w:cs="Times New Roman" w:eastAsia="Times New Roman" w:hAnsi="Times New Roman"/>
+          <w:sz w:val="24"/>
+          <w:szCs w:val="24"/>
+        </w:rPr>
+        <w:t xml:space="preserve">; se corrigieron y </w:t>
+      </w:r>
+      <w:r>
+        <w:rPr>
+          <w:rFonts w:ascii="Courier New" w:cs="Courier New" w:eastAsia="Courier New" w:hAnsi="Courier New"/>
+          <w:sz w:val="22"/>
+          <w:szCs w:val="22"/>
+        </w:rPr>
+        <w:t xml:space="preserve">npm audit</w:t>
+      </w:r>
+      <w:r>
+        <w:rPr>
+          <w:rFonts w:ascii="Times New Roman" w:cs="Times New Roman" w:eastAsia="Times New Roman" w:hAnsi="Times New Roman"/>
+          <w:sz w:val="24"/>
+          <w:szCs w:val="24"/>
+        </w:rPr>
+        <w:t xml:space="preserve"> volvió a cero. Este es el
+sentido de automatizar la seguridad: las vulnerabilidades aparecen aunque el código no cambie.</w:t>
+      </w:r>
+    </w:p>
+    <w:p>
+      <w:pPr>
+        <w:pStyle w:val="Heading2"/>
+        <w:spacing w:line="480" w:before="0" w:after="0"/>
+      </w:pPr>
+      <w:r>
+        <w:rPr>
+          <w:rFonts w:ascii="Times New Roman" w:cs="Times New Roman" w:eastAsia="Times New Roman" w:hAnsi="Times New Roman"/>
+          <w:b/>
+          <w:bCs/>
+          <w:i w:val="false"/>
+          <w:iCs w:val="false"/>
           <w:sz w:val="24"/>
           <w:szCs w:val="24"/>
         </w:rPr>
@@ -4630,7 +5214,6 @@
     </w:p>
     <w:p>
       <w:pPr>
-        <w:keepNext w:val="false"/>
         <w:spacing w:line="240" w:before="0" w:after="0"/>
       </w:pPr>
       <w:r>
@@ -4713,7 +5296,6 @@
     </w:p>
     <w:p>
       <w:pPr>
-        <w:keepNext w:val="false"/>
         <w:spacing w:line="240" w:before="0" w:after="0"/>
       </w:pPr>
       <w:r>
@@ -4772,6 +5354,8 @@
           <w:rFonts w:ascii="Times New Roman" w:cs="Times New Roman" w:eastAsia="Times New Roman" w:hAnsi="Times New Roman"/>
           <w:b/>
           <w:bCs/>
+          <w:i w:val="false"/>
+          <w:iCs w:val="false"/>
           <w:sz w:val="24"/>
           <w:szCs w:val="24"/>
         </w:rPr>
@@ -4910,10 +5494,11 @@
         <w:tblLayout w:type="fixed"/>
       </w:tblPr>
       <w:tblGrid>
-        <w:gridCol w:w="5886"/>
-        <w:gridCol w:w="1046"/>
-        <w:gridCol w:w="1046"/>
-        <w:gridCol w:w="1048"/>
+        <w:gridCol w:w="4896"/>
+        <w:gridCol w:w="870"/>
+        <w:gridCol w:w="870"/>
+        <w:gridCol w:w="870"/>
+        <w:gridCol w:w="1520"/>
       </w:tblGrid>
       <w:tr>
         <w:trPr>
@@ -4921,7 +5506,7 @@
         </w:trPr>
         <w:tc>
           <w:tcPr>
-            <w:tcW w:type="dxa" w:w="5886"/>
+            <w:tcW w:type="dxa" w:w="4896"/>
             <w:tcBorders>
               <w:top w:val="single" w:color="000000" w:sz="6"/>
               <w:left w:val="none" w:color="FFFFFF" w:sz="0"/>
@@ -4954,7 +5539,7 @@
         </w:tc>
         <w:tc>
           <w:tcPr>
-            <w:tcW w:type="dxa" w:w="1046"/>
+            <w:tcW w:type="dxa" w:w="870"/>
             <w:tcBorders>
               <w:top w:val="single" w:color="000000" w:sz="6"/>
               <w:left w:val="none" w:color="FFFFFF" w:sz="0"/>
@@ -4987,7 +5572,7 @@
         </w:tc>
         <w:tc>
           <w:tcPr>
-            <w:tcW w:type="dxa" w:w="1046"/>
+            <w:tcW w:type="dxa" w:w="870"/>
             <w:tcBorders>
               <w:top w:val="single" w:color="000000" w:sz="6"/>
               <w:left w:val="none" w:color="FFFFFF" w:sz="0"/>
@@ -5020,7 +5605,7 @@
         </w:tc>
         <w:tc>
           <w:tcPr>
-            <w:tcW w:type="dxa" w:w="1048"/>
+            <w:tcW w:type="dxa" w:w="870"/>
             <w:tcBorders>
               <w:top w:val="single" w:color="000000" w:sz="6"/>
               <w:left w:val="none" w:color="FFFFFF" w:sz="0"/>
@@ -5051,11 +5636,44 @@
             </w:r>
           </w:p>
         </w:tc>
+        <w:tc>
+          <w:tcPr>
+            <w:tcW w:type="dxa" w:w="1520"/>
+            <w:tcBorders>
+              <w:top w:val="single" w:color="000000" w:sz="6"/>
+              <w:left w:val="none" w:color="FFFFFF" w:sz="0"/>
+              <w:bottom w:val="single" w:color="000000" w:sz="6"/>
+              <w:right w:val="none" w:color="FFFFFF" w:sz="0"/>
+            </w:tcBorders>
+            <w:shd w:fill="FFFFFF" w:val="clear"/>
+            <w:tcMar>
+              <w:top w:type="dxa" w:w="60"/>
+              <w:left w:type="dxa" w:w="90"/>
+              <w:bottom w:type="dxa" w:w="60"/>
+              <w:right w:type="dxa" w:w="90"/>
+            </w:tcMar>
+          </w:tcPr>
+          <w:p>
+            <w:pPr>
+              <w:spacing w:line="240" w:before="0" w:after="0"/>
+            </w:pPr>
+            <w:r>
+              <w:rPr>
+                <w:rFonts w:ascii="Times New Roman" w:cs="Times New Roman" w:eastAsia="Times New Roman" w:hAnsi="Times New Roman"/>
+                <w:b/>
+                <w:bCs/>
+                <w:sz w:val="24"/>
+                <w:szCs w:val="24"/>
+              </w:rPr>
+              <w:t xml:space="preserve">v4</w:t>
+            </w:r>
+          </w:p>
+        </w:tc>
       </w:tr>
       <w:tr>
         <w:tc>
           <w:tcPr>
-            <w:tcW w:type="dxa" w:w="5886"/>
+            <w:tcW w:type="dxa" w:w="4896"/>
             <w:tcBorders>
               <w:top w:val="none" w:color="FFFFFF" w:sz="0"/>
               <w:left w:val="none" w:color="FFFFFF" w:sz="0"/>
@@ -5086,7 +5704,7 @@
         </w:tc>
         <w:tc>
           <w:tcPr>
-            <w:tcW w:type="dxa" w:w="1046"/>
+            <w:tcW w:type="dxa" w:w="870"/>
             <w:tcBorders>
               <w:top w:val="none" w:color="FFFFFF" w:sz="0"/>
               <w:left w:val="none" w:color="FFFFFF" w:sz="0"/>
@@ -5117,7 +5735,7 @@
         </w:tc>
         <w:tc>
           <w:tcPr>
-            <w:tcW w:type="dxa" w:w="1046"/>
+            <w:tcW w:type="dxa" w:w="870"/>
             <w:tcBorders>
               <w:top w:val="none" w:color="FFFFFF" w:sz="0"/>
               <w:left w:val="none" w:color="FFFFFF" w:sz="0"/>
@@ -5148,7 +5766,7 @@
         </w:tc>
         <w:tc>
           <w:tcPr>
-            <w:tcW w:type="dxa" w:w="1048"/>
+            <w:tcW w:type="dxa" w:w="870"/>
             <w:tcBorders>
               <w:top w:val="none" w:color="FFFFFF" w:sz="0"/>
               <w:left w:val="none" w:color="FFFFFF" w:sz="0"/>
@@ -5174,6 +5792,37 @@
                 <w:szCs w:val="24"/>
               </w:rPr>
               <w:t xml:space="preserve">242</w:t>
+            </w:r>
+          </w:p>
+        </w:tc>
+        <w:tc>
+          <w:tcPr>
+            <w:tcW w:type="dxa" w:w="1520"/>
+            <w:tcBorders>
+              <w:top w:val="none" w:color="FFFFFF" w:sz="0"/>
+              <w:left w:val="none" w:color="FFFFFF" w:sz="0"/>
+              <w:bottom w:val="none" w:color="FFFFFF" w:sz="0"/>
+              <w:right w:val="none" w:color="FFFFFF" w:sz="0"/>
+            </w:tcBorders>
+            <w:shd w:fill="FFFFFF" w:val="clear"/>
+            <w:tcMar>
+              <w:top w:type="dxa" w:w="60"/>
+              <w:left w:type="dxa" w:w="90"/>
+              <w:bottom w:type="dxa" w:w="60"/>
+              <w:right w:type="dxa" w:w="90"/>
+            </w:tcMar>
+          </w:tcPr>
+          <w:p>
+            <w:pPr>
+              <w:spacing w:line="240" w:before="0" w:after="0"/>
+            </w:pPr>
+            <w:r>
+              <w:rPr>
+                <w:rFonts w:ascii="Times New Roman" w:cs="Times New Roman" w:eastAsia="Times New Roman" w:hAnsi="Times New Roman"/>
+                <w:sz w:val="24"/>
+                <w:szCs w:val="24"/>
+              </w:rPr>
+              <w:t xml:space="preserve">251</w:t>
             </w:r>
           </w:p>
         </w:tc>
@@ -5181,7 +5830,7 @@
       <w:tr>
         <w:tc>
           <w:tcPr>
-            <w:tcW w:type="dxa" w:w="5886"/>
+            <w:tcW w:type="dxa" w:w="4896"/>
             <w:tcBorders>
               <w:top w:val="none" w:color="FFFFFF" w:sz="0"/>
               <w:left w:val="none" w:color="FFFFFF" w:sz="0"/>
@@ -5212,7 +5861,7 @@
         </w:tc>
         <w:tc>
           <w:tcPr>
-            <w:tcW w:type="dxa" w:w="1046"/>
+            <w:tcW w:type="dxa" w:w="870"/>
             <w:tcBorders>
               <w:top w:val="none" w:color="FFFFFF" w:sz="0"/>
               <w:left w:val="none" w:color="FFFFFF" w:sz="0"/>
@@ -5243,7 +5892,7 @@
         </w:tc>
         <w:tc>
           <w:tcPr>
-            <w:tcW w:type="dxa" w:w="1046"/>
+            <w:tcW w:type="dxa" w:w="870"/>
             <w:tcBorders>
               <w:top w:val="none" w:color="FFFFFF" w:sz="0"/>
               <w:left w:val="none" w:color="FFFFFF" w:sz="0"/>
@@ -5274,7 +5923,7 @@
         </w:tc>
         <w:tc>
           <w:tcPr>
-            <w:tcW w:type="dxa" w:w="1048"/>
+            <w:tcW w:type="dxa" w:w="870"/>
             <w:tcBorders>
               <w:top w:val="none" w:color="FFFFFF" w:sz="0"/>
               <w:left w:val="none" w:color="FFFFFF" w:sz="0"/>
@@ -5300,6 +5949,37 @@
                 <w:szCs w:val="24"/>
               </w:rPr>
               <w:t xml:space="preserve">173</w:t>
+            </w:r>
+          </w:p>
+        </w:tc>
+        <w:tc>
+          <w:tcPr>
+            <w:tcW w:type="dxa" w:w="1520"/>
+            <w:tcBorders>
+              <w:top w:val="none" w:color="FFFFFF" w:sz="0"/>
+              <w:left w:val="none" w:color="FFFFFF" w:sz="0"/>
+              <w:bottom w:val="none" w:color="FFFFFF" w:sz="0"/>
+              <w:right w:val="none" w:color="FFFFFF" w:sz="0"/>
+            </w:tcBorders>
+            <w:shd w:fill="FFFFFF" w:val="clear"/>
+            <w:tcMar>
+              <w:top w:type="dxa" w:w="60"/>
+              <w:left w:type="dxa" w:w="90"/>
+              <w:bottom w:type="dxa" w:w="60"/>
+              <w:right w:type="dxa" w:w="90"/>
+            </w:tcMar>
+          </w:tcPr>
+          <w:p>
+            <w:pPr>
+              <w:spacing w:line="240" w:before="0" w:after="0"/>
+            </w:pPr>
+            <w:r>
+              <w:rPr>
+                <w:rFonts w:ascii="Times New Roman" w:cs="Times New Roman" w:eastAsia="Times New Roman" w:hAnsi="Times New Roman"/>
+                <w:sz w:val="24"/>
+                <w:szCs w:val="24"/>
+              </w:rPr>
+              <w:t xml:space="preserve">174</w:t>
             </w:r>
           </w:p>
         </w:tc>
@@ -5307,7 +5987,164 @@
       <w:tr>
         <w:tc>
           <w:tcPr>
-            <w:tcW w:type="dxa" w:w="5886"/>
+            <w:tcW w:type="dxa" w:w="4896"/>
+            <w:tcBorders>
+              <w:top w:val="none" w:color="FFFFFF" w:sz="0"/>
+              <w:left w:val="none" w:color="FFFFFF" w:sz="0"/>
+              <w:bottom w:val="none" w:color="FFFFFF" w:sz="0"/>
+              <w:right w:val="none" w:color="FFFFFF" w:sz="0"/>
+            </w:tcBorders>
+            <w:shd w:fill="FFFFFF" w:val="clear"/>
+            <w:tcMar>
+              <w:top w:type="dxa" w:w="60"/>
+              <w:left w:type="dxa" w:w="90"/>
+              <w:bottom w:type="dxa" w:w="60"/>
+              <w:right w:type="dxa" w:w="90"/>
+            </w:tcMar>
+          </w:tcPr>
+          <w:p>
+            <w:pPr>
+              <w:spacing w:line="240" w:before="0" w:after="0"/>
+            </w:pPr>
+            <w:r>
+              <w:rPr>
+                <w:rFonts w:ascii="Times New Roman" w:cs="Times New Roman" w:eastAsia="Times New Roman" w:hAnsi="Times New Roman"/>
+                <w:sz w:val="24"/>
+                <w:szCs w:val="24"/>
+              </w:rPr>
+              <w:t xml:space="preserve">Pruebas de punta a punta (Playwright)</w:t>
+            </w:r>
+          </w:p>
+        </w:tc>
+        <w:tc>
+          <w:tcPr>
+            <w:tcW w:type="dxa" w:w="870"/>
+            <w:tcBorders>
+              <w:top w:val="none" w:color="FFFFFF" w:sz="0"/>
+              <w:left w:val="none" w:color="FFFFFF" w:sz="0"/>
+              <w:bottom w:val="none" w:color="FFFFFF" w:sz="0"/>
+              <w:right w:val="none" w:color="FFFFFF" w:sz="0"/>
+            </w:tcBorders>
+            <w:shd w:fill="FFFFFF" w:val="clear"/>
+            <w:tcMar>
+              <w:top w:type="dxa" w:w="60"/>
+              <w:left w:type="dxa" w:w="90"/>
+              <w:bottom w:type="dxa" w:w="60"/>
+              <w:right w:type="dxa" w:w="90"/>
+            </w:tcMar>
+          </w:tcPr>
+          <w:p>
+            <w:pPr>
+              <w:spacing w:line="240" w:before="0" w:after="0"/>
+            </w:pPr>
+            <w:r>
+              <w:rPr>
+                <w:rFonts w:ascii="Times New Roman" w:cs="Times New Roman" w:eastAsia="Times New Roman" w:hAnsi="Times New Roman"/>
+                <w:sz w:val="24"/>
+                <w:szCs w:val="24"/>
+              </w:rPr>
+              <w:t xml:space="preserve">—</w:t>
+            </w:r>
+          </w:p>
+        </w:tc>
+        <w:tc>
+          <w:tcPr>
+            <w:tcW w:type="dxa" w:w="870"/>
+            <w:tcBorders>
+              <w:top w:val="none" w:color="FFFFFF" w:sz="0"/>
+              <w:left w:val="none" w:color="FFFFFF" w:sz="0"/>
+              <w:bottom w:val="none" w:color="FFFFFF" w:sz="0"/>
+              <w:right w:val="none" w:color="FFFFFF" w:sz="0"/>
+            </w:tcBorders>
+            <w:shd w:fill="FFFFFF" w:val="clear"/>
+            <w:tcMar>
+              <w:top w:type="dxa" w:w="60"/>
+              <w:left w:type="dxa" w:w="90"/>
+              <w:bottom w:type="dxa" w:w="60"/>
+              <w:right w:type="dxa" w:w="90"/>
+            </w:tcMar>
+          </w:tcPr>
+          <w:p>
+            <w:pPr>
+              <w:spacing w:line="240" w:before="0" w:after="0"/>
+            </w:pPr>
+            <w:r>
+              <w:rPr>
+                <w:rFonts w:ascii="Times New Roman" w:cs="Times New Roman" w:eastAsia="Times New Roman" w:hAnsi="Times New Roman"/>
+                <w:sz w:val="24"/>
+                <w:szCs w:val="24"/>
+              </w:rPr>
+              <w:t xml:space="preserve">—</w:t>
+            </w:r>
+          </w:p>
+        </w:tc>
+        <w:tc>
+          <w:tcPr>
+            <w:tcW w:type="dxa" w:w="870"/>
+            <w:tcBorders>
+              <w:top w:val="none" w:color="FFFFFF" w:sz="0"/>
+              <w:left w:val="none" w:color="FFFFFF" w:sz="0"/>
+              <w:bottom w:val="none" w:color="FFFFFF" w:sz="0"/>
+              <w:right w:val="none" w:color="FFFFFF" w:sz="0"/>
+            </w:tcBorders>
+            <w:shd w:fill="FFFFFF" w:val="clear"/>
+            <w:tcMar>
+              <w:top w:type="dxa" w:w="60"/>
+              <w:left w:type="dxa" w:w="90"/>
+              <w:bottom w:type="dxa" w:w="60"/>
+              <w:right w:type="dxa" w:w="90"/>
+            </w:tcMar>
+          </w:tcPr>
+          <w:p>
+            <w:pPr>
+              <w:spacing w:line="240" w:before="0" w:after="0"/>
+            </w:pPr>
+            <w:r>
+              <w:rPr>
+                <w:rFonts w:ascii="Times New Roman" w:cs="Times New Roman" w:eastAsia="Times New Roman" w:hAnsi="Times New Roman"/>
+                <w:sz w:val="24"/>
+                <w:szCs w:val="24"/>
+              </w:rPr>
+              <w:t xml:space="preserve">—</w:t>
+            </w:r>
+          </w:p>
+        </w:tc>
+        <w:tc>
+          <w:tcPr>
+            <w:tcW w:type="dxa" w:w="1520"/>
+            <w:tcBorders>
+              <w:top w:val="none" w:color="FFFFFF" w:sz="0"/>
+              <w:left w:val="none" w:color="FFFFFF" w:sz="0"/>
+              <w:bottom w:val="none" w:color="FFFFFF" w:sz="0"/>
+              <w:right w:val="none" w:color="FFFFFF" w:sz="0"/>
+            </w:tcBorders>
+            <w:shd w:fill="FFFFFF" w:val="clear"/>
+            <w:tcMar>
+              <w:top w:type="dxa" w:w="60"/>
+              <w:left w:type="dxa" w:w="90"/>
+              <w:bottom w:type="dxa" w:w="60"/>
+              <w:right w:type="dxa" w:w="90"/>
+            </w:tcMar>
+          </w:tcPr>
+          <w:p>
+            <w:pPr>
+              <w:spacing w:line="240" w:before="0" w:after="0"/>
+            </w:pPr>
+            <w:r>
+              <w:rPr>
+                <w:rFonts w:ascii="Times New Roman" w:cs="Times New Roman" w:eastAsia="Times New Roman" w:hAnsi="Times New Roman"/>
+                <w:sz w:val="24"/>
+                <w:szCs w:val="24"/>
+              </w:rPr>
+              <w:t xml:space="preserve">6</w:t>
+            </w:r>
+          </w:p>
+        </w:tc>
+      </w:tr>
+      <w:tr>
+        <w:tc>
+          <w:tcPr>
+            <w:tcW w:type="dxa" w:w="4896"/>
             <w:tcBorders>
               <w:top w:val="none" w:color="FFFFFF" w:sz="0"/>
               <w:left w:val="none" w:color="FFFFFF" w:sz="0"/>
@@ -5338,7 +6175,7 @@
         </w:tc>
         <w:tc>
           <w:tcPr>
-            <w:tcW w:type="dxa" w:w="1046"/>
+            <w:tcW w:type="dxa" w:w="870"/>
             <w:tcBorders>
               <w:top w:val="none" w:color="FFFFFF" w:sz="0"/>
               <w:left w:val="none" w:color="FFFFFF" w:sz="0"/>
@@ -5369,7 +6206,7 @@
         </w:tc>
         <w:tc>
           <w:tcPr>
-            <w:tcW w:type="dxa" w:w="1046"/>
+            <w:tcW w:type="dxa" w:w="870"/>
             <w:tcBorders>
               <w:top w:val="none" w:color="FFFFFF" w:sz="0"/>
               <w:left w:val="none" w:color="FFFFFF" w:sz="0"/>
@@ -5400,7 +6237,7 @@
         </w:tc>
         <w:tc>
           <w:tcPr>
-            <w:tcW w:type="dxa" w:w="1048"/>
+            <w:tcW w:type="dxa" w:w="870"/>
             <w:tcBorders>
               <w:top w:val="none" w:color="FFFFFF" w:sz="0"/>
               <w:left w:val="none" w:color="FFFFFF" w:sz="0"/>
@@ -5426,6 +6263,37 @@
                 <w:szCs w:val="24"/>
               </w:rPr>
               <w:t xml:space="preserve">99 %</w:t>
+            </w:r>
+          </w:p>
+        </w:tc>
+        <w:tc>
+          <w:tcPr>
+            <w:tcW w:type="dxa" w:w="1520"/>
+            <w:tcBorders>
+              <w:top w:val="none" w:color="FFFFFF" w:sz="0"/>
+              <w:left w:val="none" w:color="FFFFFF" w:sz="0"/>
+              <w:bottom w:val="single" w:color="000000" w:sz="6"/>
+              <w:right w:val="none" w:color="FFFFFF" w:sz="0"/>
+            </w:tcBorders>
+            <w:shd w:fill="FFFFFF" w:val="clear"/>
+            <w:tcMar>
+              <w:top w:type="dxa" w:w="60"/>
+              <w:left w:type="dxa" w:w="90"/>
+              <w:bottom w:type="dxa" w:w="60"/>
+              <w:right w:type="dxa" w:w="90"/>
+            </w:tcMar>
+          </w:tcPr>
+          <w:p>
+            <w:pPr>
+              <w:spacing w:line="240" w:before="0" w:after="0"/>
+            </w:pPr>
+            <w:r>
+              <w:rPr>
+                <w:rFonts w:ascii="Times New Roman" w:cs="Times New Roman" w:eastAsia="Times New Roman" w:hAnsi="Times New Roman"/>
+                <w:sz w:val="24"/>
+                <w:szCs w:val="24"/>
+              </w:rPr>
+              <w:t xml:space="preserve">99 % (mínimo exigido: 95 %)</w:t>
             </w:r>
           </w:p>
         </w:tc>
@@ -5435,6 +6303,40 @@
       <w:pPr>
         <w:spacing w:line="480" w:before="0" w:after="0"/>
       </w:pPr>
+    </w:p>
+    <w:p>
+      <w:pPr>
+        <w:spacing w:line="480" w:before="0" w:after="0"/>
+        <w:ind w:firstLine="720"/>
+      </w:pPr>
+      <w:r>
+        <w:rPr>
+          <w:rFonts w:ascii="Times New Roman" w:cs="Times New Roman" w:eastAsia="Times New Roman" w:hAnsi="Times New Roman"/>
+          <w:sz w:val="24"/>
+          <w:szCs w:val="24"/>
+        </w:rPr>
+        <w:t xml:space="preserve">Las pruebas forman una pirámide: muchas pruebas unitarias y de API, rápidas y baratas, y pocas de punta a punta, que
+recorren la aplicación completa en un navegador y detectan lo que las otras no ven, como una ruta mal registrada o un
+</w:t>
+      </w:r>
+      <w:r>
+        <w:rPr>
+          <w:rFonts w:ascii="Times New Roman" w:cs="Times New Roman" w:eastAsia="Times New Roman" w:hAnsi="Times New Roman"/>
+          <w:i/>
+          <w:iCs/>
+          <w:sz w:val="24"/>
+          <w:szCs w:val="24"/>
+        </w:rPr>
+        <w:t xml:space="preserve">proxy</w:t>
+      </w:r>
+      <w:r>
+        <w:rPr>
+          <w:rFonts w:ascii="Times New Roman" w:cs="Times New Roman" w:eastAsia="Times New Roman" w:hAnsi="Times New Roman"/>
+          <w:sz w:val="24"/>
+          <w:szCs w:val="24"/>
+        </w:rPr>
+        <w:t xml:space="preserve"> mal configurado.</w:t>
+      </w:r>
     </w:p>
     <w:p>
       <w:pPr>
@@ -5563,6 +6465,8 @@
           <w:rFonts w:ascii="Times New Roman" w:cs="Times New Roman" w:eastAsia="Times New Roman" w:hAnsi="Times New Roman"/>
           <w:b/>
           <w:bCs/>
+          <w:i w:val="false"/>
+          <w:iCs w:val="false"/>
           <w:sz w:val="24"/>
           <w:szCs w:val="24"/>
         </w:rPr>
@@ -5904,6 +6808,8 @@
           <w:rFonts w:ascii="Times New Roman" w:cs="Times New Roman" w:eastAsia="Times New Roman" w:hAnsi="Times New Roman"/>
           <w:b/>
           <w:bCs/>
+          <w:i w:val="false"/>
+          <w:iCs w:val="false"/>
           <w:sz w:val="24"/>
           <w:szCs w:val="24"/>
         </w:rPr>
@@ -6015,7 +6921,8 @@
           <w:szCs w:val="24"/>
         </w:rPr>
         <w:t xml:space="preserve"> En el PR #39, seis hallazgos de Claude Code y
-dos de Copilot, todos con una prueba que los reproduce antes de corregirlos.</w:t>
+dos de Copilot, todos con una prueba que los reproduce antes de corregirlos. En el PR #43, CodeQL encontró dos
+más.</w:t>
       </w:r>
     </w:p>
     <w:p>
@@ -6101,6 +7008,8 @@
           <w:rFonts w:ascii="Times New Roman" w:cs="Times New Roman" w:eastAsia="Times New Roman" w:hAnsi="Times New Roman"/>
           <w:b/>
           <w:bCs/>
+          <w:i w:val="false"/>
+          <w:iCs w:val="false"/>
           <w:sz w:val="24"/>
           <w:szCs w:val="24"/>
         </w:rPr>
@@ -6398,25 +7307,8 @@
           <w:sz w:val="24"/>
           <w:szCs w:val="24"/>
         </w:rPr>
-        <w:t xml:space="preserve"> El </w:t>
-      </w:r>
-      <w:r>
-        <w:rPr>
-          <w:rFonts w:ascii="Times New Roman" w:cs="Times New Roman" w:eastAsia="Times New Roman" w:hAnsi="Times New Roman"/>
-          <w:i/>
-          <w:iCs/>
-          <w:sz w:val="24"/>
-          <w:szCs w:val="24"/>
-        </w:rPr>
-        <w:t xml:space="preserve">deploy</w:t>
-      </w:r>
-      <w:r>
-        <w:rPr>
-          <w:rFonts w:ascii="Times New Roman" w:cs="Times New Roman" w:eastAsia="Times New Roman" w:hAnsi="Times New Roman"/>
-          <w:sz w:val="24"/>
-          <w:szCs w:val="24"/>
-        </w:rPr>
-        <w:t xml:space="preserve"> es simulado; SQLite no está pensado para muchos usuarios
+        <w:t xml:space="preserve"> La aplicación no está publicada en un servidor de la nube (sí en contenedores
+y con versiones automáticas); SQLite no está pensado para muchos usuarios
 concurrentes; el límite de intentos de inicio de sesión vive en memoria; los respaldos se guardan en el mismo disco
 que la base; y el criterio CE-001 (crear una tarea en menos de 30 segundos) no se cronometró con usuarios.</w:t>
       </w:r>
@@ -6431,6 +7323,8 @@
           <w:rFonts w:ascii="Times New Roman" w:cs="Times New Roman" w:eastAsia="Times New Roman" w:hAnsi="Times New Roman"/>
           <w:b/>
           <w:bCs/>
+          <w:i w:val="false"/>
+          <w:iCs w:val="false"/>
           <w:sz w:val="24"/>
           <w:szCs w:val="24"/>
         </w:rPr>
@@ -6500,6 +7394,8 @@
           <w:rFonts w:ascii="Times New Roman" w:cs="Times New Roman" w:eastAsia="Times New Roman" w:hAnsi="Times New Roman"/>
           <w:b/>
           <w:bCs/>
+          <w:i w:val="false"/>
+          <w:iCs w:val="false"/>
           <w:sz w:val="24"/>
           <w:szCs w:val="24"/>
         </w:rPr>
@@ -6554,7 +7450,6 @@
     </w:p>
     <w:p>
       <w:pPr>
-        <w:keepNext w:val="false"/>
         <w:spacing w:line="240" w:before="0" w:after="0"/>
       </w:pPr>
       <w:r>
@@ -7505,6 +8400,8 @@
           <w:rFonts w:ascii="Times New Roman" w:cs="Times New Roman" w:eastAsia="Times New Roman" w:hAnsi="Times New Roman"/>
           <w:b/>
           <w:bCs/>
+          <w:i w:val="false"/>
+          <w:iCs w:val="false"/>
           <w:sz w:val="24"/>
           <w:szCs w:val="24"/>
         </w:rPr>
@@ -8283,6 +9180,8 @@
           <w:rFonts w:ascii="Times New Roman" w:cs="Times New Roman" w:eastAsia="Times New Roman" w:hAnsi="Times New Roman"/>
           <w:b/>
           <w:bCs/>
+          <w:i w:val="false"/>
+          <w:iCs w:val="false"/>
           <w:sz w:val="24"/>
           <w:szCs w:val="24"/>
         </w:rPr>
@@ -8408,6 +9307,8 @@
           <w:rFonts w:ascii="Times New Roman" w:cs="Times New Roman" w:eastAsia="Times New Roman" w:hAnsi="Times New Roman"/>
           <w:b/>
           <w:bCs/>
+          <w:i w:val="false"/>
+          <w:iCs w:val="false"/>
           <w:sz w:val="24"/>
           <w:szCs w:val="24"/>
         </w:rPr>
@@ -8806,6 +9707,8 @@
           <w:rFonts w:ascii="Times New Roman" w:cs="Times New Roman" w:eastAsia="Times New Roman" w:hAnsi="Times New Roman"/>
           <w:b/>
           <w:bCs/>
+          <w:i w:val="false"/>
+          <w:iCs w:val="false"/>
           <w:sz w:val="24"/>
           <w:szCs w:val="24"/>
         </w:rPr>
@@ -8930,6 +9833,8 @@
           <w:rFonts w:ascii="Times New Roman" w:cs="Times New Roman" w:eastAsia="Times New Roman" w:hAnsi="Times New Roman"/>
           <w:b/>
           <w:bCs/>
+          <w:i w:val="false"/>
+          <w:iCs w:val="false"/>
           <w:sz w:val="24"/>
           <w:szCs w:val="24"/>
         </w:rPr>
@@ -9452,9 +10357,9 @@
           <w:sz w:val="24"/>
           <w:szCs w:val="24"/>
         </w:rPr>
-        <w:t xml:space="preserve">TaskFlow demuestra que el modelo funciona en la práctica: tres versiones con 19 historias de usuario, 415 pruebas
-automatizadas, cobertura del 99 % en la API, más de 50 ejecuciones del pipeline sin fallos y documentación
-actualizada en cada cambio.</w:t>
+        <w:t xml:space="preserve">TaskFlow demuestra que el modelo funciona en la práctica: cuatro versiones con 24 historias de usuario, 431 pruebas
+automatizadas (6 de ellas de punta a punta), cobertura del 99 % en la API, análisis de seguridad, contenedores y
+documentación actualizada en cada cambio.</w:t>
       </w:r>
     </w:p>
     <w:p>
@@ -9543,6 +10448,8 @@
           <w:rFonts w:ascii="Times New Roman" w:cs="Times New Roman" w:eastAsia="Times New Roman" w:hAnsi="Times New Roman"/>
           <w:b/>
           <w:bCs/>
+          <w:i w:val="false"/>
+          <w:iCs w:val="false"/>
           <w:sz w:val="24"/>
           <w:szCs w:val="24"/>
         </w:rPr>
@@ -9562,7 +10469,7 @@
         </w:rPr>
         <w:t xml:space="preserve">Git resuelve la pérdida y el desorden de las versiones: cada cambio queda registrado con su autor, su fecha y su
 motivo, y cualquier estado anterior se puede recuperar. En un equipo, además, permite trabajar en paralelo con ramas
-e integrar sin pisarse. En TaskFlow eso permitió desarrollar tres versiones sin perder nada, saber qué commit
+e integrar sin pisarse. En TaskFlow eso permitió desarrollar cuatro versiones sin perder nada, saber qué commit
 introdujo cada cambio y corregir un error con una rama </w:t>
       </w:r>
       <w:r>
@@ -9593,6 +10500,8 @@
           <w:rFonts w:ascii="Times New Roman" w:cs="Times New Roman" w:eastAsia="Times New Roman" w:hAnsi="Times New Roman"/>
           <w:b/>
           <w:bCs/>
+          <w:i w:val="false"/>
+          <w:iCs w:val="false"/>
           <w:sz w:val="24"/>
           <w:szCs w:val="24"/>
         </w:rPr>
@@ -9627,6 +10536,8 @@
           <w:rFonts w:ascii="Times New Roman" w:cs="Times New Roman" w:eastAsia="Times New Roman" w:hAnsi="Times New Roman"/>
           <w:b/>
           <w:bCs/>
+          <w:i w:val="false"/>
+          <w:iCs w:val="false"/>
           <w:sz w:val="24"/>
           <w:szCs w:val="24"/>
         </w:rPr>
@@ -9680,6 +10591,8 @@
           <w:rFonts w:ascii="Times New Roman" w:cs="Times New Roman" w:eastAsia="Times New Roman" w:hAnsi="Times New Roman"/>
           <w:b/>
           <w:bCs/>
+          <w:i w:val="false"/>
+          <w:iCs w:val="false"/>
           <w:sz w:val="24"/>
           <w:szCs w:val="24"/>
         </w:rPr>
@@ -10824,8 +11737,8 @@
         <w:tblLayout w:type="fixed"/>
       </w:tblPr>
       <w:tblGrid>
-        <w:gridCol w:w="3657"/>
-        <w:gridCol w:w="5369"/>
+        <w:gridCol w:w="3733"/>
+        <w:gridCol w:w="5293"/>
       </w:tblGrid>
       <w:tr>
         <w:trPr>
@@ -10833,7 +11746,7 @@
         </w:trPr>
         <w:tc>
           <w:tcPr>
-            <w:tcW w:type="dxa" w:w="3657"/>
+            <w:tcW w:type="dxa" w:w="3733"/>
             <w:tcBorders>
               <w:top w:val="single" w:color="000000" w:sz="6"/>
               <w:left w:val="none" w:color="FFFFFF" w:sz="0"/>
@@ -10866,7 +11779,7 @@
         </w:tc>
         <w:tc>
           <w:tcPr>
-            <w:tcW w:type="dxa" w:w="5369"/>
+            <w:tcW w:type="dxa" w:w="5293"/>
             <w:tcBorders>
               <w:top w:val="single" w:color="000000" w:sz="6"/>
               <w:left w:val="none" w:color="FFFFFF" w:sz="0"/>
@@ -10901,7 +11814,7 @@
       <w:tr>
         <w:tc>
           <w:tcPr>
-            <w:tcW w:type="dxa" w:w="3657"/>
+            <w:tcW w:type="dxa" w:w="3733"/>
             <w:tcBorders>
               <w:top w:val="none" w:color="FFFFFF" w:sz="0"/>
               <w:left w:val="none" w:color="FFFFFF" w:sz="0"/>
@@ -10932,7 +11845,7 @@
         </w:tc>
         <w:tc>
           <w:tcPr>
-            <w:tcW w:type="dxa" w:w="5369"/>
+            <w:tcW w:type="dxa" w:w="5293"/>
             <w:tcBorders>
               <w:top w:val="none" w:color="FFFFFF" w:sz="0"/>
               <w:left w:val="none" w:color="FFFFFF" w:sz="0"/>
@@ -10965,7 +11878,7 @@
       <w:tr>
         <w:tc>
           <w:tcPr>
-            <w:tcW w:type="dxa" w:w="3657"/>
+            <w:tcW w:type="dxa" w:w="3733"/>
             <w:tcBorders>
               <w:top w:val="none" w:color="FFFFFF" w:sz="0"/>
               <w:left w:val="none" w:color="FFFFFF" w:sz="0"/>
@@ -10996,7 +11909,7 @@
         </w:tc>
         <w:tc>
           <w:tcPr>
-            <w:tcW w:type="dxa" w:w="5369"/>
+            <w:tcW w:type="dxa" w:w="5293"/>
             <w:tcBorders>
               <w:top w:val="none" w:color="FFFFFF" w:sz="0"/>
               <w:left w:val="none" w:color="FFFFFF" w:sz="0"/>
@@ -11061,7 +11974,7 @@
       <w:tr>
         <w:tc>
           <w:tcPr>
-            <w:tcW w:type="dxa" w:w="3657"/>
+            <w:tcW w:type="dxa" w:w="3733"/>
             <w:tcBorders>
               <w:top w:val="none" w:color="FFFFFF" w:sz="0"/>
               <w:left w:val="none" w:color="FFFFFF" w:sz="0"/>
@@ -11092,7 +12005,7 @@
         </w:tc>
         <w:tc>
           <w:tcPr>
-            <w:tcW w:type="dxa" w:w="5369"/>
+            <w:tcW w:type="dxa" w:w="5293"/>
             <w:tcBorders>
               <w:top w:val="none" w:color="FFFFFF" w:sz="0"/>
               <w:left w:val="none" w:color="FFFFFF" w:sz="0"/>
@@ -11125,7 +12038,7 @@
       <w:tr>
         <w:tc>
           <w:tcPr>
-            <w:tcW w:type="dxa" w:w="3657"/>
+            <w:tcW w:type="dxa" w:w="3733"/>
             <w:tcBorders>
               <w:top w:val="none" w:color="FFFFFF" w:sz="0"/>
               <w:left w:val="none" w:color="FFFFFF" w:sz="0"/>
@@ -11156,7 +12069,7 @@
         </w:tc>
         <w:tc>
           <w:tcPr>
-            <w:tcW w:type="dxa" w:w="5369"/>
+            <w:tcW w:type="dxa" w:w="5293"/>
             <w:tcBorders>
               <w:top w:val="none" w:color="FFFFFF" w:sz="0"/>
               <w:left w:val="none" w:color="FFFFFF" w:sz="0"/>
@@ -11189,7 +12102,7 @@
       <w:tr>
         <w:tc>
           <w:tcPr>
-            <w:tcW w:type="dxa" w:w="3657"/>
+            <w:tcW w:type="dxa" w:w="3733"/>
             <w:tcBorders>
               <w:top w:val="none" w:color="FFFFFF" w:sz="0"/>
               <w:left w:val="none" w:color="FFFFFF" w:sz="0"/>
@@ -11220,7 +12133,7 @@
         </w:tc>
         <w:tc>
           <w:tcPr>
-            <w:tcW w:type="dxa" w:w="5369"/>
+            <w:tcW w:type="dxa" w:w="5293"/>
             <w:tcBorders>
               <w:top w:val="none" w:color="FFFFFF" w:sz="0"/>
               <w:left w:val="none" w:color="FFFFFF" w:sz="0"/>
@@ -11271,7 +12184,7 @@
       <w:tr>
         <w:tc>
           <w:tcPr>
-            <w:tcW w:type="dxa" w:w="3657"/>
+            <w:tcW w:type="dxa" w:w="3733"/>
             <w:tcBorders>
               <w:top w:val="none" w:color="FFFFFF" w:sz="0"/>
               <w:left w:val="none" w:color="FFFFFF" w:sz="0"/>
@@ -11302,7 +12215,7 @@
         </w:tc>
         <w:tc>
           <w:tcPr>
-            <w:tcW w:type="dxa" w:w="5369"/>
+            <w:tcW w:type="dxa" w:w="5293"/>
             <w:tcBorders>
               <w:top w:val="none" w:color="FFFFFF" w:sz="0"/>
               <w:left w:val="none" w:color="FFFFFF" w:sz="0"/>
@@ -11353,7 +12266,7 @@
       <w:tr>
         <w:tc>
           <w:tcPr>
-            <w:tcW w:type="dxa" w:w="3657"/>
+            <w:tcW w:type="dxa" w:w="3733"/>
             <w:tcBorders>
               <w:top w:val="none" w:color="FFFFFF" w:sz="0"/>
               <w:left w:val="none" w:color="FFFFFF" w:sz="0"/>
@@ -11384,7 +12297,7 @@
         </w:tc>
         <w:tc>
           <w:tcPr>
-            <w:tcW w:type="dxa" w:w="5369"/>
+            <w:tcW w:type="dxa" w:w="5293"/>
             <w:tcBorders>
               <w:top w:val="none" w:color="FFFFFF" w:sz="0"/>
               <w:left w:val="none" w:color="FFFFFF" w:sz="0"/>
@@ -11417,7 +12330,7 @@
       <w:tr>
         <w:tc>
           <w:tcPr>
-            <w:tcW w:type="dxa" w:w="3657"/>
+            <w:tcW w:type="dxa" w:w="3733"/>
             <w:tcBorders>
               <w:top w:val="none" w:color="FFFFFF" w:sz="0"/>
               <w:left w:val="none" w:color="FFFFFF" w:sz="0"/>
@@ -11448,7 +12361,7 @@
         </w:tc>
         <w:tc>
           <w:tcPr>
-            <w:tcW w:type="dxa" w:w="5369"/>
+            <w:tcW w:type="dxa" w:w="5293"/>
             <w:tcBorders>
               <w:top w:val="none" w:color="FFFFFF" w:sz="0"/>
               <w:left w:val="none" w:color="FFFFFF" w:sz="0"/>
@@ -11537,7 +12450,7 @@
       <w:tr>
         <w:tc>
           <w:tcPr>
-            <w:tcW w:type="dxa" w:w="3657"/>
+            <w:tcW w:type="dxa" w:w="3733"/>
             <w:tcBorders>
               <w:top w:val="none" w:color="FFFFFF" w:sz="0"/>
               <w:left w:val="none" w:color="FFFFFF" w:sz="0"/>
@@ -11568,7 +12481,7 @@
         </w:tc>
         <w:tc>
           <w:tcPr>
-            <w:tcW w:type="dxa" w:w="5369"/>
+            <w:tcW w:type="dxa" w:w="5293"/>
             <w:tcBorders>
               <w:top w:val="none" w:color="FFFFFF" w:sz="0"/>
               <w:left w:val="none" w:color="FFFFFF" w:sz="0"/>
@@ -11629,79 +12542,71 @@
       <w:tr>
         <w:tc>
           <w:tcPr>
-            <w:tcW w:type="dxa" w:w="3657"/>
-            <w:tcBorders>
-              <w:top w:val="none" w:color="FFFFFF" w:sz="0"/>
-              <w:left w:val="none" w:color="FFFFFF" w:sz="0"/>
-              <w:bottom w:val="single" w:color="000000" w:sz="6"/>
-              <w:right w:val="none" w:color="FFFFFF" w:sz="0"/>
-            </w:tcBorders>
-            <w:shd w:fill="FFFFFF" w:val="clear"/>
-            <w:tcMar>
-              <w:top w:type="dxa" w:w="60"/>
-              <w:left w:type="dxa" w:w="90"/>
-              <w:bottom w:type="dxa" w:w="60"/>
-              <w:right w:type="dxa" w:w="90"/>
-            </w:tcMar>
-          </w:tcPr>
-          <w:p>
-            <w:pPr>
-              <w:spacing w:line="240" w:before="0" w:after="0"/>
-            </w:pPr>
-            <w:r>
-              <w:rPr>
-                <w:rFonts w:ascii="Times New Roman" w:cs="Times New Roman" w:eastAsia="Times New Roman" w:hAnsi="Times New Roman"/>
-                <w:sz w:val="24"/>
-                <w:szCs w:val="24"/>
-              </w:rPr>
-              <w:t xml:space="preserve">Artefacto del deploy</w:t>
-            </w:r>
-          </w:p>
-        </w:tc>
-        <w:tc>
-          <w:tcPr>
-            <w:tcW w:type="dxa" w:w="5369"/>
-            <w:tcBorders>
-              <w:top w:val="none" w:color="FFFFFF" w:sz="0"/>
-              <w:left w:val="none" w:color="FFFFFF" w:sz="0"/>
-              <w:bottom w:val="single" w:color="000000" w:sz="6"/>
-              <w:right w:val="none" w:color="FFFFFF" w:sz="0"/>
-            </w:tcBorders>
-            <w:shd w:fill="FFFFFF" w:val="clear"/>
-            <w:tcMar>
-              <w:top w:type="dxa" w:w="60"/>
-              <w:left w:type="dxa" w:w="90"/>
-              <w:bottom w:type="dxa" w:w="60"/>
-              <w:right w:type="dxa" w:w="90"/>
-            </w:tcMar>
-          </w:tcPr>
-          <w:p>
-            <w:pPr>
-              <w:spacing w:line="240" w:before="0" w:after="0"/>
-            </w:pPr>
-            <w:r>
-              <w:rPr>
-                <w:rFonts w:ascii="Times New Roman" w:cs="Times New Roman" w:eastAsia="Times New Roman" w:hAnsi="Times New Roman"/>
-                <w:sz w:val="24"/>
-                <w:szCs w:val="24"/>
-              </w:rPr>
-              <w:t xml:space="preserve">Actions → ejecución en </w:t>
-            </w:r>
+            <w:tcW w:type="dxa" w:w="3733"/>
+            <w:tcBorders>
+              <w:top w:val="none" w:color="FFFFFF" w:sz="0"/>
+              <w:left w:val="none" w:color="FFFFFF" w:sz="0"/>
+              <w:bottom w:val="none" w:color="FFFFFF" w:sz="0"/>
+              <w:right w:val="none" w:color="FFFFFF" w:sz="0"/>
+            </w:tcBorders>
+            <w:shd w:fill="FFFFFF" w:val="clear"/>
+            <w:tcMar>
+              <w:top w:type="dxa" w:w="60"/>
+              <w:left w:type="dxa" w:w="90"/>
+              <w:bottom w:type="dxa" w:w="60"/>
+              <w:right w:type="dxa" w:w="90"/>
+            </w:tcMar>
+          </w:tcPr>
+          <w:p>
+            <w:pPr>
+              <w:spacing w:line="240" w:before="0" w:after="0"/>
+            </w:pPr>
+            <w:r>
+              <w:rPr>
+                <w:rFonts w:ascii="Times New Roman" w:cs="Times New Roman" w:eastAsia="Times New Roman" w:hAnsi="Times New Roman"/>
+                <w:sz w:val="24"/>
+                <w:szCs w:val="24"/>
+              </w:rPr>
+              <w:t xml:space="preserve">Ejecución con un comando</w:t>
+            </w:r>
+          </w:p>
+        </w:tc>
+        <w:tc>
+          <w:tcPr>
+            <w:tcW w:type="dxa" w:w="5293"/>
+            <w:tcBorders>
+              <w:top w:val="none" w:color="FFFFFF" w:sz="0"/>
+              <w:left w:val="none" w:color="FFFFFF" w:sz="0"/>
+              <w:bottom w:val="none" w:color="FFFFFF" w:sz="0"/>
+              <w:right w:val="none" w:color="FFFFFF" w:sz="0"/>
+            </w:tcBorders>
+            <w:shd w:fill="FFFFFF" w:val="clear"/>
+            <w:tcMar>
+              <w:top w:type="dxa" w:w="60"/>
+              <w:left w:type="dxa" w:w="90"/>
+              <w:bottom w:type="dxa" w:w="60"/>
+              <w:right w:type="dxa" w:w="90"/>
+            </w:tcMar>
+          </w:tcPr>
+          <w:p>
+            <w:pPr>
+              <w:spacing w:line="240" w:before="0" w:after="0"/>
+            </w:pPr>
             <w:r>
               <w:rPr>
                 <w:rFonts w:ascii="Courier New" w:cs="Courier New" w:eastAsia="Courier New" w:hAnsi="Courier New"/>
                 <w:sz w:val="22"/>
                 <w:szCs w:val="22"/>
               </w:rPr>
-              <w:t xml:space="preserve">main</w:t>
-            </w:r>
-            <w:r>
-              <w:rPr>
-                <w:rFonts w:ascii="Times New Roman" w:cs="Times New Roman" w:eastAsia="Times New Roman" w:hAnsi="Times New Roman"/>
-                <w:sz w:val="24"/>
-                <w:szCs w:val="24"/>
-              </w:rPr>
-              <w:t xml:space="preserve"> → Artifacts → </w:t>
+              <w:t xml:space="preserve">docker-compose.yml</w:t>
+            </w:r>
+            <w:r>
+              <w:rPr>
+                <w:rFonts w:ascii="Times New Roman" w:cs="Times New Roman" w:eastAsia="Times New Roman" w:hAnsi="Times New Roman"/>
+                <w:sz w:val="24"/>
+                <w:szCs w:val="24"/>
+              </w:rPr>
+              <w:t xml:space="preserve"> y los Dockerfiles: </w:t>
             </w:r>
             <w:r>
               <w:rPr>
@@ -11709,6 +12614,368 @@
                 <w:sz w:val="22"/>
                 <w:szCs w:val="22"/>
               </w:rPr>
+              <w:t xml:space="preserve">docker compose up --build</w:t>
+            </w:r>
+            <w:r>
+              <w:rPr>
+                <w:rFonts w:ascii="Times New Roman" w:cs="Times New Roman" w:eastAsia="Times New Roman" w:hAnsi="Times New Roman"/>
+                <w:sz w:val="24"/>
+                <w:szCs w:val="24"/>
+              </w:rPr>
+              <w:t xml:space="preserve"> → </w:t>
+            </w:r>
+            <w:r>
+              <w:rPr>
+                <w:rFonts w:ascii="Times New Roman" w:cs="Times New Roman" w:eastAsia="Times New Roman" w:hAnsi="Times New Roman"/>
+                <w:sz w:val="24"/>
+                <w:szCs w:val="24"/>
+              </w:rPr>
+              <w:t xml:space="preserve">http://localhost:8080</w:t>
+            </w:r>
+          </w:p>
+        </w:tc>
+      </w:tr>
+      <w:tr>
+        <w:tc>
+          <w:tcPr>
+            <w:tcW w:type="dxa" w:w="3733"/>
+            <w:tcBorders>
+              <w:top w:val="none" w:color="FFFFFF" w:sz="0"/>
+              <w:left w:val="none" w:color="FFFFFF" w:sz="0"/>
+              <w:bottom w:val="none" w:color="FFFFFF" w:sz="0"/>
+              <w:right w:val="none" w:color="FFFFFF" w:sz="0"/>
+            </w:tcBorders>
+            <w:shd w:fill="FFFFFF" w:val="clear"/>
+            <w:tcMar>
+              <w:top w:type="dxa" w:w="60"/>
+              <w:left w:type="dxa" w:w="90"/>
+              <w:bottom w:type="dxa" w:w="60"/>
+              <w:right w:type="dxa" w:w="90"/>
+            </w:tcMar>
+          </w:tcPr>
+          <w:p>
+            <w:pPr>
+              <w:spacing w:line="240" w:before="0" w:after="0"/>
+            </w:pPr>
+            <w:r>
+              <w:rPr>
+                <w:rFonts w:ascii="Times New Roman" w:cs="Times New Roman" w:eastAsia="Times New Roman" w:hAnsi="Times New Roman"/>
+                <w:sz w:val="24"/>
+                <w:szCs w:val="24"/>
+              </w:rPr>
+              <w:t xml:space="preserve">Pruebas de punta a punta</w:t>
+            </w:r>
+          </w:p>
+        </w:tc>
+        <w:tc>
+          <w:tcPr>
+            <w:tcW w:type="dxa" w:w="5293"/>
+            <w:tcBorders>
+              <w:top w:val="none" w:color="FFFFFF" w:sz="0"/>
+              <w:left w:val="none" w:color="FFFFFF" w:sz="0"/>
+              <w:bottom w:val="none" w:color="FFFFFF" w:sz="0"/>
+              <w:right w:val="none" w:color="FFFFFF" w:sz="0"/>
+            </w:tcBorders>
+            <w:shd w:fill="FFFFFF" w:val="clear"/>
+            <w:tcMar>
+              <w:top w:type="dxa" w:w="60"/>
+              <w:left w:type="dxa" w:w="90"/>
+              <w:bottom w:type="dxa" w:w="60"/>
+              <w:right w:type="dxa" w:w="90"/>
+            </w:tcMar>
+          </w:tcPr>
+          <w:p>
+            <w:pPr>
+              <w:spacing w:line="240" w:before="0" w:after="0"/>
+            </w:pPr>
+            <w:r>
+              <w:rPr>
+                <w:rFonts w:ascii="Courier New" w:cs="Courier New" w:eastAsia="Courier New" w:hAnsi="Courier New"/>
+                <w:sz w:val="22"/>
+                <w:szCs w:val="22"/>
+              </w:rPr>
+              <w:t xml:space="preserve">e2e/tests/taskflow.spec.ts</w:t>
+            </w:r>
+            <w:r>
+              <w:rPr>
+                <w:rFonts w:ascii="Times New Roman" w:cs="Times New Roman" w:eastAsia="Times New Roman" w:hAnsi="Times New Roman"/>
+                <w:sz w:val="24"/>
+                <w:szCs w:val="24"/>
+              </w:rPr>
+              <w:t xml:space="preserve"> y el job </w:t>
+            </w:r>
+            <w:r>
+              <w:rPr>
+                <w:rFonts w:ascii="Courier New" w:cs="Courier New" w:eastAsia="Courier New" w:hAnsi="Courier New"/>
+                <w:sz w:val="22"/>
+                <w:szCs w:val="22"/>
+              </w:rPr>
+              <w:t xml:space="preserve">e2e</w:t>
+            </w:r>
+          </w:p>
+        </w:tc>
+      </w:tr>
+      <w:tr>
+        <w:tc>
+          <w:tcPr>
+            <w:tcW w:type="dxa" w:w="3733"/>
+            <w:tcBorders>
+              <w:top w:val="none" w:color="FFFFFF" w:sz="0"/>
+              <w:left w:val="none" w:color="FFFFFF" w:sz="0"/>
+              <w:bottom w:val="none" w:color="FFFFFF" w:sz="0"/>
+              <w:right w:val="none" w:color="FFFFFF" w:sz="0"/>
+            </w:tcBorders>
+            <w:shd w:fill="FFFFFF" w:val="clear"/>
+            <w:tcMar>
+              <w:top w:type="dxa" w:w="60"/>
+              <w:left w:type="dxa" w:w="90"/>
+              <w:bottom w:type="dxa" w:w="60"/>
+              <w:right w:type="dxa" w:w="90"/>
+            </w:tcMar>
+          </w:tcPr>
+          <w:p>
+            <w:pPr>
+              <w:spacing w:line="240" w:before="0" w:after="0"/>
+            </w:pPr>
+            <w:r>
+              <w:rPr>
+                <w:rFonts w:ascii="Times New Roman" w:cs="Times New Roman" w:eastAsia="Times New Roman" w:hAnsi="Times New Roman"/>
+                <w:sz w:val="24"/>
+                <w:szCs w:val="24"/>
+              </w:rPr>
+              <w:t xml:space="preserve">Seguridad</w:t>
+            </w:r>
+          </w:p>
+        </w:tc>
+        <w:tc>
+          <w:tcPr>
+            <w:tcW w:type="dxa" w:w="5293"/>
+            <w:tcBorders>
+              <w:top w:val="none" w:color="FFFFFF" w:sz="0"/>
+              <w:left w:val="none" w:color="FFFFFF" w:sz="0"/>
+              <w:bottom w:val="none" w:color="FFFFFF" w:sz="0"/>
+              <w:right w:val="none" w:color="FFFFFF" w:sz="0"/>
+            </w:tcBorders>
+            <w:shd w:fill="FFFFFF" w:val="clear"/>
+            <w:tcMar>
+              <w:top w:type="dxa" w:w="60"/>
+              <w:left w:type="dxa" w:w="90"/>
+              <w:bottom w:type="dxa" w:w="60"/>
+              <w:right w:type="dxa" w:w="90"/>
+            </w:tcMar>
+          </w:tcPr>
+          <w:p>
+            <w:pPr>
+              <w:spacing w:line="240" w:before="0" w:after="0"/>
+            </w:pPr>
+            <w:r>
+              <w:rPr>
+                <w:rFonts w:ascii="Times New Roman" w:cs="Times New Roman" w:eastAsia="Times New Roman" w:hAnsi="Times New Roman"/>
+                <w:sz w:val="24"/>
+                <w:szCs w:val="24"/>
+              </w:rPr>
+              <w:t xml:space="preserve">Pestaña </w:t>
+            </w:r>
+            <w:r>
+              <w:rPr>
+                <w:rFonts w:ascii="Times New Roman" w:cs="Times New Roman" w:eastAsia="Times New Roman" w:hAnsi="Times New Roman"/>
+                <w:b/>
+                <w:bCs/>
+                <w:sz w:val="24"/>
+                <w:szCs w:val="24"/>
+              </w:rPr>
+              <w:t xml:space="preserve">Security</w:t>
+            </w:r>
+            <w:r>
+              <w:rPr>
+                <w:rFonts w:ascii="Times New Roman" w:cs="Times New Roman" w:eastAsia="Times New Roman" w:hAnsi="Times New Roman"/>
+                <w:sz w:val="24"/>
+                <w:szCs w:val="24"/>
+              </w:rPr>
+              <w:t xml:space="preserve"> (CodeQL) y </w:t>
+            </w:r>
+            <w:r>
+              <w:rPr>
+                <w:rFonts w:ascii="Courier New" w:cs="Courier New" w:eastAsia="Courier New" w:hAnsi="Courier New"/>
+                <w:sz w:val="22"/>
+                <w:szCs w:val="22"/>
+              </w:rPr>
+              <w:t xml:space="preserve">npm audit</w:t>
+            </w:r>
+            <w:r>
+              <w:rPr>
+                <w:rFonts w:ascii="Times New Roman" w:cs="Times New Roman" w:eastAsia="Times New Roman" w:hAnsi="Times New Roman"/>
+                <w:sz w:val="24"/>
+                <w:szCs w:val="24"/>
+              </w:rPr>
+              <w:t xml:space="preserve"> en 0</w:t>
+            </w:r>
+          </w:p>
+        </w:tc>
+      </w:tr>
+      <w:tr>
+        <w:tc>
+          <w:tcPr>
+            <w:tcW w:type="dxa" w:w="3733"/>
+            <w:tcBorders>
+              <w:top w:val="none" w:color="FFFFFF" w:sz="0"/>
+              <w:left w:val="none" w:color="FFFFFF" w:sz="0"/>
+              <w:bottom w:val="none" w:color="FFFFFF" w:sz="0"/>
+              <w:right w:val="none" w:color="FFFFFF" w:sz="0"/>
+            </w:tcBorders>
+            <w:shd w:fill="FFFFFF" w:val="clear"/>
+            <w:tcMar>
+              <w:top w:type="dxa" w:w="60"/>
+              <w:left w:type="dxa" w:w="90"/>
+              <w:bottom w:type="dxa" w:w="60"/>
+              <w:right w:type="dxa" w:w="90"/>
+            </w:tcMar>
+          </w:tcPr>
+          <w:p>
+            <w:pPr>
+              <w:spacing w:line="240" w:before="0" w:after="0"/>
+            </w:pPr>
+            <w:r>
+              <w:rPr>
+                <w:rFonts w:ascii="Times New Roman" w:cs="Times New Roman" w:eastAsia="Times New Roman" w:hAnsi="Times New Roman"/>
+                <w:sz w:val="24"/>
+                <w:szCs w:val="24"/>
+              </w:rPr>
+              <w:t xml:space="preserve">Guía para el docente y hoja de ruta</w:t>
+            </w:r>
+          </w:p>
+        </w:tc>
+        <w:tc>
+          <w:tcPr>
+            <w:tcW w:type="dxa" w:w="5293"/>
+            <w:tcBorders>
+              <w:top w:val="none" w:color="FFFFFF" w:sz="0"/>
+              <w:left w:val="none" w:color="FFFFFF" w:sz="0"/>
+              <w:bottom w:val="none" w:color="FFFFFF" w:sz="0"/>
+              <w:right w:val="none" w:color="FFFFFF" w:sz="0"/>
+            </w:tcBorders>
+            <w:shd w:fill="FFFFFF" w:val="clear"/>
+            <w:tcMar>
+              <w:top w:type="dxa" w:w="60"/>
+              <w:left w:type="dxa" w:w="90"/>
+              <w:bottom w:type="dxa" w:w="60"/>
+              <w:right w:type="dxa" w:w="90"/>
+            </w:tcMar>
+          </w:tcPr>
+          <w:p>
+            <w:pPr>
+              <w:spacing w:line="240" w:before="0" w:after="0"/>
+            </w:pPr>
+            <w:r>
+              <w:rPr>
+                <w:rFonts w:ascii="Courier New" w:cs="Courier New" w:eastAsia="Courier New" w:hAnsi="Courier New"/>
+                <w:sz w:val="22"/>
+                <w:szCs w:val="22"/>
+              </w:rPr>
+              <w:t xml:space="preserve">docs/guia-docente.md</w:t>
+            </w:r>
+            <w:r>
+              <w:rPr>
+                <w:rFonts w:ascii="Times New Roman" w:cs="Times New Roman" w:eastAsia="Times New Roman" w:hAnsi="Times New Roman"/>
+                <w:sz w:val="24"/>
+                <w:szCs w:val="24"/>
+              </w:rPr>
+              <w:t xml:space="preserve"> y </w:t>
+            </w:r>
+            <w:r>
+              <w:rPr>
+                <w:rFonts w:ascii="Courier New" w:cs="Courier New" w:eastAsia="Courier New" w:hAnsi="Courier New"/>
+                <w:sz w:val="22"/>
+                <w:szCs w:val="22"/>
+              </w:rPr>
+              <w:t xml:space="preserve">docs/hoja-de-ruta.md</w:t>
+            </w:r>
+          </w:p>
+        </w:tc>
+      </w:tr>
+      <w:tr>
+        <w:tc>
+          <w:tcPr>
+            <w:tcW w:type="dxa" w:w="3733"/>
+            <w:tcBorders>
+              <w:top w:val="none" w:color="FFFFFF" w:sz="0"/>
+              <w:left w:val="none" w:color="FFFFFF" w:sz="0"/>
+              <w:bottom w:val="single" w:color="000000" w:sz="6"/>
+              <w:right w:val="none" w:color="FFFFFF" w:sz="0"/>
+            </w:tcBorders>
+            <w:shd w:fill="FFFFFF" w:val="clear"/>
+            <w:tcMar>
+              <w:top w:type="dxa" w:w="60"/>
+              <w:left w:type="dxa" w:w="90"/>
+              <w:bottom w:type="dxa" w:w="60"/>
+              <w:right w:type="dxa" w:w="90"/>
+            </w:tcMar>
+          </w:tcPr>
+          <w:p>
+            <w:pPr>
+              <w:spacing w:line="240" w:before="0" w:after="0"/>
+            </w:pPr>
+            <w:r>
+              <w:rPr>
+                <w:rFonts w:ascii="Times New Roman" w:cs="Times New Roman" w:eastAsia="Times New Roman" w:hAnsi="Times New Roman"/>
+                <w:sz w:val="24"/>
+                <w:szCs w:val="24"/>
+              </w:rPr>
+              <w:t xml:space="preserve">Artefacto del deploy</w:t>
+            </w:r>
+          </w:p>
+        </w:tc>
+        <w:tc>
+          <w:tcPr>
+            <w:tcW w:type="dxa" w:w="5293"/>
+            <w:tcBorders>
+              <w:top w:val="none" w:color="FFFFFF" w:sz="0"/>
+              <w:left w:val="none" w:color="FFFFFF" w:sz="0"/>
+              <w:bottom w:val="single" w:color="000000" w:sz="6"/>
+              <w:right w:val="none" w:color="FFFFFF" w:sz="0"/>
+            </w:tcBorders>
+            <w:shd w:fill="FFFFFF" w:val="clear"/>
+            <w:tcMar>
+              <w:top w:type="dxa" w:w="60"/>
+              <w:left w:type="dxa" w:w="90"/>
+              <w:bottom w:type="dxa" w:w="60"/>
+              <w:right w:type="dxa" w:w="90"/>
+            </w:tcMar>
+          </w:tcPr>
+          <w:p>
+            <w:pPr>
+              <w:spacing w:line="240" w:before="0" w:after="0"/>
+            </w:pPr>
+            <w:r>
+              <w:rPr>
+                <w:rFonts w:ascii="Times New Roman" w:cs="Times New Roman" w:eastAsia="Times New Roman" w:hAnsi="Times New Roman"/>
+                <w:sz w:val="24"/>
+                <w:szCs w:val="24"/>
+              </w:rPr>
+              <w:t xml:space="preserve">Actions → ejecución en </w:t>
+            </w:r>
+            <w:r>
+              <w:rPr>
+                <w:rFonts w:ascii="Courier New" w:cs="Courier New" w:eastAsia="Courier New" w:hAnsi="Courier New"/>
+                <w:sz w:val="22"/>
+                <w:szCs w:val="22"/>
+              </w:rPr>
+              <w:t xml:space="preserve">main</w:t>
+            </w:r>
+            <w:r>
+              <w:rPr>
+                <w:rFonts w:ascii="Times New Roman" w:cs="Times New Roman" w:eastAsia="Times New Roman" w:hAnsi="Times New Roman"/>
+                <w:sz w:val="24"/>
+                <w:szCs w:val="24"/>
+              </w:rPr>
+              <w:t xml:space="preserve"> → Artifacts → </w:t>
+            </w:r>
+            <w:r>
+              <w:rPr>
+                <w:rFonts w:ascii="Courier New" w:cs="Courier New" w:eastAsia="Courier New" w:hAnsi="Courier New"/>
+                <w:sz w:val="22"/>
+                <w:szCs w:val="22"/>
+              </w:rPr>
               <w:t xml:space="preserve">taskflow-frontend</w:t>
             </w:r>
           </w:p>
@@ -11840,7 +13107,6 @@
     </w:p>
     <w:p>
       <w:pPr>
-        <w:keepNext w:val="false"/>
         <w:spacing w:line="240" w:before="0" w:after="0"/>
       </w:pPr>
       <w:r>
@@ -11923,7 +13189,6 @@
     </w:p>
     <w:p>
       <w:pPr>
-        <w:keepNext w:val="false"/>
         <w:spacing w:line="240" w:before="0" w:after="0"/>
       </w:pPr>
       <w:r>
@@ -12006,7 +13271,6 @@
     </w:p>
     <w:p>
       <w:pPr>
-        <w:keepNext w:val="false"/>
         <w:spacing w:line="240" w:before="0" w:after="0"/>
       </w:pPr>
       <w:r>
@@ -12089,7 +13353,6 @@
     </w:p>
     <w:p>
       <w:pPr>
-        <w:keepNext w:val="false"/>
         <w:spacing w:line="240" w:before="0" w:after="0"/>
       </w:pPr>
       <w:r>
@@ -12172,7 +13435,6 @@
     </w:p>
     <w:p>
       <w:pPr>
-        <w:keepNext w:val="false"/>
         <w:spacing w:line="240" w:before="0" w:after="0"/>
       </w:pPr>
       <w:r>
@@ -12204,6 +13466,88 @@
                     <a:xfrm>
                       <a:off x="0" y="0"/>
                       <a:ext cx="5715000" cy="6696075"/>
+                    </a:xfrm>
+                    <a:prstGeom prst="rect">
+                      <a:avLst/>
+                    </a:prstGeom>
+                  </pic:spPr>
+                </pic:pic>
+              </a:graphicData>
+            </a:graphic>
+          </wp:inline>
+        </w:drawing>
+      </w:r>
+    </w:p>
+    <w:p>
+      <w:pPr>
+        <w:spacing w:line="480" w:before="0" w:after="0"/>
+      </w:pPr>
+    </w:p>
+    <w:p>
+      <w:pPr>
+        <w:keepNext/>
+        <w:spacing w:line="480" w:before="0" w:after="0"/>
+      </w:pPr>
+      <w:r>
+        <w:rPr>
+          <w:rFonts w:ascii="Times New Roman" w:cs="Times New Roman" w:eastAsia="Times New Roman" w:hAnsi="Times New Roman"/>
+          <w:b/>
+          <w:bCs/>
+          <w:sz w:val="24"/>
+          <w:szCs w:val="24"/>
+        </w:rPr>
+        <w:t xml:space="preserve">Figura 9</w:t>
+      </w:r>
+    </w:p>
+    <w:p>
+      <w:pPr>
+        <w:keepNext/>
+        <w:spacing w:line="480" w:before="0" w:after="0"/>
+      </w:pPr>
+      <w:r>
+        <w:rPr>
+          <w:rFonts w:ascii="Times New Roman" w:cs="Times New Roman" w:eastAsia="Times New Roman" w:hAnsi="Times New Roman"/>
+          <w:i/>
+          <w:iCs/>
+          <w:sz w:val="24"/>
+          <w:szCs w:val="24"/>
+        </w:rPr>
+        <w:t xml:space="preserve">Pipeline de la v4 en el PR #43 con los trabajos backend, frontend, e2e y docker en verde</w:t>
+      </w:r>
+    </w:p>
+    <w:p>
+      <w:pPr>
+        <w:spacing w:line="240" w:before="0" w:after="0"/>
+      </w:pPr>
+      <w:r>
+        <w:drawing>
+          <wp:inline distT="0" distB="0" distL="0" distR="0">
+            <wp:extent cx="5715000" cy="4019550"/>
+            <wp:effectExtent t="0" r="0" b="0" l="0"/>
+            <wp:docPr id="1" name="Pipeline de la v4 en el PR #43 con los trabajos backend, frontend, e2e y docker en verde" descr="Pipeline de la v4 en el PR #43 con los trabajos backend, frontend, e2e y docker en verde" title="Pipeline de la v4 en el PR #43 con los trabajos backend, frontend, e2e y docker en verde"/>
+            <wp:cNvGraphicFramePr>
+              <a:graphicFrameLocks xmlns:a="http://schemas.openxmlformats.org/drawingml/2006/main" noChangeAspect="1"/>
+            </wp:cNvGraphicFramePr>
+            <a:graphic xmlns:a="http://schemas.openxmlformats.org/drawingml/2006/main">
+              <a:graphicData uri="http://schemas.openxmlformats.org/drawingml/2006/picture">
+                <pic:pic xmlns:pic="http://schemas.openxmlformats.org/drawingml/2006/picture">
+                  <pic:nvPicPr>
+                    <pic:cNvPr id="0" name="" descr=""/>
+                    <pic:cNvPicPr>
+                      <a:picLocks noChangeAspect="1" noChangeArrowheads="1"/>
+                    </pic:cNvPicPr>
+                  </pic:nvPicPr>
+                  <pic:blipFill>
+                    <a:blip r:embed="rId16" cstate="none"/>
+                    <a:srcRect/>
+                    <a:stretch>
+                      <a:fillRect/>
+                    </a:stretch>
+                  </pic:blipFill>
+                  <pic:spPr bwMode="auto">
+                    <a:xfrm>
+                      <a:off x="0" y="0"/>
+                      <a:ext cx="5715000" cy="4019550"/>
                     </a:xfrm>
                     <a:prstGeom prst="rect">
                       <a:avLst/>

</xml_diff>